<commit_message>
Made suggestions on ODD protocol
</commit_message>
<xml_diff>
--- a/analysis/ODD_protocol.docx
+++ b/analysis/ODD_protocol.docx
@@ -242,7 +242,7 @@
     </w:p>
     <w:p>
       <w:pPr>
-        <w:pStyle w:val="Nagwek1"/>
+        <w:pStyle w:val="Titre1"/>
         <w:numPr>
           <w:ilvl w:val="0"/>
           <w:numId w:val="3"/>
@@ -265,7 +265,7 @@
     </w:p>
     <w:p>
       <w:pPr>
-        <w:pStyle w:val="Nagwek2"/>
+        <w:pStyle w:val="Titre2"/>
         <w:jc w:val="both"/>
         <w:rPr>
           <w:rFonts w:ascii="Times New Roman" w:hAnsi="Times New Roman" w:cs="Times New Roman"/>
@@ -412,6 +412,7 @@
         </w:rPr>
         <w:t xml:space="preserve"> Agents are </w:t>
       </w:r>
+      <w:commentRangeStart w:id="0"/>
       <w:r>
         <w:rPr>
           <w:rFonts w:ascii="Times New Roman" w:hAnsi="Times New Roman" w:cs="Times New Roman"/>
@@ -426,7 +427,27 @@
           <w:color w:val="000000" w:themeColor="text1"/>
           <w:lang w:val="en-US"/>
         </w:rPr>
-        <w:t xml:space="preserve"> and the health ministry of a fictional country</w:t>
+        <w:t xml:space="preserve"> </w:t>
+      </w:r>
+      <w:commentRangeEnd w:id="0"/>
+      <w:r>
+        <w:rPr>
+          <w:rStyle w:val="Marquedecommentaire"/>
+          <w:rFonts w:ascii="Times New Roman" w:hAnsi="Times New Roman" w:cs="Times New Roman"/>
+          <w:color w:val="000000" w:themeColor="text1"/>
+          <w:sz w:val="22"/>
+          <w:szCs w:val="22"/>
+          <w:lang w:val="en-US"/>
+        </w:rPr>
+        <w:commentReference w:id="0"/>
+      </w:r>
+      <w:r>
+        <w:rPr>
+          <w:rFonts w:ascii="Times New Roman" w:hAnsi="Times New Roman" w:cs="Times New Roman"/>
+          <w:color w:val="000000" w:themeColor="text1"/>
+          <w:lang w:val="en-US"/>
+        </w:rPr>
+        <w:t>and the health ministry of a fictional country</w:t>
       </w:r>
       <w:r>
         <w:rPr>
@@ -466,7 +487,7 @@
     </w:p>
     <w:p>
       <w:pPr>
-        <w:pStyle w:val="Akapitzlist"/>
+        <w:pStyle w:val="Paragraphedeliste"/>
         <w:numPr>
           <w:ilvl w:val="0"/>
           <w:numId w:val="2"/>
@@ -524,7 +545,7 @@
     </w:p>
     <w:p>
       <w:pPr>
-        <w:pStyle w:val="Akapitzlist"/>
+        <w:pStyle w:val="Paragraphedeliste"/>
         <w:numPr>
           <w:ilvl w:val="0"/>
           <w:numId w:val="2"/>
@@ -596,7 +617,7 @@
     </w:p>
     <w:p>
       <w:pPr>
-        <w:pStyle w:val="Nagwek2"/>
+        <w:pStyle w:val="Titre2"/>
         <w:jc w:val="both"/>
         <w:rPr>
           <w:rFonts w:ascii="Times New Roman" w:hAnsi="Times New Roman" w:cs="Times New Roman"/>
@@ -2164,7 +2185,7 @@
     </w:p>
     <w:p>
       <w:pPr>
-        <w:pStyle w:val="Akapitzlist"/>
+        <w:pStyle w:val="Paragraphedeliste"/>
         <w:numPr>
           <w:ilvl w:val="0"/>
           <w:numId w:val="2"/>
@@ -2288,7 +2309,7 @@
     </w:p>
     <w:p>
       <w:pPr>
-        <w:pStyle w:val="Akapitzlist"/>
+        <w:pStyle w:val="Paragraphedeliste"/>
         <w:numPr>
           <w:ilvl w:val="0"/>
           <w:numId w:val="2"/>
@@ -2372,7 +2393,7 @@
     </w:p>
     <w:p>
       <w:pPr>
-        <w:pStyle w:val="Akapitzlist"/>
+        <w:pStyle w:val="Paragraphedeliste"/>
         <w:numPr>
           <w:ilvl w:val="0"/>
           <w:numId w:val="2"/>
@@ -2436,7 +2457,7 @@
     </w:p>
     <w:p>
       <w:pPr>
-        <w:pStyle w:val="Akapitzlist"/>
+        <w:pStyle w:val="Paragraphedeliste"/>
         <w:numPr>
           <w:ilvl w:val="0"/>
           <w:numId w:val="2"/>
@@ -2528,7 +2549,7 @@
     </w:p>
     <w:p>
       <w:pPr>
-        <w:pStyle w:val="Akapitzlist"/>
+        <w:pStyle w:val="Paragraphedeliste"/>
         <w:numPr>
           <w:ilvl w:val="0"/>
           <w:numId w:val="2"/>
@@ -2573,7 +2594,23 @@
           <w:color w:val="000000" w:themeColor="text1"/>
           <w:lang w:val="en-US"/>
         </w:rPr>
-        <w:t xml:space="preserve">individual responsiveness to the public health communication campaign; drawn once at initialisation from a </w:t>
+        <w:t xml:space="preserve">individual responsiveness to the public health communication campaign; drawn once at </w:t>
+      </w:r>
+      <w:r>
+        <w:rPr>
+          <w:rFonts w:ascii="Times New Roman" w:hAnsi="Times New Roman" w:cs="Times New Roman"/>
+          <w:color w:val="000000" w:themeColor="text1"/>
+          <w:lang w:val="en-US"/>
+        </w:rPr>
+        <w:t>initialization</w:t>
+      </w:r>
+      <w:r>
+        <w:rPr>
+          <w:rFonts w:ascii="Times New Roman" w:hAnsi="Times New Roman" w:cs="Times New Roman"/>
+          <w:color w:val="000000" w:themeColor="text1"/>
+          <w:lang w:val="en-US"/>
+        </w:rPr>
+        <w:t xml:space="preserve"> from a </w:t>
       </w:r>
       <w:r>
         <w:rPr>
@@ -2594,7 +2631,7 @@
     </w:p>
     <w:p>
       <w:pPr>
-        <w:pStyle w:val="Akapitzlist"/>
+        <w:pStyle w:val="Paragraphedeliste"/>
         <w:numPr>
           <w:ilvl w:val="0"/>
           <w:numId w:val="2"/>
@@ -2868,13 +2905,34 @@
         </w:rPr>
         <w:t xml:space="preserve"> and five times higher in the dense periphery. </w:t>
       </w:r>
-      <w:r>
-        <w:rPr>
-          <w:rFonts w:ascii="Times New Roman" w:hAnsi="Times New Roman" w:cs="Times New Roman"/>
-          <w:color w:val="000000" w:themeColor="text1"/>
-          <w:lang w:val="en-US"/>
-        </w:rPr>
-        <w:t xml:space="preserve">Each cell can host multiple agents; contacts occur among co-located agents and their Moore </w:t>
+      <w:commentRangeStart w:id="1"/>
+      <w:r>
+        <w:rPr>
+          <w:rFonts w:ascii="Times New Roman" w:hAnsi="Times New Roman" w:cs="Times New Roman"/>
+          <w:color w:val="000000" w:themeColor="text1"/>
+          <w:lang w:val="en-US"/>
+        </w:rPr>
+        <w:t>Each cell can host multiple agents</w:t>
+      </w:r>
+      <w:commentRangeEnd w:id="1"/>
+      <w:r>
+        <w:rPr>
+          <w:rStyle w:val="Marquedecommentaire"/>
+          <w:rFonts w:ascii="Times New Roman" w:hAnsi="Times New Roman" w:cs="Times New Roman"/>
+          <w:color w:val="000000" w:themeColor="text1"/>
+          <w:sz w:val="22"/>
+          <w:szCs w:val="22"/>
+          <w:lang w:val="en-US"/>
+        </w:rPr>
+        <w:commentReference w:id="1"/>
+      </w:r>
+      <w:r>
+        <w:rPr>
+          <w:rFonts w:ascii="Times New Roman" w:hAnsi="Times New Roman" w:cs="Times New Roman"/>
+          <w:color w:val="000000" w:themeColor="text1"/>
+          <w:lang w:val="en-US"/>
+        </w:rPr>
+        <w:t xml:space="preserve">; contacts occur among co-located agents and their Moore </w:t>
       </w:r>
       <w:r>
         <w:rPr>
@@ -2927,7 +2985,7 @@
     </w:p>
     <w:p>
       <w:pPr>
-        <w:pStyle w:val="Akapitzlist"/>
+        <w:pStyle w:val="Paragraphedeliste"/>
         <w:numPr>
           <w:ilvl w:val="0"/>
           <w:numId w:val="2"/>
@@ -2983,7 +3041,7 @@
     </w:p>
     <w:p>
       <w:pPr>
-        <w:pStyle w:val="Akapitzlist"/>
+        <w:pStyle w:val="Paragraphedeliste"/>
         <w:numPr>
           <w:ilvl w:val="0"/>
           <w:numId w:val="2"/>
@@ -3004,7 +3062,7 @@
         </w:rPr>
         <w:t xml:space="preserve">Spatial resolution: 100 × 100 cells. </w:t>
       </w:r>
-      <w:commentRangeStart w:id="0"/>
+      <w:commentRangeStart w:id="2"/>
       <w:r>
         <w:rPr>
           <w:rFonts w:ascii="Times New Roman" w:hAnsi="Times New Roman" w:cs="Times New Roman"/>
@@ -3013,22 +3071,22 @@
         </w:rPr>
         <w:t>Approximate real-world calibration: 1 cell ≈ 200 m × 200 m.</w:t>
       </w:r>
-      <w:commentRangeEnd w:id="0"/>
-      <w:r>
-        <w:rPr>
-          <w:rStyle w:val="Odwoaniedokomentarza"/>
+      <w:commentRangeEnd w:id="2"/>
+      <w:r>
+        <w:rPr>
+          <w:rStyle w:val="Marquedecommentaire"/>
           <w:rFonts w:ascii="Times New Roman" w:hAnsi="Times New Roman" w:cs="Times New Roman"/>
           <w:color w:val="000000" w:themeColor="text1"/>
           <w:sz w:val="22"/>
           <w:szCs w:val="22"/>
           <w:lang w:val="en-US"/>
         </w:rPr>
-        <w:commentReference w:id="0"/>
-      </w:r>
-    </w:p>
-    <w:p>
-      <w:pPr>
-        <w:pStyle w:val="Akapitzlist"/>
+        <w:commentReference w:id="2"/>
+      </w:r>
+    </w:p>
+    <w:p>
+      <w:pPr>
+        <w:pStyle w:val="Paragraphedeliste"/>
         <w:numPr>
           <w:ilvl w:val="0"/>
           <w:numId w:val="2"/>
@@ -3041,7 +3099,7 @@
           <w:lang w:val="en-US"/>
         </w:rPr>
       </w:pPr>
-      <w:commentRangeStart w:id="1"/>
+      <w:commentRangeStart w:id="3"/>
       <w:r>
         <w:rPr>
           <w:rFonts w:ascii="Times New Roman" w:hAnsi="Times New Roman" w:cs="Times New Roman"/>
@@ -3050,22 +3108,22 @@
         </w:rPr>
         <w:t xml:space="preserve">Population size: N = 5 000 – 20 000 agents. Smaller N increases stochastic variance </w:t>
       </w:r>
-      <w:commentRangeEnd w:id="1"/>
-      <w:r>
-        <w:rPr>
-          <w:rStyle w:val="Odwoaniedokomentarza"/>
+      <w:commentRangeEnd w:id="3"/>
+      <w:r>
+        <w:rPr>
+          <w:rStyle w:val="Marquedecommentaire"/>
           <w:rFonts w:ascii="Times New Roman" w:hAnsi="Times New Roman" w:cs="Times New Roman"/>
           <w:color w:val="000000" w:themeColor="text1"/>
           <w:sz w:val="22"/>
           <w:szCs w:val="22"/>
           <w:lang w:val="en-US"/>
         </w:rPr>
-        <w:commentReference w:id="1"/>
-      </w:r>
-    </w:p>
-    <w:p>
-      <w:pPr>
-        <w:pStyle w:val="Akapitzlist"/>
+        <w:commentReference w:id="3"/>
+      </w:r>
+    </w:p>
+    <w:p>
+      <w:pPr>
+        <w:pStyle w:val="Paragraphedeliste"/>
         <w:numPr>
           <w:ilvl w:val="0"/>
           <w:numId w:val="2"/>
@@ -3148,15 +3206,14 @@
     </w:p>
     <w:p>
       <w:pPr>
-        <w:pStyle w:val="Nagwek2"/>
-        <w:jc w:val="both"/>
-        <w:rPr>
-          <w:rFonts w:ascii="Times New Roman" w:hAnsi="Times New Roman" w:cs="Times New Roman"/>
-          <w:color w:val="000000" w:themeColor="text1"/>
-          <w:lang w:val="en-US"/>
-        </w:rPr>
-      </w:pPr>
-      <w:commentRangeStart w:id="2"/>
+        <w:pStyle w:val="Titre2"/>
+        <w:jc w:val="both"/>
+        <w:rPr>
+          <w:rFonts w:ascii="Times New Roman" w:hAnsi="Times New Roman" w:cs="Times New Roman"/>
+          <w:color w:val="000000" w:themeColor="text1"/>
+          <w:lang w:val="en-US"/>
+        </w:rPr>
+      </w:pPr>
       <w:r>
         <w:rPr>
           <w:rFonts w:ascii="Times New Roman" w:hAnsi="Times New Roman" w:cs="Times New Roman"/>
@@ -3238,7 +3295,7 @@
           <w:color w:val="000000" w:themeColor="text1"/>
           <w:lang w:val="en-US"/>
         </w:rPr>
-        <w:t>Step 1 — Mobility decision (every tick)</w:t>
+        <w:t xml:space="preserve">Step 1 — Mobility decision </w:t>
       </w:r>
     </w:p>
     <w:p>
@@ -3251,6 +3308,7 @@
           <w:lang w:val="en-US"/>
         </w:rPr>
       </w:pPr>
+      <w:commentRangeStart w:id="4"/>
       <w:r>
         <w:rPr>
           <w:rFonts w:ascii="Times New Roman" w:hAnsi="Times New Roman" w:cs="Times New Roman"/>
@@ -3259,10 +3317,22 @@
         </w:rPr>
         <w:t>Each agent decides whether to leave home. The probability of commuting depends on epidemic state and status of the health plan:</w:t>
       </w:r>
-    </w:p>
-    <w:p>
-      <w:pPr>
-        <w:pStyle w:val="Akapitzlist"/>
+      <w:commentRangeEnd w:id="4"/>
+      <w:r>
+        <w:rPr>
+          <w:rStyle w:val="Marquedecommentaire"/>
+          <w:rFonts w:ascii="Times New Roman" w:hAnsi="Times New Roman" w:cs="Times New Roman"/>
+          <w:color w:val="000000" w:themeColor="text1"/>
+          <w:sz w:val="22"/>
+          <w:szCs w:val="22"/>
+          <w:lang w:val="en-US"/>
+        </w:rPr>
+        <w:commentReference w:id="4"/>
+      </w:r>
+    </w:p>
+    <w:p>
+      <w:pPr>
+        <w:pStyle w:val="Paragraphedeliste"/>
         <w:numPr>
           <w:ilvl w:val="0"/>
           <w:numId w:val="2"/>
@@ -3302,7 +3372,7 @@
     </w:p>
     <w:p>
       <w:pPr>
-        <w:pStyle w:val="Akapitzlist"/>
+        <w:pStyle w:val="Paragraphedeliste"/>
         <w:numPr>
           <w:ilvl w:val="0"/>
           <w:numId w:val="2"/>
@@ -3356,7 +3426,23 @@
           <w:color w:val="000000" w:themeColor="text1"/>
           <w:lang w:val="en-US"/>
         </w:rPr>
-        <w:t>Agents who commute are assigned a transport mode: public transit (TC) or car, drawn from Bernoulli(transport_pref). Agents remaining at home are flagged mode = home.</w:t>
+        <w:t>Agents who commute are assigned a transport mode: public transit (</w:t>
+      </w:r>
+      <w:r>
+        <w:rPr>
+          <w:rFonts w:ascii="Times New Roman" w:hAnsi="Times New Roman" w:cs="Times New Roman"/>
+          <w:color w:val="000000" w:themeColor="text1"/>
+          <w:lang w:val="en-US"/>
+        </w:rPr>
+        <w:t>PT</w:t>
+      </w:r>
+      <w:r>
+        <w:rPr>
+          <w:rFonts w:ascii="Times New Roman" w:hAnsi="Times New Roman" w:cs="Times New Roman"/>
+          <w:color w:val="000000" w:themeColor="text1"/>
+          <w:lang w:val="en-US"/>
+        </w:rPr>
+        <w:t>) or car, drawn from Bernoulli(transport_pref). Agents remaining at home are flagged mode = home.</w:t>
       </w:r>
     </w:p>
     <w:p>
@@ -3448,7 +3534,23 @@
           <w:color w:val="000000" w:themeColor="text1"/>
           <w:lang w:val="en-US"/>
         </w:rPr>
-        <w:t>where m_mode is a transport multiplier (m_TC &gt; m_car &gt; m_home), r_state = 1 for Iₐ and r_s &lt; 1 for Iₛ (reduced outdoor mobility), and εₛ is the agent's individual compliance. Infection is drawn as Bernoulli(1 − exp(−λₛ · Δt)); upon infection, state S → E.</w:t>
+        <w:t>where m_mode is a transport multiplier (m_</w:t>
+      </w:r>
+      <w:r>
+        <w:rPr>
+          <w:rFonts w:ascii="Times New Roman" w:hAnsi="Times New Roman" w:cs="Times New Roman"/>
+          <w:color w:val="000000" w:themeColor="text1"/>
+          <w:lang w:val="en-US"/>
+        </w:rPr>
+        <w:t>PT</w:t>
+      </w:r>
+      <w:r>
+        <w:rPr>
+          <w:rFonts w:ascii="Times New Roman" w:hAnsi="Times New Roman" w:cs="Times New Roman"/>
+          <w:color w:val="000000" w:themeColor="text1"/>
+          <w:lang w:val="en-US"/>
+        </w:rPr>
+        <w:t xml:space="preserve"> &gt; m_car &gt; m_home), r_state = 1 for Iₐ and r_s &lt; 1 for Iₛ (reduced outdoor mobility), and εₛ is the agent's individual compliance. Infection is drawn as Bernoulli(1 − exp(−λₛ · Δt)); upon infection, state S → E.</w:t>
       </w:r>
     </w:p>
     <w:p>
@@ -3504,7 +3606,7 @@
     </w:p>
     <w:p>
       <w:pPr>
-        <w:pStyle w:val="Akapitzlist"/>
+        <w:pStyle w:val="Paragraphedeliste"/>
         <w:numPr>
           <w:ilvl w:val="0"/>
           <w:numId w:val="2"/>
@@ -3528,7 +3630,7 @@
     </w:p>
     <w:p>
       <w:pPr>
-        <w:pStyle w:val="Akapitzlist"/>
+        <w:pStyle w:val="Paragraphedeliste"/>
         <w:numPr>
           <w:ilvl w:val="0"/>
           <w:numId w:val="2"/>
@@ -3724,7 +3826,7 @@
     </w:p>
     <w:p>
       <w:pPr>
-        <w:pStyle w:val="Akapitzlist"/>
+        <w:pStyle w:val="Paragraphedeliste"/>
         <w:numPr>
           <w:ilvl w:val="0"/>
           <w:numId w:val="2"/>
@@ -3748,7 +3850,7 @@
     </w:p>
     <w:p>
       <w:pPr>
-        <w:pStyle w:val="Akapitzlist"/>
+        <w:pStyle w:val="Paragraphedeliste"/>
         <w:numPr>
           <w:ilvl w:val="0"/>
           <w:numId w:val="2"/>
@@ -3772,7 +3874,7 @@
     </w:p>
     <w:p>
       <w:pPr>
-        <w:pStyle w:val="Akapitzlist"/>
+        <w:pStyle w:val="Paragraphedeliste"/>
         <w:numPr>
           <w:ilvl w:val="0"/>
           <w:numId w:val="2"/>
@@ -3812,18 +3914,6 @@
         </w:rPr>
         <w:t>These scalar summary statistics form the vector y_sim(θ) used in the ABC distance function d(y_sim, y_obs). The gap between true prevalence and π_dec is a structural feature of the model: it introduces a systematic bias that the Bayesian framework is designed to account for through the prior on p_doc.</w:t>
       </w:r>
-      <w:commentRangeEnd w:id="2"/>
-      <w:r>
-        <w:rPr>
-          <w:rStyle w:val="Odwoaniedokomentarza"/>
-          <w:rFonts w:ascii="Times New Roman" w:hAnsi="Times New Roman" w:cs="Times New Roman"/>
-          <w:color w:val="000000" w:themeColor="text1"/>
-          <w:sz w:val="22"/>
-          <w:szCs w:val="22"/>
-          <w:lang w:val="en-US"/>
-        </w:rPr>
-        <w:commentReference w:id="2"/>
-      </w:r>
     </w:p>
     <w:p>
       <w:pPr>
@@ -3849,7 +3939,7 @@
     </w:p>
     <w:p>
       <w:pPr>
-        <w:pStyle w:val="Akapitzlist"/>
+        <w:pStyle w:val="Paragraphedeliste"/>
         <w:numPr>
           <w:ilvl w:val="0"/>
           <w:numId w:val="3"/>
@@ -4056,7 +4146,44 @@
           <w:lang w:val="en-US"/>
         </w:rPr>
         <w:lastRenderedPageBreak/>
-        <w:t>Agent adapt their behaviors based on the current state of epidemics and the policy signals set by Health Ministry. When the plan is active, individuals reduce the probability of commuting.</w:t>
+        <w:t>Agent</w:t>
+      </w:r>
+      <w:r>
+        <w:rPr>
+          <w:rFonts w:ascii="Times New Roman" w:hAnsi="Times New Roman" w:cs="Times New Roman"/>
+          <w:color w:val="000000" w:themeColor="text1"/>
+          <w:lang w:val="en-US"/>
+        </w:rPr>
+        <w:t>s</w:t>
+      </w:r>
+      <w:r>
+        <w:rPr>
+          <w:rFonts w:ascii="Times New Roman" w:hAnsi="Times New Roman" w:cs="Times New Roman"/>
+          <w:color w:val="000000" w:themeColor="text1"/>
+          <w:lang w:val="en-US"/>
+        </w:rPr>
+        <w:t xml:space="preserve"> adapt their behaviors based on the current state of epidemics and the policy signals set by Health Ministry. </w:t>
+      </w:r>
+      <w:commentRangeStart w:id="5"/>
+      <w:r>
+        <w:rPr>
+          <w:rFonts w:ascii="Times New Roman" w:hAnsi="Times New Roman" w:cs="Times New Roman"/>
+          <w:color w:val="000000" w:themeColor="text1"/>
+          <w:lang w:val="en-US"/>
+        </w:rPr>
+        <w:t>When the plan is active, individuals reduce the probability of commuting.</w:t>
+      </w:r>
+      <w:commentRangeEnd w:id="5"/>
+      <w:r>
+        <w:rPr>
+          <w:rStyle w:val="Marquedecommentaire"/>
+          <w:rFonts w:ascii="Times New Roman" w:hAnsi="Times New Roman" w:cs="Times New Roman"/>
+          <w:color w:val="000000" w:themeColor="text1"/>
+          <w:sz w:val="22"/>
+          <w:szCs w:val="22"/>
+          <w:lang w:val="en-US"/>
+        </w:rPr>
+        <w:commentReference w:id="5"/>
       </w:r>
     </w:p>
     <w:p>
@@ -4073,7 +4200,7 @@
           <w:lang w:val="en-US"/>
         </w:rPr>
       </w:pPr>
-      <w:commentRangeStart w:id="3"/>
+      <w:commentRangeStart w:id="6"/>
       <w:r>
         <w:rPr>
           <w:rFonts w:ascii="Times New Roman" w:hAnsi="Times New Roman" w:cs="Times New Roman"/>
@@ -4261,17 +4388,17 @@
         </w:rPr>
         <w:t>current condition that they are living in (individual health status and policy activation)</w:t>
       </w:r>
-      <w:commentRangeEnd w:id="3"/>
-      <w:r>
-        <w:rPr>
-          <w:rStyle w:val="Odwoaniedokomentarza"/>
+      <w:commentRangeEnd w:id="6"/>
+      <w:r>
+        <w:rPr>
+          <w:rStyle w:val="Marquedecommentaire"/>
           <w:rFonts w:ascii="Times New Roman" w:hAnsi="Times New Roman" w:cs="Times New Roman"/>
           <w:color w:val="EE0000"/>
           <w:sz w:val="22"/>
           <w:szCs w:val="22"/>
           <w:lang w:val="en-US"/>
         </w:rPr>
-        <w:commentReference w:id="3"/>
+        <w:commentReference w:id="6"/>
       </w:r>
     </w:p>
     <w:p>
@@ -4495,8 +4622,40 @@
           <w:color w:val="000000" w:themeColor="text1"/>
           <w:lang w:val="en-US"/>
         </w:rPr>
-        <w:t>Agents form collectives based on where they live, their workplace, and shared characteristics like transport mode. These grouping behaviors influence the epidemic dynamic, even though the group level behavior is not modeled.</w:t>
-      </w:r>
+        <w:t xml:space="preserve">Agents form collectives based on where they live, their workplace, and shared characteristics like transport mode. These grouping behaviors influence the epidemic dynamic, even </w:t>
+      </w:r>
+      <w:commentRangeStart w:id="7"/>
+      <w:r>
+        <w:rPr>
+          <w:rFonts w:ascii="Times New Roman" w:hAnsi="Times New Roman" w:cs="Times New Roman"/>
+          <w:color w:val="000000" w:themeColor="text1"/>
+          <w:lang w:val="en-US"/>
+        </w:rPr>
+        <w:t>though the group level behavior is not modeled.</w:t>
+      </w:r>
+      <w:commentRangeEnd w:id="7"/>
+      <w:r>
+        <w:rPr>
+          <w:rStyle w:val="Marquedecommentaire"/>
+          <w:rFonts w:ascii="Times New Roman" w:hAnsi="Times New Roman" w:cs="Times New Roman"/>
+          <w:color w:val="000000" w:themeColor="text1"/>
+          <w:sz w:val="22"/>
+          <w:szCs w:val="22"/>
+          <w:lang w:val="en-US"/>
+        </w:rPr>
+        <w:commentReference w:id="7"/>
+      </w:r>
+    </w:p>
+    <w:p>
+      <w:pPr>
+        <w:spacing w:before="60" w:after="80"/>
+        <w:jc w:val="both"/>
+        <w:rPr>
+          <w:rFonts w:ascii="Times New Roman" w:hAnsi="Times New Roman" w:cs="Times New Roman"/>
+          <w:color w:val="000000" w:themeColor="text1"/>
+          <w:lang w:val="en-US"/>
+        </w:rPr>
+      </w:pPr>
     </w:p>
     <w:p>
       <w:pPr>
@@ -4541,7 +4700,36 @@
           <w:color w:val="000000" w:themeColor="text1"/>
           <w:lang w:val="en-US"/>
         </w:rPr>
-        <w:t>After each run of the model, data is collected on the number of agents that are newly infected, susceptible, exposed, infected</w:t>
+        <w:t xml:space="preserve">After each </w:t>
+      </w:r>
+      <w:commentRangeStart w:id="8"/>
+      <w:r>
+        <w:rPr>
+          <w:rFonts w:ascii="Times New Roman" w:hAnsi="Times New Roman" w:cs="Times New Roman"/>
+          <w:color w:val="000000" w:themeColor="text1"/>
+          <w:lang w:val="en-US"/>
+        </w:rPr>
+        <w:t>run of the model</w:t>
+      </w:r>
+      <w:commentRangeEnd w:id="8"/>
+      <w:r>
+        <w:rPr>
+          <w:rStyle w:val="Marquedecommentaire"/>
+          <w:rFonts w:ascii="Times New Roman" w:hAnsi="Times New Roman" w:cs="Times New Roman"/>
+          <w:color w:val="000000" w:themeColor="text1"/>
+          <w:sz w:val="22"/>
+          <w:szCs w:val="22"/>
+          <w:lang w:val="en-US"/>
+        </w:rPr>
+        <w:commentReference w:id="8"/>
+      </w:r>
+      <w:r>
+        <w:rPr>
+          <w:rFonts w:ascii="Times New Roman" w:hAnsi="Times New Roman" w:cs="Times New Roman"/>
+          <w:color w:val="000000" w:themeColor="text1"/>
+          <w:lang w:val="en-US"/>
+        </w:rPr>
+        <w:t>, data is collected on the number of agents that are newly infected, susceptible, exposed, infected</w:t>
       </w:r>
       <w:r>
         <w:rPr>
@@ -4573,7 +4761,28 @@
           <w:color w:val="000000" w:themeColor="text1"/>
           <w:lang w:val="en-US"/>
         </w:rPr>
-        <w:t>d timing of the epidemic peak.</w:t>
+        <w:t xml:space="preserve">d timing of the </w:t>
+      </w:r>
+      <w:commentRangeStart w:id="9"/>
+      <w:r>
+        <w:rPr>
+          <w:rFonts w:ascii="Times New Roman" w:hAnsi="Times New Roman" w:cs="Times New Roman"/>
+          <w:color w:val="000000" w:themeColor="text1"/>
+          <w:lang w:val="en-US"/>
+        </w:rPr>
+        <w:t>epidemic peak</w:t>
+      </w:r>
+      <w:commentRangeEnd w:id="9"/>
+      <w:r>
+        <w:rPr>
+          <w:rStyle w:val="Marquedecommentaire"/>
+          <w:rFonts w:ascii="Times New Roman" w:hAnsi="Times New Roman" w:cs="Times New Roman"/>
+          <w:color w:val="000000" w:themeColor="text1"/>
+          <w:sz w:val="22"/>
+          <w:szCs w:val="22"/>
+          <w:lang w:val="en-US"/>
+        </w:rPr>
+        <w:commentReference w:id="9"/>
       </w:r>
     </w:p>
     <w:p>
@@ -4593,7 +4802,7 @@
     </w:p>
     <w:p>
       <w:pPr>
-        <w:pStyle w:val="Akapitzlist"/>
+        <w:pStyle w:val="Paragraphedeliste"/>
         <w:numPr>
           <w:ilvl w:val="0"/>
           <w:numId w:val="3"/>
@@ -4667,7 +4876,81 @@
           <w:color w:val="000000" w:themeColor="text1"/>
           <w:lang w:val="en-US"/>
         </w:rPr>
-        <w:t>At the beginning of the simulation, agents are created and assigned attributes. They are distributed across the three zones: center, periphery, and dense periphery, and have the residence and workplace assigned. They also carry the information about age group, transport preference, responsiveness to the public health campaigns, and the declaration of visiting a doctor in case of infection.</w:t>
+        <w:t xml:space="preserve">At the beginning of the simulation, agents are created and assigned attributes. </w:t>
+      </w:r>
+      <w:commentRangeStart w:id="10"/>
+      <w:r>
+        <w:rPr>
+          <w:rFonts w:ascii="Times New Roman" w:hAnsi="Times New Roman" w:cs="Times New Roman"/>
+          <w:color w:val="000000" w:themeColor="text1"/>
+          <w:lang w:val="en-US"/>
+        </w:rPr>
+        <w:t xml:space="preserve">They </w:t>
+      </w:r>
+      <w:commentRangeEnd w:id="10"/>
+      <w:r>
+        <w:rPr>
+          <w:rStyle w:val="Marquedecommentaire"/>
+          <w:rFonts w:ascii="Times New Roman" w:hAnsi="Times New Roman" w:cs="Times New Roman"/>
+          <w:color w:val="000000" w:themeColor="text1"/>
+          <w:sz w:val="22"/>
+          <w:szCs w:val="22"/>
+          <w:lang w:val="en-US"/>
+        </w:rPr>
+        <w:commentReference w:id="10"/>
+      </w:r>
+      <w:r>
+        <w:rPr>
+          <w:rFonts w:ascii="Times New Roman" w:hAnsi="Times New Roman" w:cs="Times New Roman"/>
+          <w:color w:val="000000" w:themeColor="text1"/>
+          <w:lang w:val="en-US"/>
+        </w:rPr>
+        <w:t>are distributed across the three zones: center, periphery, and dense periphery</w:t>
+      </w:r>
+      <w:r>
+        <w:rPr>
+          <w:rFonts w:ascii="Times New Roman" w:hAnsi="Times New Roman" w:cs="Times New Roman"/>
+          <w:color w:val="000000" w:themeColor="text1"/>
+          <w:lang w:val="en-US"/>
+        </w:rPr>
+        <w:t xml:space="preserve">. </w:t>
+      </w:r>
+      <w:r>
+        <w:rPr>
+          <w:rFonts w:ascii="Times New Roman" w:hAnsi="Times New Roman" w:cs="Times New Roman"/>
+          <w:color w:val="000000" w:themeColor="text1"/>
+          <w:lang w:val="en-US"/>
+        </w:rPr>
+        <w:t xml:space="preserve">They also carry the information about age group, transport preference, responsiveness to the public health campaigns, and the </w:t>
+      </w:r>
+      <w:commentRangeStart w:id="11"/>
+      <w:r>
+        <w:rPr>
+          <w:rFonts w:ascii="Times New Roman" w:hAnsi="Times New Roman" w:cs="Times New Roman"/>
+          <w:color w:val="000000" w:themeColor="text1"/>
+          <w:lang w:val="en-US"/>
+        </w:rPr>
+        <w:t xml:space="preserve">declaration </w:t>
+      </w:r>
+      <w:commentRangeEnd w:id="11"/>
+      <w:r>
+        <w:rPr>
+          <w:rStyle w:val="Marquedecommentaire"/>
+          <w:rFonts w:ascii="Times New Roman" w:hAnsi="Times New Roman" w:cs="Times New Roman"/>
+          <w:color w:val="000000" w:themeColor="text1"/>
+          <w:sz w:val="22"/>
+          <w:szCs w:val="22"/>
+          <w:lang w:val="en-US"/>
+        </w:rPr>
+        <w:commentReference w:id="11"/>
+      </w:r>
+      <w:r>
+        <w:rPr>
+          <w:rFonts w:ascii="Times New Roman" w:hAnsi="Times New Roman" w:cs="Times New Roman"/>
+          <w:color w:val="000000" w:themeColor="text1"/>
+          <w:lang w:val="en-US"/>
+        </w:rPr>
+        <w:t>of visiting a doctor in case of infection.</w:t>
       </w:r>
     </w:p>
     <w:p>
@@ -4686,7 +4969,36 @@
           <w:color w:val="000000" w:themeColor="text1"/>
           <w:lang w:val="en-US"/>
         </w:rPr>
-        <w:t>Initial epidemic conditions are set by assigning a part of the agents to the exposed or infectious states. The majority of agents start in a susceptible state, and no agents are initially recovered. At the beginning, there is no active health recovery plan.</w:t>
+        <w:t xml:space="preserve">Initial epidemic conditions are set by assigning a part of the agents to the exposed or infectious states. The majority of agents start in a susceptible state, and </w:t>
+      </w:r>
+      <w:commentRangeStart w:id="12"/>
+      <w:r>
+        <w:rPr>
+          <w:rFonts w:ascii="Times New Roman" w:hAnsi="Times New Roman" w:cs="Times New Roman"/>
+          <w:color w:val="000000" w:themeColor="text1"/>
+          <w:lang w:val="en-US"/>
+        </w:rPr>
+        <w:t>no agents are initially recovered</w:t>
+      </w:r>
+      <w:commentRangeEnd w:id="12"/>
+      <w:r>
+        <w:rPr>
+          <w:rStyle w:val="Marquedecommentaire"/>
+          <w:rFonts w:ascii="Times New Roman" w:hAnsi="Times New Roman" w:cs="Times New Roman"/>
+          <w:color w:val="000000" w:themeColor="text1"/>
+          <w:sz w:val="22"/>
+          <w:szCs w:val="22"/>
+          <w:lang w:val="en-US"/>
+        </w:rPr>
+        <w:commentReference w:id="12"/>
+      </w:r>
+      <w:r>
+        <w:rPr>
+          <w:rFonts w:ascii="Times New Roman" w:hAnsi="Times New Roman" w:cs="Times New Roman"/>
+          <w:color w:val="000000" w:themeColor="text1"/>
+          <w:lang w:val="en-US"/>
+        </w:rPr>
+        <w:t>. At the beginning, there is no active health recovery plan.</w:t>
       </w:r>
     </w:p>
     <w:p>
@@ -4740,7 +5052,23 @@
           <w:color w:val="000000" w:themeColor="text1"/>
           <w:lang w:val="en-US"/>
         </w:rPr>
-        <w:t xml:space="preserve">. There are no real-time data streams used. All variability arises from agent interactions and stochastic processes. </w:t>
+        <w:t xml:space="preserve">. There are no real-time data streams used. All variability arises from </w:t>
+      </w:r>
+      <w:r>
+        <w:rPr>
+          <w:rFonts w:ascii="Times New Roman" w:hAnsi="Times New Roman" w:cs="Times New Roman"/>
+          <w:color w:val="000000" w:themeColor="text1"/>
+          <w:lang w:val="en-US"/>
+        </w:rPr>
+        <w:t xml:space="preserve">initial stochasticity and </w:t>
+      </w:r>
+      <w:r>
+        <w:rPr>
+          <w:rFonts w:ascii="Times New Roman" w:hAnsi="Times New Roman" w:cs="Times New Roman"/>
+          <w:color w:val="000000" w:themeColor="text1"/>
+          <w:lang w:val="en-US"/>
+        </w:rPr>
+        <w:t xml:space="preserve">agent interactions. </w:t>
       </w:r>
     </w:p>
     <w:p>
@@ -4790,6 +5118,7 @@
           <w:color w:val="000000" w:themeColor="text1"/>
           <w:lang w:val="en-US"/>
         </w:rPr>
+        <w:lastRenderedPageBreak/>
         <w:t>7.1. Mobility submodel</w:t>
       </w:r>
     </w:p>
@@ -4809,7 +5138,6 @@
           <w:color w:val="000000" w:themeColor="text1"/>
           <w:lang w:val="en-US"/>
         </w:rPr>
-        <w:lastRenderedPageBreak/>
         <w:t xml:space="preserve">At each step, agents make a decision whether to commute based on their epidemic state and status of the health plan. People with symptoms and the ones responsive to </w:t>
       </w:r>
       <w:r>
@@ -4868,7 +5196,23 @@
           <w:color w:val="000000" w:themeColor="text1"/>
           <w:lang w:val="en-US"/>
         </w:rPr>
-        <w:t xml:space="preserve">The force of infection is computed from infectious neighbors incorporating: transmission rate </w:t>
+        <w:t xml:space="preserve">The </w:t>
+      </w:r>
+      <w:r>
+        <w:rPr>
+          <w:rFonts w:ascii="Times New Roman" w:hAnsi="Times New Roman" w:cs="Times New Roman"/>
+          <w:color w:val="000000" w:themeColor="text1"/>
+          <w:lang w:val="en-US"/>
+        </w:rPr>
+        <w:t>likelihhod of transmission</w:t>
+      </w:r>
+      <w:r>
+        <w:rPr>
+          <w:rFonts w:ascii="Times New Roman" w:hAnsi="Times New Roman" w:cs="Times New Roman"/>
+          <w:color w:val="000000" w:themeColor="text1"/>
+          <w:lang w:val="en-US"/>
+        </w:rPr>
+        <w:t xml:space="preserve"> is computed from infectious neighbors incorporating: transmission rate </w:t>
       </w:r>
       <w:r>
         <w:rPr>
@@ -4886,6 +5230,7 @@
         </w:rPr>
         <w:t xml:space="preserve">, </w:t>
       </w:r>
+      <w:commentRangeStart w:id="13"/>
       <w:r>
         <w:rPr>
           <w:rFonts w:ascii="Times New Roman" w:hAnsi="Times New Roman" w:cs="Times New Roman"/>
@@ -4902,6 +5247,18 @@
         </w:rPr>
         <w:t xml:space="preserve"> multiplier</w:t>
       </w:r>
+      <w:commentRangeEnd w:id="13"/>
+      <w:r>
+        <w:rPr>
+          <w:rStyle w:val="Marquedecommentaire"/>
+          <w:rFonts w:ascii="Times New Roman" w:hAnsi="Times New Roman" w:cs="Times New Roman"/>
+          <w:color w:val="000000" w:themeColor="text1"/>
+          <w:sz w:val="22"/>
+          <w:szCs w:val="22"/>
+          <w:lang w:val="en-US"/>
+        </w:rPr>
+        <w:commentReference w:id="13"/>
+      </w:r>
       <w:r>
         <w:rPr>
           <w:rFonts w:ascii="Times New Roman" w:hAnsi="Times New Roman" w:cs="Times New Roman"/>
@@ -5006,7 +5363,45 @@
           <w:color w:val="000000" w:themeColor="text1"/>
           <w:lang w:val="en-US"/>
         </w:rPr>
-        <w:t xml:space="preserve"> transmission between epidemiological states following stochastic processes. Exposed </w:t>
+        <w:t xml:space="preserve"> transmission between epidemiological states following </w:t>
+      </w:r>
+      <w:commentRangeStart w:id="14"/>
+      <w:r>
+        <w:rPr>
+          <w:rFonts w:ascii="Times New Roman" w:hAnsi="Times New Roman" w:cs="Times New Roman"/>
+          <w:color w:val="000000" w:themeColor="text1"/>
+          <w:lang w:val="en-US"/>
+        </w:rPr>
+        <w:t>stochastic processes</w:t>
+      </w:r>
+      <w:commentRangeEnd w:id="14"/>
+      <w:r>
+        <w:rPr>
+          <w:rStyle w:val="Marquedecommentaire"/>
+          <w:rFonts w:ascii="Times New Roman" w:hAnsi="Times New Roman" w:cs="Times New Roman"/>
+          <w:color w:val="000000" w:themeColor="text1"/>
+          <w:sz w:val="22"/>
+          <w:szCs w:val="22"/>
+          <w:lang w:val="en-US"/>
+        </w:rPr>
+        <w:commentReference w:id="14"/>
+      </w:r>
+      <w:r>
+        <w:rPr>
+          <w:rFonts w:ascii="Times New Roman" w:hAnsi="Times New Roman" w:cs="Times New Roman"/>
+          <w:color w:val="000000" w:themeColor="text1"/>
+          <w:lang w:val="en-US"/>
+        </w:rPr>
+        <w:t xml:space="preserve">. </w:t>
+      </w:r>
+      <w:commentRangeStart w:id="15"/>
+      <w:r>
+        <w:rPr>
+          <w:rFonts w:ascii="Times New Roman" w:hAnsi="Times New Roman" w:cs="Times New Roman"/>
+          <w:color w:val="000000" w:themeColor="text1"/>
+          <w:lang w:val="en-US"/>
+        </w:rPr>
+        <w:t xml:space="preserve">Exposed </w:t>
       </w:r>
       <w:r>
         <w:rPr>
@@ -5040,6 +5435,18 @@
         </w:rPr>
         <w:t>.</w:t>
       </w:r>
+      <w:commentRangeEnd w:id="15"/>
+      <w:r>
+        <w:rPr>
+          <w:rStyle w:val="Marquedecommentaire"/>
+          <w:rFonts w:ascii="Times New Roman" w:hAnsi="Times New Roman" w:cs="Times New Roman"/>
+          <w:color w:val="000000" w:themeColor="text1"/>
+          <w:sz w:val="22"/>
+          <w:szCs w:val="22"/>
+          <w:lang w:val="en-US"/>
+        </w:rPr>
+        <w:commentReference w:id="15"/>
+      </w:r>
     </w:p>
     <w:p>
       <w:pPr>
@@ -5080,7 +5487,28 @@
           <w:color w:val="000000" w:themeColor="text1"/>
           <w:lang w:val="en-US"/>
         </w:rPr>
-        <w:t>After every step</w:t>
+        <w:t xml:space="preserve">After every </w:t>
+      </w:r>
+      <w:commentRangeStart w:id="16"/>
+      <w:r>
+        <w:rPr>
+          <w:rFonts w:ascii="Times New Roman" w:hAnsi="Times New Roman" w:cs="Times New Roman"/>
+          <w:color w:val="000000" w:themeColor="text1"/>
+          <w:lang w:val="en-US"/>
+        </w:rPr>
+        <w:t>step</w:t>
+      </w:r>
+      <w:commentRangeEnd w:id="16"/>
+      <w:r>
+        <w:rPr>
+          <w:rStyle w:val="Marquedecommentaire"/>
+          <w:rFonts w:ascii="Times New Roman" w:hAnsi="Times New Roman" w:cs="Times New Roman"/>
+          <w:color w:val="000000" w:themeColor="text1"/>
+          <w:sz w:val="22"/>
+          <w:szCs w:val="22"/>
+          <w:lang w:val="en-US"/>
+        </w:rPr>
+        <w:commentReference w:id="16"/>
       </w:r>
       <w:r>
         <w:rPr>
@@ -5186,7 +5614,23 @@
           <w:color w:val="000000" w:themeColor="text1"/>
           <w:lang w:val="en-US"/>
         </w:rPr>
-        <w:t xml:space="preserve">. It reduces the transmission of the virus by influencing agent behavior. </w:t>
+        <w:t xml:space="preserve">. It reduces the transmission of the virus </w:t>
+      </w:r>
+      <w:r>
+        <w:rPr>
+          <w:rFonts w:ascii="Times New Roman" w:hAnsi="Times New Roman" w:cs="Times New Roman"/>
+          <w:color w:val="000000" w:themeColor="text1"/>
+          <w:lang w:val="en-US"/>
+        </w:rPr>
+        <w:t>as agents adapt their behavior in response to activation.</w:t>
+      </w:r>
+      <w:r>
+        <w:rPr>
+          <w:rFonts w:ascii="Times New Roman" w:hAnsi="Times New Roman" w:cs="Times New Roman"/>
+          <w:color w:val="000000" w:themeColor="text1"/>
+          <w:lang w:val="en-US"/>
+        </w:rPr>
+        <w:t xml:space="preserve"> </w:t>
       </w:r>
     </w:p>
     <w:sectPr>
@@ -5204,11 +5648,11 @@
 
 <file path=word/comments.xml><?xml version="1.0" encoding="utf-8"?>
 <w:comments xmlns:wpc="http://schemas.microsoft.com/office/word/2010/wordprocessingCanvas" xmlns:cx="http://schemas.microsoft.com/office/drawing/2014/chartex" xmlns:cx1="http://schemas.microsoft.com/office/drawing/2015/9/8/chartex" xmlns:cx2="http://schemas.microsoft.com/office/drawing/2015/10/21/chartex" xmlns:cx3="http://schemas.microsoft.com/office/drawing/2016/5/9/chartex" xmlns:cx4="http://schemas.microsoft.com/office/drawing/2016/5/10/chartex" xmlns:cx5="http://schemas.microsoft.com/office/drawing/2016/5/11/chartex" xmlns:cx6="http://schemas.microsoft.com/office/drawing/2016/5/12/chartex" xmlns:cx7="http://schemas.microsoft.com/office/drawing/2016/5/13/chartex" xmlns:cx8="http://schemas.microsoft.com/office/drawing/2016/5/14/chartex" xmlns:mc="http://schemas.openxmlformats.org/markup-compatibility/2006" xmlns:aink="http://schemas.microsoft.com/office/drawing/2016/ink" xmlns:am3d="http://schemas.microsoft.com/office/drawing/2017/model3d" xmlns:o="urn:schemas-microsoft-com:office:office" xmlns:oel="http://schemas.microsoft.com/office/2019/extlst" xmlns:r="http://schemas.openxmlformats.org/officeDocument/2006/relationships" xmlns:m="http://schemas.openxmlformats.org/officeDocument/2006/math" xmlns:v="urn:schemas-microsoft-com:vml" xmlns:wp14="http://schemas.microsoft.com/office/word/2010/wordprocessingDrawing" xmlns:wp="http://schemas.openxmlformats.org/drawingml/2006/wordprocessingDrawing" xmlns:w10="urn:schemas-microsoft-com:office:word" xmlns:w="http://schemas.openxmlformats.org/wordprocessingml/2006/main" xmlns:w14="http://schemas.microsoft.com/office/word/2010/wordml" xmlns:w15="http://schemas.microsoft.com/office/word/2012/wordml" xmlns:w16cex="http://schemas.microsoft.com/office/word/2018/wordml/cex" xmlns:w16cid="http://schemas.microsoft.com/office/word/2016/wordml/cid" xmlns:w16="http://schemas.microsoft.com/office/word/2018/wordml" xmlns:w16du="http://schemas.microsoft.com/office/word/2023/wordml/word16du" xmlns:w16sdtdh="http://schemas.microsoft.com/office/word/2020/wordml/sdtdatahash" xmlns:w16sdtfl="http://schemas.microsoft.com/office/word/2024/wordml/sdtformatlock" xmlns:w16se="http://schemas.microsoft.com/office/word/2015/wordml/symex" xmlns:wpg="http://schemas.microsoft.com/office/word/2010/wordprocessingGroup" xmlns:wpi="http://schemas.microsoft.com/office/word/2010/wordprocessingInk" xmlns:wne="http://schemas.microsoft.com/office/word/2006/wordml" xmlns:wps="http://schemas.microsoft.com/office/word/2010/wordprocessingShape" mc:Ignorable="w14 w15 w16se w16cid w16 w16cex w16sdtdh w16sdtfl w16du wp14">
-  <w:comment w:id="0" w:author="Alexis Grangier" w:date="2026-04-07T12:30:00Z" w:initials="AG">
-    <w:p>
-      <w:r>
-        <w:rPr>
-          <w:rStyle w:val="Odwoaniedokomentarza"/>
+  <w:comment w:id="0" w:author="Alexis Grangier" w:date="2026-04-13T19:29:00Z" w:initials="AG">
+    <w:p>
+      <w:r>
+        <w:rPr>
+          <w:rStyle w:val="Marquedecommentaire"/>
         </w:rPr>
         <w:annotationRef/>
       </w:r>
@@ -5217,15 +5661,15 @@
           <w:sz w:val="20"/>
           <w:szCs w:val="20"/>
         </w:rPr>
-        <w:t>to revise</w:t>
+        <w:t>individuals</w:t>
       </w:r>
     </w:p>
   </w:comment>
-  <w:comment w:id="1" w:author="Alexis Grangier" w:date="2026-04-07T12:31:00Z" w:initials="AG">
-    <w:p>
-      <w:r>
-        <w:rPr>
-          <w:rStyle w:val="Odwoaniedokomentarza"/>
+  <w:comment w:id="1" w:author="Alexis Grangier" w:date="2026-04-13T19:33:00Z" w:initials="AG">
+    <w:p>
+      <w:r>
+        <w:rPr>
+          <w:rStyle w:val="Marquedecommentaire"/>
         </w:rPr>
         <w:annotationRef/>
       </w:r>
@@ -5234,15 +5678,15 @@
           <w:sz w:val="20"/>
           <w:szCs w:val="20"/>
         </w:rPr>
-        <w:t>to revise as well</w:t>
+        <w:t>how many agents per cell / zone</w:t>
       </w:r>
     </w:p>
   </w:comment>
-  <w:comment w:id="2" w:author="Alexis Grangier" w:date="2026-04-07T12:39:00Z" w:initials="AG">
-    <w:p>
-      <w:r>
-        <w:rPr>
-          <w:rStyle w:val="Odwoaniedokomentarza"/>
+  <w:comment w:id="2" w:author="Alexis Grangier" w:date="2026-04-07T12:30:00Z" w:initials="AG">
+    <w:p>
+      <w:r>
+        <w:rPr>
+          <w:rStyle w:val="Marquedecommentaire"/>
         </w:rPr>
         <w:annotationRef/>
       </w:r>
@@ -5251,23 +5695,244 @@
           <w:sz w:val="20"/>
           <w:szCs w:val="20"/>
         </w:rPr>
-        <w:t>I thought AI could help draw something coherent but it is not the case. This is a good base but doesn't reflect the behavior I want. I will finish this later today.</w:t>
+        <w:t>to revise</w:t>
       </w:r>
     </w:p>
   </w:comment>
-  <w:comment w:id="3" w:author="Ania Jurek" w:date="2026-04-11T16:19:00Z" w:initials="AJ">
-    <w:p>
-      <w:pPr>
-        <w:pStyle w:val="Tekstkomentarza"/>
-      </w:pPr>
-      <w:r>
-        <w:rPr>
-          <w:rStyle w:val="Odwoaniedokomentarza"/>
+  <w:comment w:id="3" w:author="Alexis Grangier" w:date="2026-04-07T12:31:00Z" w:initials="AG">
+    <w:p>
+      <w:r>
+        <w:rPr>
+          <w:rStyle w:val="Marquedecommentaire"/>
         </w:rPr>
         <w:annotationRef/>
       </w:r>
       <w:r>
+        <w:rPr>
+          <w:sz w:val="20"/>
+          <w:szCs w:val="20"/>
+        </w:rPr>
+        <w:t>to revise as well</w:t>
+      </w:r>
+    </w:p>
+  </w:comment>
+  <w:comment w:id="4" w:author="Alexis Grangier" w:date="2026-04-13T19:37:00Z" w:initials="AG">
+    <w:p>
+      <w:r>
+        <w:rPr>
+          <w:rStyle w:val="Marquedecommentaire"/>
+        </w:rPr>
+        <w:annotationRef/>
+      </w:r>
+      <w:r>
+        <w:rPr>
+          <w:sz w:val="20"/>
+          <w:szCs w:val="20"/>
+        </w:rPr>
+        <w:t>Do we just do work everyday?</w:t>
+      </w:r>
+    </w:p>
+  </w:comment>
+  <w:comment w:id="5" w:author="Alexis Grangier" w:date="2026-04-13T19:42:00Z" w:initials="AG">
+    <w:p>
+      <w:r>
+        <w:rPr>
+          <w:rStyle w:val="Marquedecommentaire"/>
+        </w:rPr>
+        <w:annotationRef/>
+      </w:r>
+      <w:r>
+        <w:rPr>
+          <w:sz w:val="20"/>
+          <w:szCs w:val="20"/>
+        </w:rPr>
+        <w:t>How about a slowly decreasing effect of government intervention on practices, say over two weeks?</w:t>
+      </w:r>
+    </w:p>
+  </w:comment>
+  <w:comment w:id="6" w:author="Ania Jurek" w:date="2026-04-11T16:19:00Z" w:initials="AJ">
+    <w:p>
+      <w:pPr>
+        <w:pStyle w:val="Commentaire"/>
+      </w:pPr>
+      <w:r>
+        <w:rPr>
+          <w:rStyle w:val="Marquedecommentaire"/>
+        </w:rPr>
+        <w:annotationRef/>
+      </w:r>
+      <w:r>
         <w:t>I think we should remove it in the final version but I will leave it for now if we decide to add sth</w:t>
+      </w:r>
+    </w:p>
+  </w:comment>
+  <w:comment w:id="7" w:author="Alexis Grangier" w:date="2026-04-13T19:44:00Z" w:initials="AG">
+    <w:p>
+      <w:r>
+        <w:rPr>
+          <w:rStyle w:val="Marquedecommentaire"/>
+        </w:rPr>
+        <w:annotationRef/>
+      </w:r>
+      <w:r>
+        <w:rPr>
+          <w:sz w:val="20"/>
+          <w:szCs w:val="20"/>
+        </w:rPr>
+        <w:t>I was thinking those who live in the poorer, more dense region may be less exposed to / less prone to believe in government interventions.</w:t>
+      </w:r>
+    </w:p>
+  </w:comment>
+  <w:comment w:id="8" w:author="Alexis Grangier" w:date="2026-04-13T19:45:00Z" w:initials="AG">
+    <w:p>
+      <w:r>
+        <w:rPr>
+          <w:rStyle w:val="Marquedecommentaire"/>
+        </w:rPr>
+        <w:annotationRef/>
+      </w:r>
+      <w:r>
+        <w:rPr>
+          <w:sz w:val="20"/>
+          <w:szCs w:val="20"/>
+        </w:rPr>
+        <w:t>each day / 24 ticks?</w:t>
+      </w:r>
+    </w:p>
+  </w:comment>
+  <w:comment w:id="9" w:author="Alexis Grangier" w:date="2026-04-13T19:46:00Z" w:initials="AG">
+    <w:p>
+      <w:r>
+        <w:rPr>
+          <w:rStyle w:val="Marquedecommentaire"/>
+        </w:rPr>
+        <w:annotationRef/>
+      </w:r>
+      <w:r>
+        <w:rPr>
+          <w:sz w:val="20"/>
+          <w:szCs w:val="20"/>
+        </w:rPr>
+        <w:t>+ a map of concentration of infection / immune people? Maybe with seasonality?</w:t>
+      </w:r>
+    </w:p>
+  </w:comment>
+  <w:comment w:id="10" w:author="Alexis Grangier" w:date="2026-04-13T19:47:00Z" w:initials="AG">
+    <w:p>
+      <w:r>
+        <w:rPr>
+          <w:rStyle w:val="Marquedecommentaire"/>
+        </w:rPr>
+        <w:annotationRef/>
+      </w:r>
+      <w:r>
+        <w:rPr>
+          <w:sz w:val="20"/>
+          <w:szCs w:val="20"/>
+        </w:rPr>
+        <w:t>their residence and work place</w:t>
+      </w:r>
+    </w:p>
+  </w:comment>
+  <w:comment w:id="11" w:author="Alexis Grangier" w:date="2026-04-13T19:49:00Z" w:initials="AG">
+    <w:p>
+      <w:r>
+        <w:rPr>
+          <w:rStyle w:val="Marquedecommentaire"/>
+        </w:rPr>
+        <w:annotationRef/>
+      </w:r>
+      <w:r>
+        <w:rPr>
+          <w:sz w:val="20"/>
+          <w:szCs w:val="20"/>
+        </w:rPr>
+        <w:t>likelihood of</w:t>
+      </w:r>
+    </w:p>
+  </w:comment>
+  <w:comment w:id="12" w:author="Alexis Grangier" w:date="2026-04-13T19:49:00Z" w:initials="AG">
+    <w:p>
+      <w:r>
+        <w:rPr>
+          <w:rStyle w:val="Marquedecommentaire"/>
+        </w:rPr>
+        <w:annotationRef/>
+      </w:r>
+      <w:r>
+        <w:rPr>
+          <w:sz w:val="20"/>
+          <w:szCs w:val="20"/>
+        </w:rPr>
+        <w:t>So is it an emergent disease?</w:t>
+      </w:r>
+    </w:p>
+  </w:comment>
+  <w:comment w:id="13" w:author="Alexis Grangier" w:date="2026-04-13T19:52:00Z" w:initials="AG">
+    <w:p>
+      <w:r>
+        <w:rPr>
+          <w:rStyle w:val="Marquedecommentaire"/>
+        </w:rPr>
+        <w:annotationRef/>
+      </w:r>
+      <w:r>
+        <w:rPr>
+          <w:sz w:val="20"/>
+          <w:szCs w:val="20"/>
+        </w:rPr>
+        <w:t>Of each agent and their neighbor? Generally how do we encode the transmission during travel and travel itself?</w:t>
+      </w:r>
+    </w:p>
+  </w:comment>
+  <w:comment w:id="14" w:author="Alexis Grangier" w:date="2026-04-13T19:53:00Z" w:initials="AG">
+    <w:p>
+      <w:r>
+        <w:rPr>
+          <w:rStyle w:val="Marquedecommentaire"/>
+        </w:rPr>
+        <w:annotationRef/>
+      </w:r>
+      <w:r>
+        <w:rPr>
+          <w:sz w:val="20"/>
+          <w:szCs w:val="20"/>
+        </w:rPr>
+        <w:t>also agent interactions I think?</w:t>
+      </w:r>
+    </w:p>
+  </w:comment>
+  <w:comment w:id="15" w:author="Alexis Grangier" w:date="2026-04-13T19:53:00Z" w:initials="AG">
+    <w:p>
+      <w:r>
+        <w:rPr>
+          <w:rStyle w:val="Marquedecommentaire"/>
+        </w:rPr>
+        <w:annotationRef/>
+      </w:r>
+      <w:r>
+        <w:rPr>
+          <w:sz w:val="20"/>
+          <w:szCs w:val="20"/>
+        </w:rPr>
+        <w:t>unsure what is meant</w:t>
+      </w:r>
+    </w:p>
+  </w:comment>
+  <w:comment w:id="16" w:author="Alexis Grangier" w:date="2026-04-13T19:54:00Z" w:initials="AG">
+    <w:p>
+      <w:r>
+        <w:rPr>
+          <w:rStyle w:val="Marquedecommentaire"/>
+        </w:rPr>
+        <w:annotationRef/>
+      </w:r>
+      <w:r>
+        <w:rPr>
+          <w:sz w:val="20"/>
+          <w:szCs w:val="20"/>
+        </w:rPr>
+        <w:t>after every day of being symptomatic*</w:t>
       </w:r>
     </w:p>
   </w:comment>
@@ -5276,28 +5941,67 @@
 
 <file path=word/commentsExtended.xml><?xml version="1.0" encoding="utf-8"?>
 <w15:commentsEx xmlns:wpc="http://schemas.microsoft.com/office/word/2010/wordprocessingCanvas" xmlns:cx="http://schemas.microsoft.com/office/drawing/2014/chartex" xmlns:cx1="http://schemas.microsoft.com/office/drawing/2015/9/8/chartex" xmlns:cx2="http://schemas.microsoft.com/office/drawing/2015/10/21/chartex" xmlns:cx3="http://schemas.microsoft.com/office/drawing/2016/5/9/chartex" xmlns:cx4="http://schemas.microsoft.com/office/drawing/2016/5/10/chartex" xmlns:cx5="http://schemas.microsoft.com/office/drawing/2016/5/11/chartex" xmlns:cx6="http://schemas.microsoft.com/office/drawing/2016/5/12/chartex" xmlns:cx7="http://schemas.microsoft.com/office/drawing/2016/5/13/chartex" xmlns:cx8="http://schemas.microsoft.com/office/drawing/2016/5/14/chartex" xmlns:mc="http://schemas.openxmlformats.org/markup-compatibility/2006" xmlns:aink="http://schemas.microsoft.com/office/drawing/2016/ink" xmlns:am3d="http://schemas.microsoft.com/office/drawing/2017/model3d" xmlns:o="urn:schemas-microsoft-com:office:office" xmlns:oel="http://schemas.microsoft.com/office/2019/extlst" xmlns:r="http://schemas.openxmlformats.org/officeDocument/2006/relationships" xmlns:m="http://schemas.openxmlformats.org/officeDocument/2006/math" xmlns:v="urn:schemas-microsoft-com:vml" xmlns:wp14="http://schemas.microsoft.com/office/word/2010/wordprocessingDrawing" xmlns:wp="http://schemas.openxmlformats.org/drawingml/2006/wordprocessingDrawing" xmlns:w10="urn:schemas-microsoft-com:office:word" xmlns:w="http://schemas.openxmlformats.org/wordprocessingml/2006/main" xmlns:w14="http://schemas.microsoft.com/office/word/2010/wordml" xmlns:w15="http://schemas.microsoft.com/office/word/2012/wordml" xmlns:w16cex="http://schemas.microsoft.com/office/word/2018/wordml/cex" xmlns:w16cid="http://schemas.microsoft.com/office/word/2016/wordml/cid" xmlns:w16="http://schemas.microsoft.com/office/word/2018/wordml" xmlns:w16du="http://schemas.microsoft.com/office/word/2023/wordml/word16du" xmlns:w16sdtdh="http://schemas.microsoft.com/office/word/2020/wordml/sdtdatahash" xmlns:w16sdtfl="http://schemas.microsoft.com/office/word/2024/wordml/sdtformatlock" xmlns:w16se="http://schemas.microsoft.com/office/word/2015/wordml/symex" xmlns:wpg="http://schemas.microsoft.com/office/word/2010/wordprocessingGroup" xmlns:wpi="http://schemas.microsoft.com/office/word/2010/wordprocessingInk" xmlns:wne="http://schemas.microsoft.com/office/word/2006/wordml" xmlns:wps="http://schemas.microsoft.com/office/word/2010/wordprocessingShape" mc:Ignorable="w14 w15 w16se w16cid w16 w16cex w16sdtdh w16sdtfl w16du wp14">
+  <w15:commentEx w15:paraId="3214080D" w15:done="0"/>
+  <w15:commentEx w15:paraId="060CF535" w15:done="0"/>
   <w15:commentEx w15:paraId="01079486" w15:done="0"/>
   <w15:commentEx w15:paraId="35037620" w15:done="0"/>
-  <w15:commentEx w15:paraId="73676C74" w15:done="0"/>
+  <w15:commentEx w15:paraId="2ED68C50" w15:done="0"/>
+  <w15:commentEx w15:paraId="454A8BE4" w15:done="0"/>
   <w15:commentEx w15:paraId="641E359B" w15:done="0"/>
+  <w15:commentEx w15:paraId="3B5664FE" w15:done="0"/>
+  <w15:commentEx w15:paraId="535D2C67" w15:done="0"/>
+  <w15:commentEx w15:paraId="375F4284" w15:done="0"/>
+  <w15:commentEx w15:paraId="26483AF7" w15:done="0"/>
+  <w15:commentEx w15:paraId="6323A65D" w15:done="0"/>
+  <w15:commentEx w15:paraId="2CE6AE86" w15:done="0"/>
+  <w15:commentEx w15:paraId="75115699" w15:done="0"/>
+  <w15:commentEx w15:paraId="19A09BFF" w15:done="0"/>
+  <w15:commentEx w15:paraId="215A506A" w15:done="0"/>
+  <w15:commentEx w15:paraId="352ABF8B" w15:done="0"/>
 </w15:commentsEx>
 </file>
 
 <file path=word/commentsExtensible.xml><?xml version="1.0" encoding="utf-8"?>
 <w16cex:commentsExtensible xmlns:wpc="http://schemas.microsoft.com/office/word/2010/wordprocessingCanvas" xmlns:cx="http://schemas.microsoft.com/office/drawing/2014/chartex" xmlns:cx1="http://schemas.microsoft.com/office/drawing/2015/9/8/chartex" xmlns:cx2="http://schemas.microsoft.com/office/drawing/2015/10/21/chartex" xmlns:cx3="http://schemas.microsoft.com/office/drawing/2016/5/9/chartex" xmlns:cx4="http://schemas.microsoft.com/office/drawing/2016/5/10/chartex" xmlns:cx5="http://schemas.microsoft.com/office/drawing/2016/5/11/chartex" xmlns:cx6="http://schemas.microsoft.com/office/drawing/2016/5/12/chartex" xmlns:cx7="http://schemas.microsoft.com/office/drawing/2016/5/13/chartex" xmlns:cx8="http://schemas.microsoft.com/office/drawing/2016/5/14/chartex" xmlns:cr="http://schemas.microsoft.com/office/comments/2020/reactions" xmlns:mc="http://schemas.openxmlformats.org/markup-compatibility/2006" xmlns:aink="http://schemas.microsoft.com/office/drawing/2016/ink" xmlns:am3d="http://schemas.microsoft.com/office/drawing/2017/model3d" xmlns:o="urn:schemas-microsoft-com:office:office" xmlns:oel="http://schemas.microsoft.com/office/2019/extlst" xmlns:r="http://schemas.openxmlformats.org/officeDocument/2006/relationships" xmlns:m="http://schemas.openxmlformats.org/officeDocument/2006/math" xmlns:v="urn:schemas-microsoft-com:vml" xmlns:wp14="http://schemas.microsoft.com/office/word/2010/wordprocessingDrawing" xmlns:wp="http://schemas.openxmlformats.org/drawingml/2006/wordprocessingDrawing" xmlns:w10="urn:schemas-microsoft-com:office:word" xmlns:w="http://schemas.openxmlformats.org/wordprocessingml/2006/main" xmlns:w14="http://schemas.microsoft.com/office/word/2010/wordml" xmlns:w15="http://schemas.microsoft.com/office/word/2012/wordml" xmlns:w16cex="http://schemas.microsoft.com/office/word/2018/wordml/cex" xmlns:w16cid="http://schemas.microsoft.com/office/word/2016/wordml/cid" xmlns:w16="http://schemas.microsoft.com/office/word/2018/wordml" xmlns:w16du="http://schemas.microsoft.com/office/word/2023/wordml/word16du" xmlns:w16sdtdh="http://schemas.microsoft.com/office/word/2020/wordml/sdtdatahash" xmlns:w16sdtfl="http://schemas.microsoft.com/office/word/2024/wordml/sdtformatlock" xmlns:w16se="http://schemas.microsoft.com/office/word/2015/wordml/symex" xmlns:wpg="http://schemas.microsoft.com/office/word/2010/wordprocessingGroup" xmlns:wpi="http://schemas.microsoft.com/office/word/2010/wordprocessingInk" xmlns:wne="http://schemas.microsoft.com/office/word/2006/wordml" xmlns:wps="http://schemas.microsoft.com/office/word/2010/wordprocessingShape" mc:Ignorable="w14 w15 w16se w16cid w16 w16cex w16sdtdh w16sdtfl cr w16du wp14">
+  <w16cex:commentExtensible w16cex:durableId="4C68F283" w16cex:dateUtc="2026-04-13T17:29:00Z"/>
+  <w16cex:commentExtensible w16cex:durableId="5EAB1A42" w16cex:dateUtc="2026-04-13T17:33:00Z"/>
   <w16cex:commentExtensible w16cex:durableId="566B5B3D" w16cex:dateUtc="2026-04-07T10:30:00Z"/>
   <w16cex:commentExtensible w16cex:durableId="03B0B49A" w16cex:dateUtc="2026-04-07T10:31:00Z"/>
-  <w16cex:commentExtensible w16cex:durableId="1AEA08F4" w16cex:dateUtc="2026-04-07T10:39:00Z"/>
+  <w16cex:commentExtensible w16cex:durableId="6400609A" w16cex:dateUtc="2026-04-13T17:37:00Z"/>
+  <w16cex:commentExtensible w16cex:durableId="143CB721" w16cex:dateUtc="2026-04-13T17:42:00Z"/>
   <w16cex:commentExtensible w16cex:durableId="14CFCE6B" w16cex:dateUtc="2026-04-11T14:19:00Z"/>
+  <w16cex:commentExtensible w16cex:durableId="656995A6" w16cex:dateUtc="2026-04-13T17:44:00Z"/>
+  <w16cex:commentExtensible w16cex:durableId="588F5311" w16cex:dateUtc="2026-04-13T17:45:00Z"/>
+  <w16cex:commentExtensible w16cex:durableId="342A05AD" w16cex:dateUtc="2026-04-13T17:46:00Z"/>
+  <w16cex:commentExtensible w16cex:durableId="07D2EA1B" w16cex:dateUtc="2026-04-13T17:47:00Z"/>
+  <w16cex:commentExtensible w16cex:durableId="3CB2CB0D" w16cex:dateUtc="2026-04-13T17:49:00Z"/>
+  <w16cex:commentExtensible w16cex:durableId="363AF066" w16cex:dateUtc="2026-04-13T17:49:00Z"/>
+  <w16cex:commentExtensible w16cex:durableId="6BAE187A" w16cex:dateUtc="2026-04-13T17:52:00Z"/>
+  <w16cex:commentExtensible w16cex:durableId="55AF669D" w16cex:dateUtc="2026-04-13T17:53:00Z"/>
+  <w16cex:commentExtensible w16cex:durableId="0F24696A" w16cex:dateUtc="2026-04-13T17:53:00Z"/>
+  <w16cex:commentExtensible w16cex:durableId="1BEC3AFC" w16cex:dateUtc="2026-04-13T17:54:00Z"/>
 </w16cex:commentsExtensible>
 </file>
 
 <file path=word/commentsIds.xml><?xml version="1.0" encoding="utf-8"?>
 <w16cid:commentsIds xmlns:wpc="http://schemas.microsoft.com/office/word/2010/wordprocessingCanvas" xmlns:cx="http://schemas.microsoft.com/office/drawing/2014/chartex" xmlns:cx1="http://schemas.microsoft.com/office/drawing/2015/9/8/chartex" xmlns:cx2="http://schemas.microsoft.com/office/drawing/2015/10/21/chartex" xmlns:cx3="http://schemas.microsoft.com/office/drawing/2016/5/9/chartex" xmlns:cx4="http://schemas.microsoft.com/office/drawing/2016/5/10/chartex" xmlns:cx5="http://schemas.microsoft.com/office/drawing/2016/5/11/chartex" xmlns:cx6="http://schemas.microsoft.com/office/drawing/2016/5/12/chartex" xmlns:cx7="http://schemas.microsoft.com/office/drawing/2016/5/13/chartex" xmlns:cx8="http://schemas.microsoft.com/office/drawing/2016/5/14/chartex" xmlns:mc="http://schemas.openxmlformats.org/markup-compatibility/2006" xmlns:aink="http://schemas.microsoft.com/office/drawing/2016/ink" xmlns:am3d="http://schemas.microsoft.com/office/drawing/2017/model3d" xmlns:o="urn:schemas-microsoft-com:office:office" xmlns:oel="http://schemas.microsoft.com/office/2019/extlst" xmlns:r="http://schemas.openxmlformats.org/officeDocument/2006/relationships" xmlns:m="http://schemas.openxmlformats.org/officeDocument/2006/math" xmlns:v="urn:schemas-microsoft-com:vml" xmlns:wp14="http://schemas.microsoft.com/office/word/2010/wordprocessingDrawing" xmlns:wp="http://schemas.openxmlformats.org/drawingml/2006/wordprocessingDrawing" xmlns:w10="urn:schemas-microsoft-com:office:word" xmlns:w="http://schemas.openxmlformats.org/wordprocessingml/2006/main" xmlns:w14="http://schemas.microsoft.com/office/word/2010/wordml" xmlns:w15="http://schemas.microsoft.com/office/word/2012/wordml" xmlns:w16cex="http://schemas.microsoft.com/office/word/2018/wordml/cex" xmlns:w16cid="http://schemas.microsoft.com/office/word/2016/wordml/cid" xmlns:w16="http://schemas.microsoft.com/office/word/2018/wordml" xmlns:w16du="http://schemas.microsoft.com/office/word/2023/wordml/word16du" xmlns:w16sdtdh="http://schemas.microsoft.com/office/word/2020/wordml/sdtdatahash" xmlns:w16sdtfl="http://schemas.microsoft.com/office/word/2024/wordml/sdtformatlock" xmlns:w16se="http://schemas.microsoft.com/office/word/2015/wordml/symex" xmlns:wpg="http://schemas.microsoft.com/office/word/2010/wordprocessingGroup" xmlns:wpi="http://schemas.microsoft.com/office/word/2010/wordprocessingInk" xmlns:wne="http://schemas.microsoft.com/office/word/2006/wordml" xmlns:wps="http://schemas.microsoft.com/office/word/2010/wordprocessingShape" mc:Ignorable="w14 w15 w16se w16cid w16 w16cex w16sdtdh w16sdtfl w16du wp14">
+  <w16cid:commentId w16cid:paraId="3214080D" w16cid:durableId="4C68F283"/>
+  <w16cid:commentId w16cid:paraId="060CF535" w16cid:durableId="5EAB1A42"/>
   <w16cid:commentId w16cid:paraId="01079486" w16cid:durableId="566B5B3D"/>
   <w16cid:commentId w16cid:paraId="35037620" w16cid:durableId="03B0B49A"/>
-  <w16cid:commentId w16cid:paraId="73676C74" w16cid:durableId="1AEA08F4"/>
+  <w16cid:commentId w16cid:paraId="2ED68C50" w16cid:durableId="6400609A"/>
+  <w16cid:commentId w16cid:paraId="454A8BE4" w16cid:durableId="143CB721"/>
   <w16cid:commentId w16cid:paraId="641E359B" w16cid:durableId="14CFCE6B"/>
+  <w16cid:commentId w16cid:paraId="3B5664FE" w16cid:durableId="656995A6"/>
+  <w16cid:commentId w16cid:paraId="535D2C67" w16cid:durableId="588F5311"/>
+  <w16cid:commentId w16cid:paraId="375F4284" w16cid:durableId="342A05AD"/>
+  <w16cid:commentId w16cid:paraId="26483AF7" w16cid:durableId="07D2EA1B"/>
+  <w16cid:commentId w16cid:paraId="6323A65D" w16cid:durableId="3CB2CB0D"/>
+  <w16cid:commentId w16cid:paraId="2CE6AE86" w16cid:durableId="363AF066"/>
+  <w16cid:commentId w16cid:paraId="75115699" w16cid:durableId="6BAE187A"/>
+  <w16cid:commentId w16cid:paraId="19A09BFF" w16cid:durableId="55AF669D"/>
+  <w16cid:commentId w16cid:paraId="215A506A" w16cid:durableId="0F24696A"/>
+  <w16cid:commentId w16cid:paraId="352ABF8B" w16cid:durableId="1BEC3AFC"/>
 </w16cid:commentsIds>
 </file>
 
@@ -5402,7 +6106,7 @@
 <w:hdr xmlns:wpc="http://schemas.microsoft.com/office/word/2010/wordprocessingCanvas" xmlns:cx="http://schemas.microsoft.com/office/drawing/2014/chartex" xmlns:cx1="http://schemas.microsoft.com/office/drawing/2015/9/8/chartex" xmlns:cx2="http://schemas.microsoft.com/office/drawing/2015/10/21/chartex" xmlns:cx3="http://schemas.microsoft.com/office/drawing/2016/5/9/chartex" xmlns:cx4="http://schemas.microsoft.com/office/drawing/2016/5/10/chartex" xmlns:cx5="http://schemas.microsoft.com/office/drawing/2016/5/11/chartex" xmlns:cx6="http://schemas.microsoft.com/office/drawing/2016/5/12/chartex" xmlns:cx7="http://schemas.microsoft.com/office/drawing/2016/5/13/chartex" xmlns:cx8="http://schemas.microsoft.com/office/drawing/2016/5/14/chartex" xmlns:mc="http://schemas.openxmlformats.org/markup-compatibility/2006" xmlns:aink="http://schemas.microsoft.com/office/drawing/2016/ink" xmlns:am3d="http://schemas.microsoft.com/office/drawing/2017/model3d" xmlns:o="urn:schemas-microsoft-com:office:office" xmlns:oel="http://schemas.microsoft.com/office/2019/extlst" xmlns:r="http://schemas.openxmlformats.org/officeDocument/2006/relationships" xmlns:m="http://schemas.openxmlformats.org/officeDocument/2006/math" xmlns:v="urn:schemas-microsoft-com:vml" xmlns:wp14="http://schemas.microsoft.com/office/word/2010/wordprocessingDrawing" xmlns:wp="http://schemas.openxmlformats.org/drawingml/2006/wordprocessingDrawing" xmlns:w10="urn:schemas-microsoft-com:office:word" xmlns:w="http://schemas.openxmlformats.org/wordprocessingml/2006/main" xmlns:w14="http://schemas.microsoft.com/office/word/2010/wordml" xmlns:w15="http://schemas.microsoft.com/office/word/2012/wordml" xmlns:w16cex="http://schemas.microsoft.com/office/word/2018/wordml/cex" xmlns:w16cid="http://schemas.microsoft.com/office/word/2016/wordml/cid" xmlns:w16="http://schemas.microsoft.com/office/word/2018/wordml" xmlns:w16du="http://schemas.microsoft.com/office/word/2023/wordml/word16du" xmlns:w16sdtdh="http://schemas.microsoft.com/office/word/2020/wordml/sdtdatahash" xmlns:w16sdtfl="http://schemas.microsoft.com/office/word/2024/wordml/sdtformatlock" xmlns:w16se="http://schemas.microsoft.com/office/word/2015/wordml/symex" xmlns:wpg="http://schemas.microsoft.com/office/word/2010/wordprocessingGroup" xmlns:wpi="http://schemas.microsoft.com/office/word/2010/wordprocessingInk" xmlns:wne="http://schemas.microsoft.com/office/word/2006/wordml" xmlns:wps="http://schemas.microsoft.com/office/word/2010/wordprocessingShape" mc:Ignorable="w14 w15 w16se w16cid w16 w16cex w16sdtdh w16sdtfl w16du wp14">
   <w:p>
     <w:pPr>
-      <w:pStyle w:val="Nagwek"/>
+      <w:pStyle w:val="En-tte"/>
       <w:rPr>
         <w:rFonts w:ascii="Times New Roman" w:hAnsi="Times New Roman" w:cs="Times New Roman"/>
       </w:rPr>
@@ -5422,7 +6126,7 @@
   </w:p>
   <w:p>
     <w:pPr>
-      <w:pStyle w:val="Nagwek"/>
+      <w:pStyle w:val="En-tte"/>
       <w:rPr>
         <w:rFonts w:ascii="Times New Roman" w:hAnsi="Times New Roman" w:cs="Times New Roman"/>
       </w:rPr>
@@ -6196,11 +6900,11 @@
     <w:lsdException w:name="Unresolved Mention" w:semiHidden="1" w:unhideWhenUsed="1"/>
     <w:lsdException w:name="Smart Link" w:semiHidden="1" w:unhideWhenUsed="1"/>
   </w:latentStyles>
-  <w:style w:type="paragraph" w:default="1" w:styleId="Normalny">
+  <w:style w:type="paragraph" w:default="1" w:styleId="Normal">
     <w:name w:val="Normal"/>
     <w:qFormat/>
   </w:style>
-  <w:style w:type="paragraph" w:styleId="Nagwek1">
+  <w:style w:type="paragraph" w:styleId="Titre1">
     <w:name w:val="heading 1"/>
     <w:uiPriority w:val="9"/>
     <w:qFormat/>
@@ -6215,7 +6919,7 @@
       <w:szCs w:val="32"/>
     </w:rPr>
   </w:style>
-  <w:style w:type="paragraph" w:styleId="Nagwek2">
+  <w:style w:type="paragraph" w:styleId="Titre2">
     <w:name w:val="heading 2"/>
     <w:uiPriority w:val="9"/>
     <w:unhideWhenUsed/>
@@ -6231,7 +6935,7 @@
       <w:szCs w:val="26"/>
     </w:rPr>
   </w:style>
-  <w:style w:type="paragraph" w:styleId="Nagwek3">
+  <w:style w:type="paragraph" w:styleId="Titre3">
     <w:name w:val="heading 3"/>
     <w:uiPriority w:val="9"/>
     <w:semiHidden/>
@@ -6246,7 +6950,7 @@
       <w:szCs w:val="24"/>
     </w:rPr>
   </w:style>
-  <w:style w:type="paragraph" w:styleId="Nagwek4">
+  <w:style w:type="paragraph" w:styleId="Titre4">
     <w:name w:val="heading 4"/>
     <w:uiPriority w:val="9"/>
     <w:semiHidden/>
@@ -6261,7 +6965,7 @@
       <w:color w:val="2E74B5"/>
     </w:rPr>
   </w:style>
-  <w:style w:type="paragraph" w:styleId="Nagwek5">
+  <w:style w:type="paragraph" w:styleId="Titre5">
     <w:name w:val="heading 5"/>
     <w:uiPriority w:val="9"/>
     <w:semiHidden/>
@@ -6274,7 +6978,7 @@
       <w:color w:val="2E74B5"/>
     </w:rPr>
   </w:style>
-  <w:style w:type="paragraph" w:styleId="Nagwek6">
+  <w:style w:type="paragraph" w:styleId="Titre6">
     <w:name w:val="heading 6"/>
     <w:uiPriority w:val="9"/>
     <w:semiHidden/>
@@ -6287,13 +6991,13 @@
       <w:color w:val="1F4D78"/>
     </w:rPr>
   </w:style>
-  <w:style w:type="character" w:default="1" w:styleId="Domylnaczcionkaakapitu">
+  <w:style w:type="character" w:default="1" w:styleId="Policepardfaut">
     <w:name w:val="Default Paragraph Font"/>
     <w:uiPriority w:val="1"/>
     <w:semiHidden/>
     <w:unhideWhenUsed/>
   </w:style>
-  <w:style w:type="table" w:default="1" w:styleId="Standardowy">
+  <w:style w:type="table" w:default="1" w:styleId="TableauNormal">
     <w:name w:val="Normal Table"/>
     <w:uiPriority w:val="99"/>
     <w:semiHidden/>
@@ -6308,13 +7012,13 @@
       </w:tblCellMar>
     </w:tblPr>
   </w:style>
-  <w:style w:type="numbering" w:default="1" w:styleId="Bezlisty">
+  <w:style w:type="numbering" w:default="1" w:styleId="Aucuneliste">
     <w:name w:val="No List"/>
     <w:uiPriority w:val="99"/>
     <w:semiHidden/>
     <w:unhideWhenUsed/>
   </w:style>
-  <w:style w:type="paragraph" w:styleId="Tytu">
+  <w:style w:type="paragraph" w:styleId="Titre">
     <w:name w:val="Title"/>
     <w:uiPriority w:val="10"/>
     <w:qFormat/>
@@ -6331,11 +7035,11 @@
       <w:bCs/>
     </w:rPr>
   </w:style>
-  <w:style w:type="paragraph" w:styleId="Akapitzlist">
+  <w:style w:type="paragraph" w:styleId="Paragraphedeliste">
     <w:name w:val="List Paragraph"/>
     <w:qFormat/>
   </w:style>
-  <w:style w:type="character" w:styleId="Hipercze">
+  <w:style w:type="character" w:styleId="Lienhypertexte">
     <w:name w:val="Hyperlink"/>
     <w:uiPriority w:val="99"/>
     <w:unhideWhenUsed/>
@@ -6344,7 +7048,7 @@
       <w:u w:val="single"/>
     </w:rPr>
   </w:style>
-  <w:style w:type="character" w:styleId="Odwoanieprzypisudolnego">
+  <w:style w:type="character" w:styleId="Appelnotedebasdep">
     <w:name w:val="footnote reference"/>
     <w:uiPriority w:val="99"/>
     <w:semiHidden/>
@@ -6353,9 +7057,9 @@
       <w:vertAlign w:val="superscript"/>
     </w:rPr>
   </w:style>
-  <w:style w:type="paragraph" w:styleId="Tekstprzypisudolnego">
+  <w:style w:type="paragraph" w:styleId="Notedebasdepage">
     <w:name w:val="footnote text"/>
-    <w:link w:val="TekstprzypisudolnegoZnak"/>
+    <w:link w:val="NotedebasdepageCar"/>
     <w:uiPriority w:val="99"/>
     <w:semiHidden/>
     <w:unhideWhenUsed/>
@@ -6364,9 +7068,9 @@
       <w:szCs w:val="20"/>
     </w:rPr>
   </w:style>
-  <w:style w:type="character" w:customStyle="1" w:styleId="TekstprzypisudolnegoZnak">
-    <w:name w:val="Tekst przypisu dolnego Znak"/>
-    <w:link w:val="Tekstprzypisudolnego"/>
+  <w:style w:type="character" w:customStyle="1" w:styleId="NotedebasdepageCar">
+    <w:name w:val="Note de bas de page Car"/>
+    <w:link w:val="Notedebasdepage"/>
     <w:uiPriority w:val="99"/>
     <w:semiHidden/>
     <w:unhideWhenUsed/>
@@ -6375,7 +7079,7 @@
       <w:szCs w:val="20"/>
     </w:rPr>
   </w:style>
-  <w:style w:type="character" w:styleId="Odwoanieprzypisukocowego">
+  <w:style w:type="character" w:styleId="Appeldenotedefin">
     <w:name w:val="endnote reference"/>
     <w:uiPriority w:val="99"/>
     <w:semiHidden/>
@@ -6384,9 +7088,9 @@
       <w:vertAlign w:val="superscript"/>
     </w:rPr>
   </w:style>
-  <w:style w:type="paragraph" w:styleId="Tekstprzypisukocowego">
+  <w:style w:type="paragraph" w:styleId="Notedefin">
     <w:name w:val="endnote text"/>
-    <w:link w:val="TekstprzypisukocowegoZnak"/>
+    <w:link w:val="NotedefinCar"/>
     <w:uiPriority w:val="99"/>
     <w:semiHidden/>
     <w:unhideWhenUsed/>
@@ -6395,9 +7099,9 @@
       <w:szCs w:val="20"/>
     </w:rPr>
   </w:style>
-  <w:style w:type="character" w:customStyle="1" w:styleId="TekstprzypisukocowegoZnak">
-    <w:name w:val="Tekst przypisu końcowego Znak"/>
-    <w:link w:val="Tekstprzypisukocowego"/>
+  <w:style w:type="character" w:customStyle="1" w:styleId="NotedefinCar">
+    <w:name w:val="Note de fin Car"/>
+    <w:link w:val="Notedefin"/>
     <w:uiPriority w:val="99"/>
     <w:semiHidden/>
     <w:unhideWhenUsed/>
@@ -6406,10 +7110,10 @@
       <w:szCs w:val="20"/>
     </w:rPr>
   </w:style>
-  <w:style w:type="paragraph" w:styleId="Nagwek">
+  <w:style w:type="paragraph" w:styleId="En-tte">
     <w:name w:val="header"/>
-    <w:basedOn w:val="Normalny"/>
-    <w:link w:val="NagwekZnak"/>
+    <w:basedOn w:val="Normal"/>
+    <w:link w:val="En-tteCar"/>
     <w:uiPriority w:val="99"/>
     <w:unhideWhenUsed/>
     <w:rsid w:val="009D4AC7"/>
@@ -6420,17 +7124,17 @@
       </w:tabs>
     </w:pPr>
   </w:style>
-  <w:style w:type="character" w:customStyle="1" w:styleId="NagwekZnak">
-    <w:name w:val="Nagłówek Znak"/>
-    <w:basedOn w:val="Domylnaczcionkaakapitu"/>
-    <w:link w:val="Nagwek"/>
+  <w:style w:type="character" w:customStyle="1" w:styleId="En-tteCar">
+    <w:name w:val="En-tête Car"/>
+    <w:basedOn w:val="Policepardfaut"/>
+    <w:link w:val="En-tte"/>
     <w:uiPriority w:val="99"/>
     <w:rsid w:val="009D4AC7"/>
   </w:style>
-  <w:style w:type="paragraph" w:styleId="Stopka">
+  <w:style w:type="paragraph" w:styleId="Pieddepage">
     <w:name w:val="footer"/>
-    <w:basedOn w:val="Normalny"/>
-    <w:link w:val="StopkaZnak"/>
+    <w:basedOn w:val="Normal"/>
+    <w:link w:val="PieddepageCar"/>
     <w:uiPriority w:val="99"/>
     <w:unhideWhenUsed/>
     <w:rsid w:val="009D4AC7"/>
@@ -6441,16 +7145,16 @@
       </w:tabs>
     </w:pPr>
   </w:style>
-  <w:style w:type="character" w:customStyle="1" w:styleId="StopkaZnak">
-    <w:name w:val="Stopka Znak"/>
-    <w:basedOn w:val="Domylnaczcionkaakapitu"/>
-    <w:link w:val="Stopka"/>
+  <w:style w:type="character" w:customStyle="1" w:styleId="PieddepageCar">
+    <w:name w:val="Pied de page Car"/>
+    <w:basedOn w:val="Policepardfaut"/>
+    <w:link w:val="Pieddepage"/>
     <w:uiPriority w:val="99"/>
     <w:rsid w:val="009D4AC7"/>
   </w:style>
-  <w:style w:type="character" w:styleId="Odwoaniedokomentarza">
+  <w:style w:type="character" w:styleId="Marquedecommentaire">
     <w:name w:val="annotation reference"/>
-    <w:basedOn w:val="Domylnaczcionkaakapitu"/>
+    <w:basedOn w:val="Policepardfaut"/>
     <w:uiPriority w:val="99"/>
     <w:semiHidden/>
     <w:unhideWhenUsed/>
@@ -6460,10 +7164,10 @@
       <w:szCs w:val="16"/>
     </w:rPr>
   </w:style>
-  <w:style w:type="paragraph" w:styleId="Tekstkomentarza">
+  <w:style w:type="paragraph" w:styleId="Commentaire">
     <w:name w:val="annotation text"/>
-    <w:basedOn w:val="Normalny"/>
-    <w:link w:val="TekstkomentarzaZnak"/>
+    <w:basedOn w:val="Normal"/>
+    <w:link w:val="CommentaireCar"/>
     <w:uiPriority w:val="99"/>
     <w:unhideWhenUsed/>
     <w:rsid w:val="00EB7764"/>
@@ -6472,10 +7176,10 @@
       <w:szCs w:val="20"/>
     </w:rPr>
   </w:style>
-  <w:style w:type="character" w:customStyle="1" w:styleId="TekstkomentarzaZnak">
-    <w:name w:val="Tekst komentarza Znak"/>
-    <w:basedOn w:val="Domylnaczcionkaakapitu"/>
-    <w:link w:val="Tekstkomentarza"/>
+  <w:style w:type="character" w:customStyle="1" w:styleId="CommentaireCar">
+    <w:name w:val="Commentaire Car"/>
+    <w:basedOn w:val="Policepardfaut"/>
+    <w:link w:val="Commentaire"/>
     <w:uiPriority w:val="99"/>
     <w:rsid w:val="00EB7764"/>
     <w:rPr>
@@ -6483,11 +7187,11 @@
       <w:szCs w:val="20"/>
     </w:rPr>
   </w:style>
-  <w:style w:type="paragraph" w:styleId="Tematkomentarza">
+  <w:style w:type="paragraph" w:styleId="Objetducommentaire">
     <w:name w:val="annotation subject"/>
-    <w:basedOn w:val="Tekstkomentarza"/>
-    <w:next w:val="Tekstkomentarza"/>
-    <w:link w:val="TematkomentarzaZnak"/>
+    <w:basedOn w:val="Commentaire"/>
+    <w:next w:val="Commentaire"/>
+    <w:link w:val="ObjetducommentaireCar"/>
     <w:uiPriority w:val="99"/>
     <w:semiHidden/>
     <w:unhideWhenUsed/>
@@ -6497,10 +7201,10 @@
       <w:bCs/>
     </w:rPr>
   </w:style>
-  <w:style w:type="character" w:customStyle="1" w:styleId="TematkomentarzaZnak">
-    <w:name w:val="Temat komentarza Znak"/>
-    <w:basedOn w:val="TekstkomentarzaZnak"/>
-    <w:link w:val="Tematkomentarza"/>
+  <w:style w:type="character" w:customStyle="1" w:styleId="ObjetducommentaireCar">
+    <w:name w:val="Objet du commentaire Car"/>
+    <w:basedOn w:val="CommentaireCar"/>
+    <w:link w:val="Objetducommentaire"/>
     <w:uiPriority w:val="99"/>
     <w:semiHidden/>
     <w:rsid w:val="00EB7764"/>
@@ -6511,9 +7215,9 @@
       <w:szCs w:val="20"/>
     </w:rPr>
   </w:style>
-  <w:style w:type="character" w:styleId="Nierozpoznanawzmianka">
+  <w:style w:type="character" w:styleId="Mentionnonrsolue">
     <w:name w:val="Unresolved Mention"/>
-    <w:basedOn w:val="Domylnaczcionkaakapitu"/>
+    <w:basedOn w:val="Policepardfaut"/>
     <w:uiPriority w:val="99"/>
     <w:semiHidden/>
     <w:unhideWhenUsed/>
@@ -6522,6 +7226,13 @@
       <w:color w:val="605E5C"/>
       <w:shd w:val="clear" w:color="auto" w:fill="E1DFDD"/>
     </w:rPr>
+  </w:style>
+  <w:style w:type="paragraph" w:styleId="Rvision">
+    <w:name w:val="Revision"/>
+    <w:hidden/>
+    <w:uiPriority w:val="99"/>
+    <w:semiHidden/>
+    <w:rsid w:val="00D33472"/>
   </w:style>
 </w:styles>
 </file>

</xml_diff>

<commit_message>
Finalized ODD protocol and set up initialized the model with agents, their behaviors, their attributes and the environment.
</commit_message>
<xml_diff>
--- a/analysis/ODD_protocol.docx
+++ b/analysis/ODD_protocol.docx
@@ -228,6 +228,18 @@
         </w:rPr>
         <w:t xml:space="preserve"> in an urban center</w:t>
       </w:r>
+      <w:r>
+        <w:rPr>
+          <w:rFonts w:ascii="Times New Roman" w:hAnsi="Times New Roman" w:cs="Times New Roman"/>
+          <w:i/>
+          <w:iCs/>
+          <w:color w:val="000000" w:themeColor="text1"/>
+          <w:sz w:val="28"/>
+          <w:szCs w:val="28"/>
+          <w:lang w:val="en-US"/>
+        </w:rPr>
+        <w:t xml:space="preserve"> </w:t>
+      </w:r>
     </w:p>
     <w:p>
       <w:pPr>
@@ -242,7 +254,7 @@
     </w:p>
     <w:p>
       <w:pPr>
-        <w:pStyle w:val="Nagwek1"/>
+        <w:pStyle w:val="Titre1"/>
         <w:numPr>
           <w:ilvl w:val="0"/>
           <w:numId w:val="3"/>
@@ -265,7 +277,7 @@
     </w:p>
     <w:p>
       <w:pPr>
-        <w:pStyle w:val="Nagwek2"/>
+        <w:pStyle w:val="Titre2"/>
         <w:jc w:val="both"/>
         <w:rPr>
           <w:rFonts w:ascii="Times New Roman" w:hAnsi="Times New Roman" w:cs="Times New Roman"/>
@@ -314,7 +326,33 @@
           <w:color w:val="000000" w:themeColor="text1"/>
           <w:lang w:val="en-US"/>
         </w:rPr>
-        <w:t xml:space="preserve">This model simulates the spread of an infectious agent through a heterogeneous urban environment structured around </w:t>
+        <w:t xml:space="preserve">This SEIRD </w:t>
+      </w:r>
+      <w:r>
+        <w:rPr>
+          <w:rFonts w:ascii="Times New Roman" w:hAnsi="Times New Roman" w:cs="Times New Roman"/>
+          <w:i/>
+          <w:iCs/>
+          <w:color w:val="000000" w:themeColor="text1"/>
+          <w:lang w:val="en-US"/>
+        </w:rPr>
+        <w:t>(susceptible – Exposed – Infected – Recovered – Dieseased)</w:t>
+      </w:r>
+      <w:r>
+        <w:rPr>
+          <w:rFonts w:ascii="Times New Roman" w:hAnsi="Times New Roman" w:cs="Times New Roman"/>
+          <w:color w:val="000000" w:themeColor="text1"/>
+          <w:lang w:val="en-US"/>
+        </w:rPr>
+        <w:t xml:space="preserve"> </w:t>
+      </w:r>
+      <w:r>
+        <w:rPr>
+          <w:rFonts w:ascii="Times New Roman" w:hAnsi="Times New Roman" w:cs="Times New Roman"/>
+          <w:color w:val="000000" w:themeColor="text1"/>
+          <w:lang w:val="en-US"/>
+        </w:rPr>
+        <w:t xml:space="preserve">simulates the spread of an infectious agent through a heterogeneous urban environment structured around </w:t>
       </w:r>
       <w:r>
         <w:rPr>
@@ -338,6 +376,14 @@
           <w:color w:val="000000" w:themeColor="text1"/>
           <w:lang w:val="en-US"/>
         </w:rPr>
+        <w:t xml:space="preserve"> where agents work</w:t>
+      </w:r>
+      <w:r>
+        <w:rPr>
+          <w:rFonts w:ascii="Times New Roman" w:hAnsi="Times New Roman" w:cs="Times New Roman"/>
+          <w:color w:val="000000" w:themeColor="text1"/>
+          <w:lang w:val="en-US"/>
+        </w:rPr>
         <w:t>,</w:t>
       </w:r>
       <w:r>
@@ -346,7 +392,23 @@
           <w:color w:val="000000" w:themeColor="text1"/>
           <w:lang w:val="en-US"/>
         </w:rPr>
-        <w:t xml:space="preserve"> a lower-density suburban periphery</w:t>
+        <w:t xml:space="preserve"> a lower-density suburban</w:t>
+      </w:r>
+      <w:r>
+        <w:rPr>
+          <w:rFonts w:ascii="Times New Roman" w:hAnsi="Times New Roman" w:cs="Times New Roman"/>
+          <w:color w:val="000000" w:themeColor="text1"/>
+          <w:lang w:val="en-US"/>
+        </w:rPr>
+        <w:t xml:space="preserve">, residential </w:t>
+      </w:r>
+      <w:r>
+        <w:rPr>
+          <w:rFonts w:ascii="Times New Roman" w:hAnsi="Times New Roman" w:cs="Times New Roman"/>
+          <w:color w:val="000000" w:themeColor="text1"/>
+          <w:lang w:val="en-US"/>
+        </w:rPr>
+        <w:t>periphery</w:t>
       </w:r>
       <w:r>
         <w:rPr>
@@ -386,7 +448,23 @@
           <w:color w:val="000000" w:themeColor="text1"/>
           <w:lang w:val="en-US"/>
         </w:rPr>
-        <w:t xml:space="preserve">very dense </w:t>
+        <w:t>very dense</w:t>
+      </w:r>
+      <w:r>
+        <w:rPr>
+          <w:rFonts w:ascii="Times New Roman" w:hAnsi="Times New Roman" w:cs="Times New Roman"/>
+          <w:color w:val="000000" w:themeColor="text1"/>
+          <w:lang w:val="en-US"/>
+        </w:rPr>
+        <w:t>ly populated</w:t>
+      </w:r>
+      <w:r>
+        <w:rPr>
+          <w:rFonts w:ascii="Times New Roman" w:hAnsi="Times New Roman" w:cs="Times New Roman"/>
+          <w:color w:val="000000" w:themeColor="text1"/>
+          <w:lang w:val="en-US"/>
+        </w:rPr>
+        <w:t xml:space="preserve"> </w:t>
       </w:r>
       <w:r>
         <w:rPr>
@@ -434,7 +512,23 @@
           <w:color w:val="000000" w:themeColor="text1"/>
           <w:lang w:val="en-US"/>
         </w:rPr>
-        <w:t xml:space="preserve"> over a complete year. Seasonality is introduced as a modifier of individual preferences, to mirror the contagious profile of the seasonal flu.</w:t>
+        <w:t xml:space="preserve"> over a complete year. Seasonality is introduced as a modifier of </w:t>
+      </w:r>
+      <w:r>
+        <w:rPr>
+          <w:rFonts w:ascii="Times New Roman" w:hAnsi="Times New Roman" w:cs="Times New Roman"/>
+          <w:color w:val="000000" w:themeColor="text1"/>
+          <w:lang w:val="en-US"/>
+        </w:rPr>
+        <w:t>how fast the epidemy spreads</w:t>
+      </w:r>
+      <w:r>
+        <w:rPr>
+          <w:rFonts w:ascii="Times New Roman" w:hAnsi="Times New Roman" w:cs="Times New Roman"/>
+          <w:color w:val="000000" w:themeColor="text1"/>
+          <w:lang w:val="en-US"/>
+        </w:rPr>
+        <w:t>, to mirror the contagious profile of the seasonal flu.</w:t>
       </w:r>
       <w:r>
         <w:rPr>
@@ -474,7 +568,7 @@
     </w:p>
     <w:p>
       <w:pPr>
-        <w:pStyle w:val="Akapitzlist"/>
+        <w:pStyle w:val="Paragraphedeliste"/>
         <w:numPr>
           <w:ilvl w:val="0"/>
           <w:numId w:val="2"/>
@@ -532,7 +626,7 @@
     </w:p>
     <w:p>
       <w:pPr>
-        <w:pStyle w:val="Akapitzlist"/>
+        <w:pStyle w:val="Paragraphedeliste"/>
         <w:numPr>
           <w:ilvl w:val="0"/>
           <w:numId w:val="2"/>
@@ -600,7 +694,7 @@
     </w:p>
     <w:p>
       <w:pPr>
-        <w:pStyle w:val="Nagwek2"/>
+        <w:pStyle w:val="Titre2"/>
         <w:jc w:val="both"/>
         <w:rPr>
           <w:rFonts w:ascii="Times New Roman" w:hAnsi="Times New Roman" w:cs="Times New Roman"/>
@@ -815,7 +909,7 @@
     </w:p>
     <w:tbl>
       <w:tblPr>
-        <w:tblStyle w:val="Tabela-Siatka"/>
+        <w:tblStyle w:val="Grilledutableau"/>
         <w:tblW w:w="0" w:type="auto"/>
         <w:tblLook w:val="04A0" w:firstRow="1" w:lastRow="0" w:firstColumn="1" w:lastColumn="0" w:noHBand="0" w:noVBand="1"/>
       </w:tblPr>
@@ -1192,7 +1286,7 @@
     </w:p>
     <w:p>
       <w:pPr>
-        <w:pStyle w:val="Akapitzlist"/>
+        <w:pStyle w:val="Paragraphedeliste"/>
         <w:numPr>
           <w:ilvl w:val="0"/>
           <w:numId w:val="2"/>
@@ -1213,7 +1307,7 @@
           <w:color w:val="000000" w:themeColor="text1"/>
           <w:lang w:val="en-US"/>
         </w:rPr>
-        <w:t>R</w:t>
+        <w:t>r</w:t>
       </w:r>
       <w:r>
         <w:rPr>
@@ -1246,7 +1340,7 @@
     </w:p>
     <w:p>
       <w:pPr>
-        <w:pStyle w:val="Akapitzlist"/>
+        <w:pStyle w:val="Paragraphedeliste"/>
         <w:numPr>
           <w:ilvl w:val="0"/>
           <w:numId w:val="2"/>
@@ -1267,30 +1361,48 @@
           <w:color w:val="000000" w:themeColor="text1"/>
           <w:lang w:val="en-US"/>
         </w:rPr>
-        <w:t>work_place</w:t>
-      </w:r>
-      <w:r>
-        <w:rPr>
-          <w:rFonts w:ascii="Times New Roman" w:hAnsi="Times New Roman" w:cs="Times New Roman"/>
-          <w:b/>
-          <w:bCs/>
-          <w:color w:val="000000" w:themeColor="text1"/>
-          <w:lang w:val="en-US"/>
-        </w:rPr>
-        <w:t xml:space="preserve">: </w:t>
-      </w:r>
-      <w:r>
-        <w:rPr>
-          <w:rFonts w:ascii="Times New Roman" w:hAnsi="Times New Roman" w:cs="Times New Roman"/>
-          <w:color w:val="000000" w:themeColor="text1"/>
-          <w:lang w:val="en-US"/>
-        </w:rPr>
-        <w:t>work zone assigned as a function of residence</w:t>
-      </w:r>
-    </w:p>
-    <w:p>
-      <w:pPr>
-        <w:pStyle w:val="Akapitzlist"/>
+        <w:t>work_plac</w:t>
+      </w:r>
+      <w:r>
+        <w:rPr>
+          <w:rFonts w:ascii="Times New Roman" w:hAnsi="Times New Roman" w:cs="Times New Roman"/>
+          <w:b/>
+          <w:bCs/>
+          <w:color w:val="000000" w:themeColor="text1"/>
+          <w:lang w:val="en-US"/>
+        </w:rPr>
+        <w:t>e:</w:t>
+      </w:r>
+      <w:r>
+        <w:rPr>
+          <w:rFonts w:ascii="Times New Roman" w:hAnsi="Times New Roman" w:cs="Times New Roman"/>
+          <w:b/>
+          <w:bCs/>
+          <w:color w:val="000000" w:themeColor="text1"/>
+          <w:lang w:val="en-US"/>
+        </w:rPr>
+        <w:t xml:space="preserve"> </w:t>
+      </w:r>
+      <w:r>
+        <w:rPr>
+          <w:rFonts w:ascii="Times New Roman" w:hAnsi="Times New Roman" w:cs="Times New Roman"/>
+          <w:color w:val="000000" w:themeColor="text1"/>
+          <w:lang w:val="en-US"/>
+        </w:rPr>
+        <w:t xml:space="preserve">work zone assigned </w:t>
+      </w:r>
+      <w:r>
+        <w:rPr>
+          <w:rFonts w:ascii="Times New Roman" w:hAnsi="Times New Roman" w:cs="Times New Roman"/>
+          <w:color w:val="000000" w:themeColor="text1"/>
+          <w:lang w:val="en-US"/>
+        </w:rPr>
+        <w:t>at initialization and fixed throughout</w:t>
+      </w:r>
+    </w:p>
+    <w:p>
+      <w:pPr>
+        <w:pStyle w:val="Paragraphedeliste"/>
         <w:numPr>
           <w:ilvl w:val="0"/>
           <w:numId w:val="2"/>
@@ -1334,7 +1446,7 @@
     </w:p>
     <w:p>
       <w:pPr>
-        <w:pStyle w:val="Akapitzlist"/>
+        <w:pStyle w:val="Paragraphedeliste"/>
         <w:numPr>
           <w:ilvl w:val="0"/>
           <w:numId w:val="2"/>
@@ -1386,7 +1498,7 @@
     </w:p>
     <w:p>
       <w:pPr>
-        <w:pStyle w:val="Akapitzlist"/>
+        <w:pStyle w:val="Paragraphedeliste"/>
         <w:numPr>
           <w:ilvl w:val="0"/>
           <w:numId w:val="2"/>
@@ -1407,7 +1519,27 @@
           <w:color w:val="000000" w:themeColor="text1"/>
           <w:lang w:val="en-US"/>
         </w:rPr>
-        <w:t>sensibilite_plan</w:t>
+        <w:t>sensibilit</w:t>
+      </w:r>
+      <w:r>
+        <w:rPr>
+          <w:rFonts w:ascii="Times New Roman" w:hAnsi="Times New Roman" w:cs="Times New Roman"/>
+          <w:b/>
+          <w:bCs/>
+          <w:color w:val="000000" w:themeColor="text1"/>
+          <w:lang w:val="en-US"/>
+        </w:rPr>
+        <w:t>y</w:t>
+      </w:r>
+      <w:r>
+        <w:rPr>
+          <w:rFonts w:ascii="Times New Roman" w:hAnsi="Times New Roman" w:cs="Times New Roman"/>
+          <w:b/>
+          <w:bCs/>
+          <w:color w:val="000000" w:themeColor="text1"/>
+          <w:lang w:val="en-US"/>
+        </w:rPr>
+        <w:t>_plan</w:t>
       </w:r>
       <w:r>
         <w:rPr>
@@ -1462,7 +1594,7 @@
     </w:p>
     <w:p>
       <w:pPr>
-        <w:pStyle w:val="Akapitzlist"/>
+        <w:pStyle w:val="Paragraphedeliste"/>
         <w:numPr>
           <w:ilvl w:val="0"/>
           <w:numId w:val="2"/>
@@ -1483,7 +1615,17 @@
           <w:color w:val="000000" w:themeColor="text1"/>
           <w:lang w:val="en-US"/>
         </w:rPr>
-        <w:t>declared</w:t>
+        <w:t>d</w:t>
+      </w:r>
+      <w:r>
+        <w:rPr>
+          <w:rFonts w:ascii="Times New Roman" w:hAnsi="Times New Roman" w:cs="Times New Roman"/>
+          <w:b/>
+          <w:bCs/>
+          <w:color w:val="000000" w:themeColor="text1"/>
+          <w:lang w:val="en-US"/>
+        </w:rPr>
+        <w:t>octor</w:t>
       </w:r>
       <w:r>
         <w:rPr>
@@ -1557,7 +1699,15 @@
           <w:color w:val="000000" w:themeColor="text1"/>
           <w:lang w:val="en-US"/>
         </w:rPr>
-        <w:t>when they feel symptoms</w:t>
+        <w:t xml:space="preserve">when they </w:t>
+      </w:r>
+      <w:r>
+        <w:rPr>
+          <w:rFonts w:ascii="Times New Roman" w:hAnsi="Times New Roman" w:cs="Times New Roman"/>
+          <w:color w:val="000000" w:themeColor="text1"/>
+          <w:lang w:val="en-US"/>
+        </w:rPr>
+        <w:t>are sick with symptoms</w:t>
       </w:r>
       <w:r>
         <w:rPr>
@@ -1646,39 +1796,7 @@
           <w:color w:val="000000" w:themeColor="text1"/>
           <w:lang w:val="en-US"/>
         </w:rPr>
-        <w:t>a dense periphery occupies a 15 x 20 cells; the less dense periphery occupies the rest of the environment</w:t>
-      </w:r>
-      <w:r>
-        <w:rPr>
-          <w:rFonts w:ascii="Times New Roman" w:hAnsi="Times New Roman" w:cs="Times New Roman"/>
-          <w:color w:val="000000" w:themeColor="text1"/>
-          <w:lang w:val="en-US"/>
-        </w:rPr>
-        <w:t xml:space="preserve">. Agent density is set three times higher in the </w:t>
-      </w:r>
-      <w:r>
-        <w:rPr>
-          <w:rFonts w:ascii="Times New Roman" w:hAnsi="Times New Roman" w:cs="Times New Roman"/>
-          <w:color w:val="000000" w:themeColor="text1"/>
-          <w:lang w:val="en-US"/>
-        </w:rPr>
-        <w:t>center</w:t>
-      </w:r>
-      <w:r>
-        <w:rPr>
-          <w:rFonts w:ascii="Times New Roman" w:hAnsi="Times New Roman" w:cs="Times New Roman"/>
-          <w:color w:val="000000" w:themeColor="text1"/>
-          <w:lang w:val="en-US"/>
-        </w:rPr>
-        <w:t xml:space="preserve"> than in the suburbs,</w:t>
-      </w:r>
-      <w:r>
-        <w:rPr>
-          <w:rFonts w:ascii="Times New Roman" w:hAnsi="Times New Roman" w:cs="Times New Roman"/>
-          <w:color w:val="000000" w:themeColor="text1"/>
-          <w:lang w:val="en-US"/>
-        </w:rPr>
-        <w:t xml:space="preserve"> and five times higher in the dense periphery. </w:t>
+        <w:t xml:space="preserve">a dense periphery occupies a 15 x 20 cells; the less dense periphery occupies the rest of the environment. </w:t>
       </w:r>
       <w:r>
         <w:rPr>
@@ -1760,7 +1878,7 @@
     </w:p>
     <w:p>
       <w:pPr>
-        <w:pStyle w:val="Akapitzlist"/>
+        <w:pStyle w:val="Paragraphedeliste"/>
         <w:numPr>
           <w:ilvl w:val="0"/>
           <w:numId w:val="2"/>
@@ -1856,7 +1974,7 @@
     </w:p>
     <w:p>
       <w:pPr>
-        <w:pStyle w:val="Akapitzlist"/>
+        <w:pStyle w:val="Paragraphedeliste"/>
         <w:numPr>
           <w:ilvl w:val="0"/>
           <w:numId w:val="2"/>
@@ -1880,7 +1998,7 @@
     </w:p>
     <w:p>
       <w:pPr>
-        <w:pStyle w:val="Akapitzlist"/>
+        <w:pStyle w:val="Paragraphedeliste"/>
         <w:numPr>
           <w:ilvl w:val="0"/>
           <w:numId w:val="2"/>
@@ -1904,7 +2022,7 @@
     </w:p>
     <w:p>
       <w:pPr>
-        <w:pStyle w:val="Akapitzlist"/>
+        <w:pStyle w:val="Paragraphedeliste"/>
         <w:numPr>
           <w:ilvl w:val="0"/>
           <w:numId w:val="2"/>
@@ -1992,7 +2110,7 @@
     </w:p>
     <w:p>
       <w:pPr>
-        <w:pStyle w:val="Nagwek2"/>
+        <w:pStyle w:val="Titre2"/>
         <w:jc w:val="both"/>
         <w:rPr>
           <w:rFonts w:ascii="Times New Roman" w:hAnsi="Times New Roman" w:cs="Times New Roman"/>
@@ -2065,7 +2183,39 @@
           <w:color w:val="000000" w:themeColor="text1"/>
           <w:lang w:val="en-US"/>
         </w:rPr>
-        <w:t>Each morning (the first tick, then every other tick), agents decide whether to go to work, stay home, or stay home and visit a doctor. Infections happen during commute, at work or at home (during the day) or during commute and at home (during the night). Visiting a doctor updates the count of infected individuals</w:t>
+        <w:t xml:space="preserve">Each morning (the first tick, then every other tick), </w:t>
+      </w:r>
+      <w:r>
+        <w:rPr>
+          <w:rFonts w:ascii="Times New Roman" w:hAnsi="Times New Roman" w:cs="Times New Roman"/>
+          <w:color w:val="000000" w:themeColor="text1"/>
+          <w:lang w:val="en-US"/>
+        </w:rPr>
+        <w:t>healthy and asymptomatic individuals go to work</w:t>
+      </w:r>
+      <w:r>
+        <w:rPr>
+          <w:rFonts w:ascii="Times New Roman" w:hAnsi="Times New Roman" w:cs="Times New Roman"/>
+          <w:color w:val="000000" w:themeColor="text1"/>
+          <w:lang w:val="en-US"/>
+        </w:rPr>
+        <w:t>.</w:t>
+      </w:r>
+      <w:r>
+        <w:rPr>
+          <w:rFonts w:ascii="Times New Roman" w:hAnsi="Times New Roman" w:cs="Times New Roman"/>
+          <w:color w:val="000000" w:themeColor="text1"/>
+          <w:lang w:val="en-US"/>
+        </w:rPr>
+        <w:t xml:space="preserve"> Individuals sick with symptoms decide whether to go to work, stay home, or stay home and go to the doctor (going to the doctor happens once per individual and per infection cycle).</w:t>
+      </w:r>
+      <w:r>
+        <w:rPr>
+          <w:rFonts w:ascii="Times New Roman" w:hAnsi="Times New Roman" w:cs="Times New Roman"/>
+          <w:color w:val="000000" w:themeColor="text1"/>
+          <w:lang w:val="en-US"/>
+        </w:rPr>
+        <w:t xml:space="preserve"> Visiting a doctor updates the count of infected individuals</w:t>
       </w:r>
       <w:r>
         <w:rPr>
@@ -2081,15 +2231,23 @@
           <w:color w:val="000000" w:themeColor="text1"/>
           <w:lang w:val="en-US"/>
         </w:rPr>
-        <w:t>, which triggers a government response at certain thresholds. The government tries to contain the epidemic by advertising containment measures, based on which individuals adapt their behavior</w:t>
-      </w:r>
-      <w:r>
-        <w:rPr>
-          <w:rFonts w:ascii="Times New Roman" w:hAnsi="Times New Roman" w:cs="Times New Roman"/>
-          <w:color w:val="000000" w:themeColor="text1"/>
-          <w:lang w:val="en-US"/>
-        </w:rPr>
-        <w:t xml:space="preserve">. </w:t>
+        <w:t xml:space="preserve">, which triggers a government response at certain thresholds. </w:t>
+      </w:r>
+      <w:r>
+        <w:rPr>
+          <w:rFonts w:ascii="Times New Roman" w:hAnsi="Times New Roman" w:cs="Times New Roman"/>
+          <w:color w:val="000000" w:themeColor="text1"/>
+          <w:lang w:val="en-US"/>
+        </w:rPr>
+        <w:t xml:space="preserve">Each evening, individuals at work </w:t>
+      </w:r>
+      <w:r>
+        <w:rPr>
+          <w:rFonts w:ascii="Times New Roman" w:hAnsi="Times New Roman" w:cs="Times New Roman"/>
+          <w:color w:val="000000" w:themeColor="text1"/>
+          <w:lang w:val="en-US"/>
+        </w:rPr>
+        <w:t xml:space="preserve">commute back home using the same mode of transportation as in the morning. </w:t>
       </w:r>
     </w:p>
     <w:p>
@@ -2102,10 +2260,117 @@
           <w:lang w:val="en-US"/>
         </w:rPr>
       </w:pPr>
-    </w:p>
-    <w:p>
-      <w:pPr>
-        <w:pStyle w:val="Akapitzlist"/>
+      <w:r>
+        <w:rPr>
+          <w:rFonts w:ascii="Times New Roman" w:hAnsi="Times New Roman" w:cs="Times New Roman"/>
+          <w:color w:val="000000" w:themeColor="text1"/>
+          <w:lang w:val="en-US"/>
+        </w:rPr>
+        <w:t>Every day, the government gets a report on the epidemic situation as a percentage of infected population over the last 7 days. In response, at certain thresholds, t</w:t>
+      </w:r>
+      <w:r>
+        <w:rPr>
+          <w:rFonts w:ascii="Times New Roman" w:hAnsi="Times New Roman" w:cs="Times New Roman"/>
+          <w:color w:val="000000" w:themeColor="text1"/>
+          <w:lang w:val="en-US"/>
+        </w:rPr>
+        <w:t>he government advertis</w:t>
+      </w:r>
+      <w:r>
+        <w:rPr>
+          <w:rFonts w:ascii="Times New Roman" w:hAnsi="Times New Roman" w:cs="Times New Roman"/>
+          <w:color w:val="000000" w:themeColor="text1"/>
+          <w:lang w:val="en-US"/>
+        </w:rPr>
+        <w:t>es</w:t>
+      </w:r>
+      <w:r>
+        <w:rPr>
+          <w:rFonts w:ascii="Times New Roman" w:hAnsi="Times New Roman" w:cs="Times New Roman"/>
+          <w:color w:val="000000" w:themeColor="text1"/>
+          <w:lang w:val="en-US"/>
+        </w:rPr>
+        <w:t xml:space="preserve"> containment measures, based on which individuals adapt their behavior</w:t>
+      </w:r>
+      <w:r>
+        <w:rPr>
+          <w:rFonts w:ascii="Times New Roman" w:hAnsi="Times New Roman" w:cs="Times New Roman"/>
+          <w:color w:val="000000" w:themeColor="text1"/>
+          <w:lang w:val="en-US"/>
+        </w:rPr>
+        <w:t>.</w:t>
+      </w:r>
+      <w:r>
+        <w:rPr>
+          <w:rFonts w:ascii="Times New Roman" w:hAnsi="Times New Roman" w:cs="Times New Roman"/>
+          <w:color w:val="000000" w:themeColor="text1"/>
+          <w:lang w:val="en-US"/>
+        </w:rPr>
+        <w:t xml:space="preserve"> Containment plans cannot be downgraded before two weeks</w:t>
+      </w:r>
+      <w:r>
+        <w:rPr>
+          <w:rFonts w:ascii="Times New Roman" w:hAnsi="Times New Roman" w:cs="Times New Roman"/>
+          <w:color w:val="000000" w:themeColor="text1"/>
+          <w:lang w:val="en-US"/>
+        </w:rPr>
+        <w:t xml:space="preserve"> </w:t>
+      </w:r>
+      <w:r>
+        <w:rPr>
+          <w:rFonts w:ascii="Times New Roman" w:hAnsi="Times New Roman" w:cs="Times New Roman"/>
+          <w:color w:val="000000" w:themeColor="text1"/>
+          <w:lang w:val="en-US"/>
+        </w:rPr>
+        <w:t xml:space="preserve">after implementation. </w:t>
+      </w:r>
+      <w:r>
+        <w:rPr>
+          <w:rFonts w:ascii="Times New Roman" w:hAnsi="Times New Roman" w:cs="Times New Roman"/>
+          <w:color w:val="000000" w:themeColor="text1"/>
+          <w:lang w:val="en-US"/>
+        </w:rPr>
+        <w:t>Infections happen during commute</w:t>
+      </w:r>
+      <w:r>
+        <w:rPr>
+          <w:rFonts w:ascii="Times New Roman" w:hAnsi="Times New Roman" w:cs="Times New Roman"/>
+          <w:color w:val="000000" w:themeColor="text1"/>
+          <w:lang w:val="en-US"/>
+        </w:rPr>
+        <w:t xml:space="preserve"> to and from work</w:t>
+      </w:r>
+      <w:r>
+        <w:rPr>
+          <w:rFonts w:ascii="Times New Roman" w:hAnsi="Times New Roman" w:cs="Times New Roman"/>
+          <w:color w:val="000000" w:themeColor="text1"/>
+          <w:lang w:val="en-US"/>
+        </w:rPr>
+        <w:t>, at work or at home (during the day) or during commute and at home (during the night)</w:t>
+      </w:r>
+      <w:r>
+        <w:rPr>
+          <w:rFonts w:ascii="Times New Roman" w:hAnsi="Times New Roman" w:cs="Times New Roman"/>
+          <w:color w:val="000000" w:themeColor="text1"/>
+          <w:lang w:val="en-US"/>
+        </w:rPr>
+        <w:t>, and depend on the infectiousness of disease, number of individuals within radius at work and at home, and on preferred mode of transportation.</w:t>
+      </w:r>
+    </w:p>
+    <w:p>
+      <w:pPr>
+        <w:spacing w:before="60" w:after="80"/>
+        <w:jc w:val="both"/>
+        <w:rPr>
+          <w:rFonts w:ascii="Times New Roman" w:hAnsi="Times New Roman" w:cs="Times New Roman"/>
+          <w:color w:val="000000" w:themeColor="text1"/>
+          <w:lang w:val="en-US"/>
+        </w:rPr>
+      </w:pPr>
+    </w:p>
+    <w:p>
+      <w:pPr>
+        <w:pStyle w:val="Paragraphedeliste"/>
         <w:numPr>
           <w:ilvl w:val="0"/>
           <w:numId w:val="3"/>
@@ -2227,15 +2492,79 @@
           <w:color w:val="000000" w:themeColor="text1"/>
           <w:lang w:val="en-US"/>
         </w:rPr>
-        <w:t xml:space="preserve">. The basic principle says that when the susceptible agent contacts the infected one, it gets infected </w:t>
-      </w:r>
-      <w:r>
-        <w:rPr>
-          <w:rFonts w:ascii="Times New Roman" w:hAnsi="Times New Roman" w:cs="Times New Roman"/>
-          <w:color w:val="000000" w:themeColor="text1"/>
-          <w:lang w:val="en-US"/>
-        </w:rPr>
-        <w:t>with some probability. Transmission is driven by co-location and mobility, responses are shaped by individual preferences and interventions of</w:t>
+        <w:t xml:space="preserve">. The basic principle says that when </w:t>
+      </w:r>
+      <w:r>
+        <w:rPr>
+          <w:rFonts w:ascii="Times New Roman" w:hAnsi="Times New Roman" w:cs="Times New Roman"/>
+          <w:color w:val="000000" w:themeColor="text1"/>
+          <w:lang w:val="en-US"/>
+        </w:rPr>
+        <w:t>one</w:t>
+      </w:r>
+      <w:r>
+        <w:rPr>
+          <w:rFonts w:ascii="Times New Roman" w:hAnsi="Times New Roman" w:cs="Times New Roman"/>
+          <w:color w:val="000000" w:themeColor="text1"/>
+          <w:lang w:val="en-US"/>
+        </w:rPr>
+        <w:t xml:space="preserve"> susceptible agent </w:t>
+      </w:r>
+      <w:r>
+        <w:rPr>
+          <w:rFonts w:ascii="Times New Roman" w:hAnsi="Times New Roman" w:cs="Times New Roman"/>
+          <w:color w:val="000000" w:themeColor="text1"/>
+          <w:lang w:val="en-US"/>
+        </w:rPr>
+        <w:t>is within radius of</w:t>
+      </w:r>
+      <w:r>
+        <w:rPr>
+          <w:rFonts w:ascii="Times New Roman" w:hAnsi="Times New Roman" w:cs="Times New Roman"/>
+          <w:color w:val="000000" w:themeColor="text1"/>
+          <w:lang w:val="en-US"/>
+        </w:rPr>
+        <w:t xml:space="preserve"> </w:t>
+      </w:r>
+      <w:r>
+        <w:rPr>
+          <w:rFonts w:ascii="Times New Roman" w:hAnsi="Times New Roman" w:cs="Times New Roman"/>
+          <w:color w:val="000000" w:themeColor="text1"/>
+          <w:lang w:val="en-US"/>
+        </w:rPr>
+        <w:t>an</w:t>
+      </w:r>
+      <w:r>
+        <w:rPr>
+          <w:rFonts w:ascii="Times New Roman" w:hAnsi="Times New Roman" w:cs="Times New Roman"/>
+          <w:color w:val="000000" w:themeColor="text1"/>
+          <w:lang w:val="en-US"/>
+        </w:rPr>
+        <w:t xml:space="preserve"> infected one, it gets infected </w:t>
+      </w:r>
+      <w:r>
+        <w:rPr>
+          <w:rFonts w:ascii="Times New Roman" w:hAnsi="Times New Roman" w:cs="Times New Roman"/>
+          <w:color w:val="000000" w:themeColor="text1"/>
+          <w:lang w:val="en-US"/>
+        </w:rPr>
+        <w:t xml:space="preserve">with some probability. Transmission is driven by co-location and </w:t>
+      </w:r>
+      <w:r>
+        <w:rPr>
+          <w:rFonts w:ascii="Times New Roman" w:hAnsi="Times New Roman" w:cs="Times New Roman"/>
+          <w:color w:val="000000" w:themeColor="text1"/>
+          <w:lang w:val="en-US"/>
+        </w:rPr>
+        <w:t>mobility;</w:t>
+      </w:r>
+      <w:r>
+        <w:rPr>
+          <w:rFonts w:ascii="Times New Roman" w:hAnsi="Times New Roman" w:cs="Times New Roman"/>
+          <w:color w:val="000000" w:themeColor="text1"/>
+          <w:lang w:val="en-US"/>
+        </w:rPr>
+        <w:t xml:space="preserve"> responses are shaped by individual preferences and interventions of</w:t>
       </w:r>
       <w:r>
         <w:rPr>
@@ -2429,7 +2758,23 @@
           <w:color w:val="000000" w:themeColor="text1"/>
           <w:lang w:val="en-US"/>
         </w:rPr>
-        <w:t xml:space="preserve">Agents that are infectious </w:t>
+        <w:t xml:space="preserve">Agents that are </w:t>
+      </w:r>
+      <w:r>
+        <w:rPr>
+          <w:rFonts w:ascii="Times New Roman" w:hAnsi="Times New Roman" w:cs="Times New Roman"/>
+          <w:color w:val="000000" w:themeColor="text1"/>
+          <w:lang w:val="en-US"/>
+        </w:rPr>
+        <w:t>contagious</w:t>
+      </w:r>
+      <w:r>
+        <w:rPr>
+          <w:rFonts w:ascii="Times New Roman" w:hAnsi="Times New Roman" w:cs="Times New Roman"/>
+          <w:color w:val="000000" w:themeColor="text1"/>
+          <w:lang w:val="en-US"/>
+        </w:rPr>
+        <w:t xml:space="preserve"> </w:t>
       </w:r>
       <w:r>
         <w:rPr>
@@ -2445,7 +2790,23 @@
           <w:color w:val="000000" w:themeColor="text1"/>
           <w:lang w:val="en-US"/>
         </w:rPr>
-        <w:t>asymptomatic are not aware of their possibility to infect other, while the infectious symptomatic are fully aware and can predict that they will infect others.</w:t>
+        <w:t xml:space="preserve">asymptomatic are not aware of their possibility to infect other, while the infectious symptomatic are fully aware and can predict that they </w:t>
+      </w:r>
+      <w:r>
+        <w:rPr>
+          <w:rFonts w:ascii="Times New Roman" w:hAnsi="Times New Roman" w:cs="Times New Roman"/>
+          <w:color w:val="000000" w:themeColor="text1"/>
+          <w:lang w:val="en-US"/>
+        </w:rPr>
+        <w:t>may</w:t>
+      </w:r>
+      <w:r>
+        <w:rPr>
+          <w:rFonts w:ascii="Times New Roman" w:hAnsi="Times New Roman" w:cs="Times New Roman"/>
+          <w:color w:val="000000" w:themeColor="text1"/>
+          <w:lang w:val="en-US"/>
+        </w:rPr>
+        <w:t xml:space="preserve"> infect others.</w:t>
       </w:r>
     </w:p>
     <w:p>
@@ -2542,6 +2903,7 @@
           <w:szCs w:val="26"/>
           <w:lang w:val="en-US"/>
         </w:rPr>
+        <w:lastRenderedPageBreak/>
         <w:t>4.</w:t>
       </w:r>
       <w:r>
@@ -2687,82 +3049,7 @@
           <w:color w:val="000000" w:themeColor="text1"/>
           <w:lang w:val="en-US"/>
         </w:rPr>
-        <w:lastRenderedPageBreak/>
-        <w:t xml:space="preserve">Agents form collectives based on where they live, their </w:t>
-      </w:r>
-      <w:r>
-        <w:rPr>
-          <w:rFonts w:ascii="Times New Roman" w:hAnsi="Times New Roman" w:cs="Times New Roman"/>
-          <w:color w:val="000000" w:themeColor="text1"/>
-          <w:lang w:val="en-US"/>
-        </w:rPr>
-        <w:t xml:space="preserve">residence, </w:t>
-      </w:r>
-      <w:r>
-        <w:rPr>
-          <w:rFonts w:ascii="Times New Roman" w:hAnsi="Times New Roman" w:cs="Times New Roman"/>
-          <w:color w:val="000000" w:themeColor="text1"/>
-          <w:lang w:val="en-US"/>
-        </w:rPr>
-        <w:t>workplace, and shared characteristics like transport mode. These grouping behaviors influence the epidemic dynamic, even</w:t>
-      </w:r>
-      <w:r>
-        <w:rPr>
-          <w:rFonts w:ascii="Times New Roman" w:hAnsi="Times New Roman" w:cs="Times New Roman"/>
-          <w:color w:val="000000" w:themeColor="text1"/>
-          <w:lang w:val="en-US"/>
-        </w:rPr>
-        <w:t xml:space="preserve"> though group-level behavior is nor explicitly modeled. Furthermore, information exposure varies</w:t>
-      </w:r>
-      <w:r>
-        <w:rPr>
-          <w:rFonts w:ascii="Times New Roman" w:hAnsi="Times New Roman" w:cs="Times New Roman"/>
-          <w:color w:val="000000" w:themeColor="text1"/>
-          <w:lang w:val="en-US"/>
-        </w:rPr>
-        <w:t xml:space="preserve"> </w:t>
-      </w:r>
-      <w:r>
-        <w:rPr>
-          <w:rFonts w:ascii="Times New Roman" w:hAnsi="Times New Roman" w:cs="Times New Roman"/>
-          <w:color w:val="000000" w:themeColor="text1"/>
-          <w:lang w:val="en-US"/>
-        </w:rPr>
-        <w:t>across residential areas – individuals in denser, lower-income regions will have lower responsiveness to public health campaigns.</w:t>
-      </w:r>
-      <w:commentRangeStart w:id="0"/>
-      <w:commentRangeStart w:id="1"/>
-      <w:r>
-        <w:rPr>
-          <w:rFonts w:ascii="Times New Roman" w:hAnsi="Times New Roman" w:cs="Times New Roman"/>
-          <w:color w:val="000000" w:themeColor="text1"/>
-          <w:lang w:val="en-US"/>
-        </w:rPr>
-        <w:t xml:space="preserve"> </w:t>
-      </w:r>
-      <w:commentRangeEnd w:id="0"/>
-      <w:r>
-        <w:rPr>
-          <w:rStyle w:val="Odwoaniedokomentarza"/>
-          <w:rFonts w:ascii="Times New Roman" w:hAnsi="Times New Roman" w:cs="Times New Roman"/>
-          <w:color w:val="000000" w:themeColor="text1"/>
-          <w:sz w:val="22"/>
-          <w:szCs w:val="22"/>
-          <w:lang w:val="en-US"/>
-        </w:rPr>
-        <w:commentReference w:id="0"/>
-      </w:r>
-      <w:commentRangeEnd w:id="1"/>
-      <w:r>
-        <w:rPr>
-          <w:rStyle w:val="Odwoaniedokomentarza"/>
-          <w:rFonts w:ascii="Times New Roman" w:hAnsi="Times New Roman" w:cs="Times New Roman"/>
-          <w:color w:val="000000" w:themeColor="text1"/>
-          <w:sz w:val="22"/>
-          <w:szCs w:val="22"/>
-          <w:lang w:val="en-US"/>
-        </w:rPr>
-        <w:commentReference w:id="1"/>
+        <w:t>Individuals form two groups according to where they live. Those who live in the denser periphery have lower sensibility to the government’s containment measures, to reflect asymmetry of information between socio-economic segments of society.</w:t>
       </w:r>
     </w:p>
     <w:p>
@@ -2908,7 +3195,7 @@
     </w:p>
     <w:p>
       <w:pPr>
-        <w:pStyle w:val="Akapitzlist"/>
+        <w:pStyle w:val="Paragraphedeliste"/>
         <w:numPr>
           <w:ilvl w:val="0"/>
           <w:numId w:val="3"/>
@@ -2982,15 +3269,31 @@
           <w:color w:val="000000" w:themeColor="text1"/>
           <w:lang w:val="en-US"/>
         </w:rPr>
-        <w:t xml:space="preserve">At the beginning of the simulation, agents are created and </w:t>
-      </w:r>
-      <w:r>
-        <w:rPr>
-          <w:rFonts w:ascii="Times New Roman" w:hAnsi="Times New Roman" w:cs="Times New Roman"/>
-          <w:color w:val="000000" w:themeColor="text1"/>
-          <w:lang w:val="en-US"/>
-        </w:rPr>
-        <w:t>have</w:t>
+        <w:t xml:space="preserve">At the beginning of the simulation, </w:t>
+      </w:r>
+      <w:r>
+        <w:rPr>
+          <w:rFonts w:ascii="Times New Roman" w:hAnsi="Times New Roman" w:cs="Times New Roman"/>
+          <w:color w:val="000000" w:themeColor="text1"/>
+          <w:lang w:val="en-US"/>
+        </w:rPr>
+        <w:t>individuals</w:t>
+      </w:r>
+      <w:r>
+        <w:rPr>
+          <w:rFonts w:ascii="Times New Roman" w:hAnsi="Times New Roman" w:cs="Times New Roman"/>
+          <w:color w:val="000000" w:themeColor="text1"/>
+          <w:lang w:val="en-US"/>
+        </w:rPr>
+        <w:t xml:space="preserve"> are created and </w:t>
+      </w:r>
+      <w:r>
+        <w:rPr>
+          <w:rFonts w:ascii="Times New Roman" w:hAnsi="Times New Roman" w:cs="Times New Roman"/>
+          <w:color w:val="000000" w:themeColor="text1"/>
+          <w:lang w:val="en-US"/>
+        </w:rPr>
+        <w:t>assigned</w:t>
       </w:r>
       <w:r>
         <w:rPr>
@@ -3006,17 +3309,9 @@
           <w:color w:val="000000" w:themeColor="text1"/>
           <w:lang w:val="en-US"/>
         </w:rPr>
-        <w:t xml:space="preserve"> assigned</w:t>
-      </w:r>
-      <w:r>
-        <w:rPr>
-          <w:rFonts w:ascii="Times New Roman" w:hAnsi="Times New Roman" w:cs="Times New Roman"/>
-          <w:color w:val="000000" w:themeColor="text1"/>
-          <w:lang w:val="en-US"/>
-        </w:rPr>
         <w:t xml:space="preserve">. </w:t>
       </w:r>
-      <w:commentRangeStart w:id="2"/>
+      <w:commentRangeStart w:id="0"/>
       <w:r>
         <w:rPr>
           <w:rFonts w:ascii="Times New Roman" w:hAnsi="Times New Roman" w:cs="Times New Roman"/>
@@ -3025,25 +3320,41 @@
         </w:rPr>
         <w:t xml:space="preserve">They </w:t>
       </w:r>
-      <w:commentRangeEnd w:id="2"/>
-      <w:r>
-        <w:rPr>
-          <w:rStyle w:val="Odwoaniedokomentarza"/>
+      <w:commentRangeEnd w:id="0"/>
+      <w:r>
+        <w:rPr>
+          <w:rStyle w:val="Marquedecommentaire"/>
           <w:rFonts w:ascii="Times New Roman" w:hAnsi="Times New Roman" w:cs="Times New Roman"/>
           <w:color w:val="000000" w:themeColor="text1"/>
           <w:sz w:val="22"/>
           <w:szCs w:val="22"/>
           <w:lang w:val="en-US"/>
         </w:rPr>
-        <w:commentReference w:id="2"/>
-      </w:r>
-      <w:r>
-        <w:rPr>
-          <w:rFonts w:ascii="Times New Roman" w:hAnsi="Times New Roman" w:cs="Times New Roman"/>
-          <w:color w:val="000000" w:themeColor="text1"/>
-          <w:lang w:val="en-US"/>
-        </w:rPr>
-        <w:t>are distributed across the t</w:t>
+        <w:commentReference w:id="0"/>
+      </w:r>
+      <w:r>
+        <w:rPr>
+          <w:rFonts w:ascii="Times New Roman" w:hAnsi="Times New Roman" w:cs="Times New Roman"/>
+          <w:color w:val="000000" w:themeColor="text1"/>
+          <w:lang w:val="en-US"/>
+        </w:rPr>
+        <w:t>are</w:t>
+      </w:r>
+      <w:r>
+        <w:rPr>
+          <w:rFonts w:ascii="Times New Roman" w:hAnsi="Times New Roman" w:cs="Times New Roman"/>
+          <w:color w:val="000000" w:themeColor="text1"/>
+          <w:lang w:val="en-US"/>
+        </w:rPr>
+        <w:t xml:space="preserve"> stochastically</w:t>
+      </w:r>
+      <w:r>
+        <w:rPr>
+          <w:rFonts w:ascii="Times New Roman" w:hAnsi="Times New Roman" w:cs="Times New Roman"/>
+          <w:color w:val="000000" w:themeColor="text1"/>
+          <w:lang w:val="en-US"/>
+        </w:rPr>
+        <w:t xml:space="preserve"> distributed across the t</w:t>
       </w:r>
       <w:r>
         <w:rPr>
@@ -3131,7 +3442,31 @@
           <w:color w:val="000000" w:themeColor="text1"/>
           <w:lang w:val="en-US"/>
         </w:rPr>
-        <w:t xml:space="preserve">They also carry the information about age group, transport preference, responsiveness to the public health campaigns, and the </w:t>
+        <w:t>The initialization also stochastically attaches</w:t>
+      </w:r>
+      <w:r>
+        <w:rPr>
+          <w:rFonts w:ascii="Times New Roman" w:hAnsi="Times New Roman" w:cs="Times New Roman"/>
+          <w:color w:val="000000" w:themeColor="text1"/>
+          <w:lang w:val="en-US"/>
+        </w:rPr>
+        <w:t xml:space="preserve"> information about age group, transport preference, responsiveness to the public health campaigns</w:t>
+      </w:r>
+      <w:r>
+        <w:rPr>
+          <w:rFonts w:ascii="Times New Roman" w:hAnsi="Times New Roman" w:cs="Times New Roman"/>
+          <w:color w:val="000000" w:themeColor="text1"/>
+          <w:lang w:val="en-US"/>
+        </w:rPr>
+        <w:t xml:space="preserve"> </w:t>
+      </w:r>
+      <w:r>
+        <w:rPr>
+          <w:rFonts w:ascii="Times New Roman" w:hAnsi="Times New Roman" w:cs="Times New Roman"/>
+          <w:color w:val="000000" w:themeColor="text1"/>
+          <w:lang w:val="en-US"/>
+        </w:rPr>
+        <w:t xml:space="preserve">and the </w:t>
       </w:r>
       <w:r>
         <w:rPr>
@@ -3141,7 +3476,7 @@
         </w:rPr>
         <w:t>likelihood</w:t>
       </w:r>
-      <w:commentRangeStart w:id="3"/>
+      <w:commentRangeStart w:id="1"/>
       <w:r>
         <w:rPr>
           <w:rFonts w:ascii="Times New Roman" w:hAnsi="Times New Roman" w:cs="Times New Roman"/>
@@ -3150,44 +3485,389 @@
         </w:rPr>
         <w:t xml:space="preserve"> </w:t>
       </w:r>
-      <w:commentRangeEnd w:id="3"/>
-      <w:r>
-        <w:rPr>
-          <w:rStyle w:val="Odwoaniedokomentarza"/>
+      <w:commentRangeEnd w:id="1"/>
+      <w:r>
+        <w:rPr>
+          <w:rStyle w:val="Marquedecommentaire"/>
           <w:rFonts w:ascii="Times New Roman" w:hAnsi="Times New Roman" w:cs="Times New Roman"/>
           <w:color w:val="000000" w:themeColor="text1"/>
           <w:sz w:val="22"/>
           <w:szCs w:val="22"/>
           <w:lang w:val="en-US"/>
         </w:rPr>
+        <w:commentReference w:id="1"/>
+      </w:r>
+      <w:r>
+        <w:rPr>
+          <w:rFonts w:ascii="Times New Roman" w:hAnsi="Times New Roman" w:cs="Times New Roman"/>
+          <w:color w:val="000000" w:themeColor="text1"/>
+          <w:lang w:val="en-US"/>
+        </w:rPr>
+        <w:t>of visiting a doctor in case of infection.</w:t>
+      </w:r>
+    </w:p>
+    <w:p>
+      <w:pPr>
+        <w:spacing w:before="60" w:after="80"/>
+        <w:jc w:val="both"/>
+        <w:rPr>
+          <w:rFonts w:ascii="Times New Roman" w:hAnsi="Times New Roman" w:cs="Times New Roman"/>
+          <w:color w:val="000000" w:themeColor="text1"/>
+          <w:lang w:val="en-US"/>
+        </w:rPr>
+      </w:pPr>
+      <w:r>
+        <w:rPr>
+          <w:rFonts w:ascii="Times New Roman" w:hAnsi="Times New Roman" w:cs="Times New Roman"/>
+          <w:color w:val="000000" w:themeColor="text1"/>
+          <w:lang w:val="en-US"/>
+        </w:rPr>
+        <w:t>Initial epidemic conditions are set by assigning a part of the agents to the exposed or infectious states. The majority of agents start in a susceptible state, and no agents are initially recovered. At the beginning, there is no active health recovery plan.</w:t>
+      </w:r>
+    </w:p>
+    <w:p>
+      <w:pPr>
+        <w:spacing w:before="60" w:after="80"/>
+        <w:jc w:val="both"/>
+        <w:rPr>
+          <w:rFonts w:ascii="Times New Roman" w:hAnsi="Times New Roman" w:cs="Times New Roman"/>
+          <w:b/>
+          <w:bCs/>
+          <w:color w:val="000000" w:themeColor="text1"/>
+          <w:sz w:val="26"/>
+          <w:szCs w:val="26"/>
+          <w:lang w:val="en-US"/>
+        </w:rPr>
+      </w:pPr>
+      <w:r>
+        <w:rPr>
+          <w:rFonts w:ascii="Times New Roman" w:hAnsi="Times New Roman" w:cs="Times New Roman"/>
+          <w:b/>
+          <w:bCs/>
+          <w:color w:val="000000" w:themeColor="text1"/>
+          <w:sz w:val="26"/>
+          <w:szCs w:val="26"/>
+          <w:lang w:val="en-US"/>
+        </w:rPr>
+        <w:t>6. Input data</w:t>
+      </w:r>
+    </w:p>
+    <w:p>
+      <w:pPr>
+        <w:spacing w:before="60" w:after="80"/>
+        <w:jc w:val="both"/>
+        <w:rPr>
+          <w:rFonts w:ascii="Times New Roman" w:hAnsi="Times New Roman" w:cs="Times New Roman"/>
+          <w:color w:val="000000" w:themeColor="text1"/>
+          <w:lang w:val="en-US"/>
+        </w:rPr>
+      </w:pPr>
+      <w:r>
+        <w:rPr>
+          <w:rFonts w:ascii="Times New Roman" w:hAnsi="Times New Roman" w:cs="Times New Roman"/>
+          <w:color w:val="000000" w:themeColor="text1"/>
+          <w:lang w:val="en-US"/>
+        </w:rPr>
+        <w:t>All parameters are fixed prior to simulation runs, which includes: epidemiological parameters, demographic structure and mobility patterns</w:t>
+      </w:r>
+      <w:r>
+        <w:rPr>
+          <w:rFonts w:ascii="Times New Roman" w:hAnsi="Times New Roman" w:cs="Times New Roman"/>
+          <w:color w:val="000000" w:themeColor="text1"/>
+          <w:lang w:val="en-US"/>
+        </w:rPr>
+        <w:t xml:space="preserve">. There are no real-time data streams used. All variability arises from </w:t>
+      </w:r>
+      <w:r>
+        <w:rPr>
+          <w:rFonts w:ascii="Times New Roman" w:hAnsi="Times New Roman" w:cs="Times New Roman"/>
+          <w:color w:val="000000" w:themeColor="text1"/>
+          <w:lang w:val="en-US"/>
+        </w:rPr>
+        <w:t xml:space="preserve">initial stochasticity and </w:t>
+      </w:r>
+      <w:r>
+        <w:rPr>
+          <w:rFonts w:ascii="Times New Roman" w:hAnsi="Times New Roman" w:cs="Times New Roman"/>
+          <w:color w:val="000000" w:themeColor="text1"/>
+          <w:lang w:val="en-US"/>
+        </w:rPr>
+        <w:t xml:space="preserve">agent interactions. </w:t>
+      </w:r>
+    </w:p>
+    <w:p>
+      <w:pPr>
+        <w:spacing w:before="60" w:after="80"/>
+        <w:jc w:val="both"/>
+        <w:rPr>
+          <w:rFonts w:ascii="Times New Roman" w:hAnsi="Times New Roman" w:cs="Times New Roman"/>
+          <w:b/>
+          <w:bCs/>
+          <w:color w:val="000000" w:themeColor="text1"/>
+          <w:sz w:val="26"/>
+          <w:szCs w:val="26"/>
+          <w:lang w:val="en-US"/>
+        </w:rPr>
+      </w:pPr>
+      <w:r>
+        <w:rPr>
+          <w:rFonts w:ascii="Times New Roman" w:hAnsi="Times New Roman" w:cs="Times New Roman"/>
+          <w:b/>
+          <w:bCs/>
+          <w:color w:val="000000" w:themeColor="text1"/>
+          <w:sz w:val="26"/>
+          <w:szCs w:val="26"/>
+          <w:lang w:val="en-US"/>
+        </w:rPr>
+        <w:t>7. Submodels</w:t>
+      </w:r>
+    </w:p>
+    <w:p>
+      <w:pPr>
+        <w:spacing w:before="60" w:after="80"/>
+        <w:jc w:val="both"/>
+        <w:rPr>
+          <w:rFonts w:ascii="Times New Roman" w:hAnsi="Times New Roman" w:cs="Times New Roman"/>
+          <w:b/>
+          <w:bCs/>
+          <w:color w:val="000000" w:themeColor="text1"/>
+          <w:lang w:val="en-US"/>
+        </w:rPr>
+      </w:pPr>
+      <w:r>
+        <w:rPr>
+          <w:rFonts w:ascii="Times New Roman" w:hAnsi="Times New Roman" w:cs="Times New Roman"/>
+          <w:b/>
+          <w:bCs/>
+          <w:color w:val="000000" w:themeColor="text1"/>
+          <w:lang w:val="en-US"/>
+        </w:rPr>
+        <w:t>7.1 Mobility submodel</w:t>
+      </w:r>
+    </w:p>
+    <w:p>
+      <w:pPr>
+        <w:spacing w:before="60" w:after="80"/>
+        <w:jc w:val="both"/>
+        <w:rPr>
+          <w:rFonts w:ascii="Times New Roman" w:hAnsi="Times New Roman" w:cs="Times New Roman"/>
+          <w:color w:val="000000" w:themeColor="text1"/>
+          <w:lang w:val="en-US"/>
+        </w:rPr>
+      </w:pPr>
+      <w:r>
+        <w:rPr>
+          <w:rFonts w:ascii="Times New Roman" w:hAnsi="Times New Roman" w:cs="Times New Roman"/>
+          <w:color w:val="000000" w:themeColor="text1"/>
+          <w:lang w:val="en-US"/>
+        </w:rPr>
+        <w:t xml:space="preserve">At each step, agents make a decision whether to commute based on their epidemic state and status of the health plan. People with symptoms and the ones responsive to </w:t>
+      </w:r>
+      <w:r>
+        <w:rPr>
+          <w:rFonts w:ascii="Times New Roman" w:hAnsi="Times New Roman" w:cs="Times New Roman"/>
+          <w:color w:val="000000" w:themeColor="text1"/>
+          <w:lang w:val="en-US"/>
+        </w:rPr>
+        <w:t xml:space="preserve">the </w:t>
+      </w:r>
+      <w:r>
+        <w:rPr>
+          <w:rFonts w:ascii="Times New Roman" w:hAnsi="Times New Roman" w:cs="Times New Roman"/>
+          <w:color w:val="000000" w:themeColor="text1"/>
+          <w:lang w:val="en-US"/>
+        </w:rPr>
+        <w:t xml:space="preserve">government health plan are less likely to travel to work. </w:t>
+      </w:r>
+    </w:p>
+    <w:p>
+      <w:pPr>
+        <w:spacing w:before="60" w:after="80"/>
+        <w:jc w:val="both"/>
+        <w:rPr>
+          <w:rFonts w:ascii="Times New Roman" w:hAnsi="Times New Roman" w:cs="Times New Roman"/>
+          <w:b/>
+          <w:bCs/>
+          <w:color w:val="000000" w:themeColor="text1"/>
+          <w:lang w:val="en-US"/>
+        </w:rPr>
+      </w:pPr>
+      <w:r>
+        <w:rPr>
+          <w:rFonts w:ascii="Times New Roman" w:hAnsi="Times New Roman" w:cs="Times New Roman"/>
+          <w:b/>
+          <w:bCs/>
+          <w:color w:val="000000" w:themeColor="text1"/>
+          <w:lang w:val="en-US"/>
+        </w:rPr>
+        <w:t>7.2 Transmission submodel</w:t>
+      </w:r>
+    </w:p>
+    <w:p>
+      <w:pPr>
+        <w:spacing w:before="60" w:after="80"/>
+        <w:jc w:val="both"/>
+        <w:rPr>
+          <w:rFonts w:ascii="Times New Roman" w:hAnsi="Times New Roman" w:cs="Times New Roman"/>
+          <w:color w:val="000000" w:themeColor="text1"/>
+          <w:lang w:val="en-US"/>
+        </w:rPr>
+      </w:pPr>
+      <w:r>
+        <w:rPr>
+          <w:rFonts w:ascii="Times New Roman" w:hAnsi="Times New Roman" w:cs="Times New Roman"/>
+          <w:color w:val="000000" w:themeColor="text1"/>
+          <w:lang w:val="en-US"/>
+        </w:rPr>
+        <w:t xml:space="preserve">The </w:t>
+      </w:r>
+      <w:r>
+        <w:rPr>
+          <w:rFonts w:ascii="Times New Roman" w:hAnsi="Times New Roman" w:cs="Times New Roman"/>
+          <w:color w:val="000000" w:themeColor="text1"/>
+          <w:lang w:val="en-US"/>
+        </w:rPr>
+        <w:t>likelihood</w:t>
+      </w:r>
+      <w:r>
+        <w:rPr>
+          <w:rFonts w:ascii="Times New Roman" w:hAnsi="Times New Roman" w:cs="Times New Roman"/>
+          <w:color w:val="000000" w:themeColor="text1"/>
+          <w:lang w:val="en-US"/>
+        </w:rPr>
+        <w:t xml:space="preserve"> of transmission</w:t>
+      </w:r>
+      <w:r>
+        <w:rPr>
+          <w:rFonts w:ascii="Times New Roman" w:hAnsi="Times New Roman" w:cs="Times New Roman"/>
+          <w:color w:val="000000" w:themeColor="text1"/>
+          <w:lang w:val="en-US"/>
+        </w:rPr>
+        <w:t xml:space="preserve"> is computed from infectious neighbors incorporating: transmission rate, </w:t>
+      </w:r>
+      <w:r>
+        <w:rPr>
+          <w:rFonts w:ascii="Times New Roman" w:hAnsi="Times New Roman" w:cs="Times New Roman"/>
+          <w:color w:val="000000" w:themeColor="text1"/>
+          <w:lang w:val="en-US"/>
+        </w:rPr>
+        <w:t>transport</w:t>
+      </w:r>
+      <w:commentRangeStart w:id="2"/>
+      <w:r>
+        <w:rPr>
+          <w:rFonts w:ascii="Times New Roman" w:hAnsi="Times New Roman" w:cs="Times New Roman"/>
+          <w:color w:val="000000" w:themeColor="text1"/>
+          <w:lang w:val="en-US"/>
+        </w:rPr>
+        <w:t xml:space="preserve"> multiplier</w:t>
+      </w:r>
+      <w:commentRangeEnd w:id="2"/>
+      <w:r>
+        <w:rPr>
+          <w:rStyle w:val="Marquedecommentaire"/>
+          <w:rFonts w:ascii="Times New Roman" w:hAnsi="Times New Roman" w:cs="Times New Roman"/>
+          <w:color w:val="000000" w:themeColor="text1"/>
+          <w:sz w:val="22"/>
+          <w:szCs w:val="22"/>
+          <w:lang w:val="en-US"/>
+        </w:rPr>
+        <w:commentReference w:id="2"/>
+      </w:r>
+      <w:r>
+        <w:rPr>
+          <w:rFonts w:ascii="Times New Roman" w:hAnsi="Times New Roman" w:cs="Times New Roman"/>
+          <w:color w:val="000000" w:themeColor="text1"/>
+          <w:lang w:val="en-US"/>
+        </w:rPr>
+        <w:t>,</w:t>
+      </w:r>
+      <w:r>
+        <w:rPr>
+          <w:rFonts w:ascii="Times New Roman" w:hAnsi="Times New Roman" w:cs="Times New Roman"/>
+          <w:color w:val="000000" w:themeColor="text1"/>
+          <w:lang w:val="en-US"/>
+        </w:rPr>
+        <w:t xml:space="preserve"> and agent individual </w:t>
+      </w:r>
+      <w:r>
+        <w:rPr>
+          <w:rFonts w:ascii="Times New Roman" w:hAnsi="Times New Roman" w:cs="Times New Roman"/>
+          <w:color w:val="000000" w:themeColor="text1"/>
+          <w:lang w:val="en-US"/>
+        </w:rPr>
+        <w:t>compliance</w:t>
+      </w:r>
+      <w:r>
+        <w:rPr>
+          <w:rFonts w:ascii="Times New Roman" w:hAnsi="Times New Roman" w:cs="Times New Roman"/>
+          <w:color w:val="000000" w:themeColor="text1"/>
+          <w:lang w:val="en-US"/>
+        </w:rPr>
+        <w:t>.</w:t>
+      </w:r>
+    </w:p>
+    <w:p>
+      <w:pPr>
+        <w:spacing w:before="60" w:after="80"/>
+        <w:jc w:val="both"/>
+        <w:rPr>
+          <w:rFonts w:ascii="Times New Roman" w:hAnsi="Times New Roman" w:cs="Times New Roman"/>
+          <w:b/>
+          <w:bCs/>
+          <w:color w:val="000000" w:themeColor="text1"/>
+          <w:lang w:val="en-US"/>
+        </w:rPr>
+      </w:pPr>
+      <w:r>
+        <w:rPr>
+          <w:rFonts w:ascii="Times New Roman" w:hAnsi="Times New Roman" w:cs="Times New Roman"/>
+          <w:b/>
+          <w:bCs/>
+          <w:color w:val="000000" w:themeColor="text1"/>
+          <w:lang w:val="en-US"/>
+        </w:rPr>
+        <w:t>7.3 Disease progression submodel</w:t>
+      </w:r>
+    </w:p>
+    <w:p>
+      <w:pPr>
+        <w:spacing w:before="60" w:after="80"/>
+        <w:jc w:val="both"/>
+        <w:rPr>
+          <w:rFonts w:ascii="Times New Roman" w:hAnsi="Times New Roman" w:cs="Times New Roman"/>
+          <w:color w:val="000000" w:themeColor="text1"/>
+          <w:lang w:val="en-US"/>
+        </w:rPr>
+      </w:pPr>
+      <w:r>
+        <w:rPr>
+          <w:rFonts w:ascii="Times New Roman" w:hAnsi="Times New Roman" w:cs="Times New Roman"/>
+          <w:color w:val="000000" w:themeColor="text1"/>
+          <w:lang w:val="en-US"/>
+        </w:rPr>
+        <w:t>Transitions of agents between epidemiological states follow stochastic processes driven by agent interactions.</w:t>
+      </w:r>
+      <w:commentRangeStart w:id="3"/>
+      <w:r>
+        <w:rPr>
+          <w:rFonts w:ascii="Times New Roman" w:hAnsi="Times New Roman" w:cs="Times New Roman"/>
+          <w:color w:val="000000" w:themeColor="text1"/>
+          <w:lang w:val="en-US"/>
+        </w:rPr>
+        <w:t xml:space="preserve"> </w:t>
+      </w:r>
+      <w:commentRangeEnd w:id="3"/>
+      <w:r>
+        <w:rPr>
+          <w:rStyle w:val="Marquedecommentaire"/>
+          <w:rFonts w:ascii="Times New Roman" w:hAnsi="Times New Roman" w:cs="Times New Roman"/>
+          <w:color w:val="000000" w:themeColor="text1"/>
+          <w:sz w:val="22"/>
+          <w:szCs w:val="22"/>
+          <w:lang w:val="en-US"/>
+        </w:rPr>
         <w:commentReference w:id="3"/>
-      </w:r>
-      <w:r>
-        <w:rPr>
-          <w:rFonts w:ascii="Times New Roman" w:hAnsi="Times New Roman" w:cs="Times New Roman"/>
-          <w:color w:val="000000" w:themeColor="text1"/>
-          <w:lang w:val="en-US"/>
-        </w:rPr>
-        <w:t>of visiting a doctor in case of infection.</w:t>
-      </w:r>
-    </w:p>
-    <w:p>
-      <w:pPr>
-        <w:spacing w:before="60" w:after="80"/>
-        <w:jc w:val="both"/>
-        <w:rPr>
-          <w:rFonts w:ascii="Times New Roman" w:hAnsi="Times New Roman" w:cs="Times New Roman"/>
-          <w:color w:val="000000" w:themeColor="text1"/>
-          <w:lang w:val="en-US"/>
-        </w:rPr>
-      </w:pPr>
-      <w:r>
-        <w:rPr>
-          <w:rFonts w:ascii="Times New Roman" w:hAnsi="Times New Roman" w:cs="Times New Roman"/>
-          <w:color w:val="000000" w:themeColor="text1"/>
-          <w:lang w:val="en-US"/>
-        </w:rPr>
-        <w:t xml:space="preserve">Initial epidemic conditions are set by assigning a part of the agents to the exposed or infectious states. The majority of agents start in a susceptible state, and </w:t>
       </w:r>
       <w:commentRangeStart w:id="4"/>
       <w:commentRangeStart w:id="5"/>
@@ -3197,12 +3877,76 @@
           <w:color w:val="000000" w:themeColor="text1"/>
           <w:lang w:val="en-US"/>
         </w:rPr>
-        <w:t>no agents are initially recovered</w:t>
+        <w:t xml:space="preserve">Exposed </w:t>
+      </w:r>
+      <w:r>
+        <w:rPr>
+          <w:rFonts w:ascii="Times New Roman" w:hAnsi="Times New Roman" w:cs="Times New Roman"/>
+          <w:color w:val="000000" w:themeColor="text1"/>
+          <w:lang w:val="en-US"/>
+        </w:rPr>
+        <w:t>individuals</w:t>
+      </w:r>
+      <w:r>
+        <w:rPr>
+          <w:rFonts w:ascii="Times New Roman" w:hAnsi="Times New Roman" w:cs="Times New Roman"/>
+          <w:color w:val="000000" w:themeColor="text1"/>
+          <w:lang w:val="en-US"/>
+        </w:rPr>
+        <w:t xml:space="preserve"> are contagious and</w:t>
+      </w:r>
+      <w:r>
+        <w:rPr>
+          <w:rFonts w:ascii="Times New Roman" w:hAnsi="Times New Roman" w:cs="Times New Roman"/>
+          <w:color w:val="000000" w:themeColor="text1"/>
+          <w:lang w:val="en-US"/>
+        </w:rPr>
+        <w:t xml:space="preserve"> </w:t>
+      </w:r>
+      <w:r>
+        <w:rPr>
+          <w:rFonts w:ascii="Times New Roman" w:hAnsi="Times New Roman" w:cs="Times New Roman"/>
+          <w:color w:val="000000" w:themeColor="text1"/>
+          <w:lang w:val="en-US"/>
+        </w:rPr>
+        <w:t>become</w:t>
+      </w:r>
+      <w:r>
+        <w:rPr>
+          <w:rFonts w:ascii="Times New Roman" w:hAnsi="Times New Roman" w:cs="Times New Roman"/>
+          <w:color w:val="000000" w:themeColor="text1"/>
+          <w:lang w:val="en-US"/>
+        </w:rPr>
+        <w:t xml:space="preserve"> infected (asymptomatic or symptomatic)</w:t>
+      </w:r>
+      <w:r>
+        <w:rPr>
+          <w:rFonts w:ascii="Times New Roman" w:hAnsi="Times New Roman" w:cs="Times New Roman"/>
+          <w:color w:val="000000" w:themeColor="text1"/>
+          <w:lang w:val="en-US"/>
+        </w:rPr>
+        <w:t>. Eventually, they</w:t>
+      </w:r>
+      <w:r>
+        <w:rPr>
+          <w:rFonts w:ascii="Times New Roman" w:hAnsi="Times New Roman" w:cs="Times New Roman"/>
+          <w:color w:val="000000" w:themeColor="text1"/>
+          <w:lang w:val="en-US"/>
+        </w:rPr>
+        <w:t xml:space="preserve"> </w:t>
+      </w:r>
+      <w:r>
+        <w:rPr>
+          <w:rFonts w:ascii="Times New Roman" w:hAnsi="Times New Roman" w:cs="Times New Roman"/>
+          <w:color w:val="000000" w:themeColor="text1"/>
+          <w:lang w:val="en-US"/>
+        </w:rPr>
+        <w:t>recover</w:t>
       </w:r>
       <w:commentRangeEnd w:id="4"/>
       <w:r>
         <w:rPr>
-          <w:rStyle w:val="Odwoaniedokomentarza"/>
+          <w:rStyle w:val="Marquedecommentaire"/>
           <w:rFonts w:ascii="Times New Roman" w:hAnsi="Times New Roman" w:cs="Times New Roman"/>
           <w:color w:val="000000" w:themeColor="text1"/>
           <w:sz w:val="22"/>
@@ -3214,7 +3958,7 @@
       <w:commentRangeEnd w:id="5"/>
       <w:r>
         <w:rPr>
-          <w:rStyle w:val="Odwoaniedokomentarza"/>
+          <w:rStyle w:val="Marquedecommentaire"/>
           <w:rFonts w:ascii="Times New Roman" w:hAnsi="Times New Roman" w:cs="Times New Roman"/>
           <w:color w:val="000000" w:themeColor="text1"/>
           <w:sz w:val="22"/>
@@ -3229,7 +3973,15 @@
           <w:color w:val="000000" w:themeColor="text1"/>
           <w:lang w:val="en-US"/>
         </w:rPr>
-        <w:t>. At the beginning, there is no active health recovery plan.</w:t>
+        <w:t xml:space="preserve"> or d</w:t>
+      </w:r>
+      <w:r>
+        <w:rPr>
+          <w:rFonts w:ascii="Times New Roman" w:hAnsi="Times New Roman" w:cs="Times New Roman"/>
+          <w:color w:val="000000" w:themeColor="text1"/>
+          <w:lang w:val="en-US"/>
+        </w:rPr>
+        <w:t>ie according to the severity of the disease and age group of the individual.</w:t>
       </w:r>
     </w:p>
     <w:p>
@@ -3238,25 +3990,17 @@
         <w:jc w:val="both"/>
         <w:rPr>
           <w:rFonts w:ascii="Times New Roman" w:hAnsi="Times New Roman" w:cs="Times New Roman"/>
-          <w:b/>
-          <w:bCs/>
-          <w:color w:val="000000" w:themeColor="text1"/>
-          <w:sz w:val="26"/>
-          <w:szCs w:val="26"/>
-          <w:lang w:val="en-US"/>
-        </w:rPr>
-      </w:pPr>
-      <w:r>
-        <w:rPr>
-          <w:rFonts w:ascii="Times New Roman" w:hAnsi="Times New Roman" w:cs="Times New Roman"/>
-          <w:b/>
-          <w:bCs/>
-          <w:color w:val="000000" w:themeColor="text1"/>
-          <w:sz w:val="26"/>
-          <w:szCs w:val="26"/>
-          <w:lang w:val="en-US"/>
-        </w:rPr>
-        <w:t>6. Input data</w:t>
+          <w:color w:val="000000" w:themeColor="text1"/>
+          <w:lang w:val="en-US"/>
+        </w:rPr>
+      </w:pPr>
+      <w:r>
+        <w:rPr>
+          <w:rFonts w:ascii="Times New Roman" w:hAnsi="Times New Roman" w:cs="Times New Roman"/>
+          <w:color w:val="000000" w:themeColor="text1"/>
+          <w:lang w:val="en-US"/>
+        </w:rPr>
+        <w:t>The transmission rate of the disease is highest in Winter, like the seasonal flu in European countries.</w:t>
       </w:r>
     </w:p>
     <w:p>
@@ -3265,41 +4009,21 @@
         <w:jc w:val="both"/>
         <w:rPr>
           <w:rFonts w:ascii="Times New Roman" w:hAnsi="Times New Roman" w:cs="Times New Roman"/>
-          <w:color w:val="000000" w:themeColor="text1"/>
-          <w:lang w:val="en-US"/>
-        </w:rPr>
-      </w:pPr>
-      <w:r>
-        <w:rPr>
-          <w:rFonts w:ascii="Times New Roman" w:hAnsi="Times New Roman" w:cs="Times New Roman"/>
-          <w:color w:val="000000" w:themeColor="text1"/>
-          <w:lang w:val="en-US"/>
-        </w:rPr>
-        <w:t>All parameters are fixed prior to simulation runs, which includes: epidemiological parameters, demographic structure and mobility patterns</w:t>
-      </w:r>
-      <w:r>
-        <w:rPr>
-          <w:rFonts w:ascii="Times New Roman" w:hAnsi="Times New Roman" w:cs="Times New Roman"/>
-          <w:color w:val="000000" w:themeColor="text1"/>
-          <w:lang w:val="en-US"/>
-        </w:rPr>
-        <w:t xml:space="preserve">. There are no real-time data streams used. All variability arises from </w:t>
-      </w:r>
-      <w:r>
-        <w:rPr>
-          <w:rFonts w:ascii="Times New Roman" w:hAnsi="Times New Roman" w:cs="Times New Roman"/>
-          <w:color w:val="000000" w:themeColor="text1"/>
-          <w:lang w:val="en-US"/>
-        </w:rPr>
-        <w:t xml:space="preserve">initial stochasticity and </w:t>
-      </w:r>
-      <w:r>
-        <w:rPr>
-          <w:rFonts w:ascii="Times New Roman" w:hAnsi="Times New Roman" w:cs="Times New Roman"/>
-          <w:color w:val="000000" w:themeColor="text1"/>
-          <w:lang w:val="en-US"/>
-        </w:rPr>
-        <w:t xml:space="preserve">agent interactions. </w:t>
+          <w:b/>
+          <w:bCs/>
+          <w:color w:val="000000" w:themeColor="text1"/>
+          <w:lang w:val="en-US"/>
+        </w:rPr>
+      </w:pPr>
+      <w:r>
+        <w:rPr>
+          <w:rFonts w:ascii="Times New Roman" w:hAnsi="Times New Roman" w:cs="Times New Roman"/>
+          <w:b/>
+          <w:bCs/>
+          <w:color w:val="000000" w:themeColor="text1"/>
+          <w:lang w:val="en-US"/>
+        </w:rPr>
+        <w:t>7.4 Medical consultation and reporting submodel</w:t>
       </w:r>
     </w:p>
     <w:p>
@@ -3308,157 +4032,41 @@
         <w:jc w:val="both"/>
         <w:rPr>
           <w:rFonts w:ascii="Times New Roman" w:hAnsi="Times New Roman" w:cs="Times New Roman"/>
-          <w:b/>
-          <w:bCs/>
-          <w:color w:val="000000" w:themeColor="text1"/>
-          <w:sz w:val="26"/>
-          <w:szCs w:val="26"/>
-          <w:lang w:val="en-US"/>
-        </w:rPr>
-      </w:pPr>
-      <w:r>
-        <w:rPr>
-          <w:rFonts w:ascii="Times New Roman" w:hAnsi="Times New Roman" w:cs="Times New Roman"/>
-          <w:b/>
-          <w:bCs/>
-          <w:color w:val="000000" w:themeColor="text1"/>
-          <w:sz w:val="26"/>
-          <w:szCs w:val="26"/>
-          <w:lang w:val="en-US"/>
-        </w:rPr>
-        <w:t>7. Submodels</w:t>
-      </w:r>
-    </w:p>
-    <w:p>
-      <w:pPr>
-        <w:spacing w:before="60" w:after="80"/>
-        <w:jc w:val="both"/>
-        <w:rPr>
-          <w:rFonts w:ascii="Times New Roman" w:hAnsi="Times New Roman" w:cs="Times New Roman"/>
-          <w:b/>
-          <w:bCs/>
-          <w:color w:val="000000" w:themeColor="text1"/>
-          <w:lang w:val="en-US"/>
-        </w:rPr>
-      </w:pPr>
-      <w:r>
-        <w:rPr>
-          <w:rFonts w:ascii="Times New Roman" w:hAnsi="Times New Roman" w:cs="Times New Roman"/>
-          <w:b/>
-          <w:bCs/>
-          <w:color w:val="000000" w:themeColor="text1"/>
-          <w:lang w:val="en-US"/>
-        </w:rPr>
-        <w:t>7.1 Mobility submodel</w:t>
-      </w:r>
-    </w:p>
-    <w:p>
-      <w:pPr>
-        <w:spacing w:before="60" w:after="80"/>
-        <w:jc w:val="both"/>
-        <w:rPr>
-          <w:rFonts w:ascii="Times New Roman" w:hAnsi="Times New Roman" w:cs="Times New Roman"/>
-          <w:color w:val="000000" w:themeColor="text1"/>
-          <w:lang w:val="en-US"/>
-        </w:rPr>
-      </w:pPr>
-      <w:r>
-        <w:rPr>
-          <w:rFonts w:ascii="Times New Roman" w:hAnsi="Times New Roman" w:cs="Times New Roman"/>
-          <w:color w:val="000000" w:themeColor="text1"/>
-          <w:lang w:val="en-US"/>
-        </w:rPr>
-        <w:t xml:space="preserve">At each step, agents make a decision whether to commute based on their epidemic state and status of the health plan. People with symptoms and the ones responsive to </w:t>
-      </w:r>
-      <w:r>
-        <w:rPr>
-          <w:rFonts w:ascii="Times New Roman" w:hAnsi="Times New Roman" w:cs="Times New Roman"/>
-          <w:color w:val="000000" w:themeColor="text1"/>
-          <w:lang w:val="en-US"/>
-        </w:rPr>
-        <w:t xml:space="preserve">the </w:t>
-      </w:r>
-      <w:r>
-        <w:rPr>
-          <w:rFonts w:ascii="Times New Roman" w:hAnsi="Times New Roman" w:cs="Times New Roman"/>
-          <w:color w:val="000000" w:themeColor="text1"/>
-          <w:lang w:val="en-US"/>
-        </w:rPr>
-        <w:t xml:space="preserve">government health plan are less likely to travel to work. </w:t>
-      </w:r>
-    </w:p>
-    <w:p>
-      <w:pPr>
-        <w:spacing w:before="60" w:after="80"/>
-        <w:jc w:val="both"/>
-        <w:rPr>
-          <w:rFonts w:ascii="Times New Roman" w:hAnsi="Times New Roman" w:cs="Times New Roman"/>
-          <w:b/>
-          <w:bCs/>
-          <w:color w:val="000000" w:themeColor="text1"/>
-          <w:lang w:val="en-US"/>
-        </w:rPr>
-      </w:pPr>
-      <w:r>
-        <w:rPr>
-          <w:rFonts w:ascii="Times New Roman" w:hAnsi="Times New Roman" w:cs="Times New Roman"/>
-          <w:b/>
-          <w:bCs/>
-          <w:color w:val="000000" w:themeColor="text1"/>
-          <w:lang w:val="en-US"/>
-        </w:rPr>
-        <w:t>7.2 Transmission submodel</w:t>
-      </w:r>
-    </w:p>
-    <w:p>
-      <w:pPr>
-        <w:spacing w:before="60" w:after="80"/>
-        <w:jc w:val="both"/>
-        <w:rPr>
-          <w:rFonts w:ascii="Times New Roman" w:hAnsi="Times New Roman" w:cs="Times New Roman"/>
-          <w:color w:val="000000" w:themeColor="text1"/>
-          <w:lang w:val="en-US"/>
-        </w:rPr>
-      </w:pPr>
-      <w:r>
-        <w:rPr>
-          <w:rFonts w:ascii="Times New Roman" w:hAnsi="Times New Roman" w:cs="Times New Roman"/>
-          <w:color w:val="000000" w:themeColor="text1"/>
-          <w:lang w:val="en-US"/>
-        </w:rPr>
-        <w:t xml:space="preserve">The </w:t>
-      </w:r>
-      <w:r>
-        <w:rPr>
-          <w:rFonts w:ascii="Times New Roman" w:hAnsi="Times New Roman" w:cs="Times New Roman"/>
-          <w:color w:val="000000" w:themeColor="text1"/>
-          <w:lang w:val="en-US"/>
-        </w:rPr>
-        <w:t>likelihood</w:t>
-      </w:r>
-      <w:r>
-        <w:rPr>
-          <w:rFonts w:ascii="Times New Roman" w:hAnsi="Times New Roman" w:cs="Times New Roman"/>
-          <w:color w:val="000000" w:themeColor="text1"/>
-          <w:lang w:val="en-US"/>
-        </w:rPr>
-        <w:t xml:space="preserve"> of transmission</w:t>
-      </w:r>
-      <w:r>
-        <w:rPr>
-          <w:rFonts w:ascii="Times New Roman" w:hAnsi="Times New Roman" w:cs="Times New Roman"/>
-          <w:color w:val="000000" w:themeColor="text1"/>
-          <w:lang w:val="en-US"/>
-        </w:rPr>
-        <w:t xml:space="preserve"> is computed from infectious neighbors incorporating: transmission rate, </w:t>
-      </w:r>
-      <w:r>
-        <w:rPr>
-          <w:rFonts w:ascii="Times New Roman" w:hAnsi="Times New Roman" w:cs="Times New Roman"/>
-          <w:color w:val="000000" w:themeColor="text1"/>
-          <w:lang w:val="en-US"/>
-        </w:rPr>
-        <w:t>transport</w:t>
+          <w:color w:val="000000" w:themeColor="text1"/>
+          <w:lang w:val="en-US"/>
+        </w:rPr>
+      </w:pPr>
+      <w:r>
+        <w:rPr>
+          <w:rFonts w:ascii="Times New Roman" w:hAnsi="Times New Roman" w:cs="Times New Roman"/>
+          <w:color w:val="000000" w:themeColor="text1"/>
+          <w:lang w:val="en-US"/>
+        </w:rPr>
+        <w:t>On the first</w:t>
+      </w:r>
+      <w:r>
+        <w:rPr>
+          <w:rFonts w:ascii="Times New Roman" w:hAnsi="Times New Roman" w:cs="Times New Roman"/>
+          <w:color w:val="000000" w:themeColor="text1"/>
+          <w:lang w:val="en-US"/>
+        </w:rPr>
+        <w:t xml:space="preserve"> </w:t>
+      </w:r>
+      <w:r>
+        <w:rPr>
+          <w:rFonts w:ascii="Times New Roman" w:hAnsi="Times New Roman" w:cs="Times New Roman"/>
+          <w:color w:val="000000" w:themeColor="text1"/>
+          <w:lang w:val="en-US"/>
+        </w:rPr>
+        <w:t>morning</w:t>
+      </w:r>
+      <w:r>
+        <w:rPr>
+          <w:rFonts w:ascii="Times New Roman" w:hAnsi="Times New Roman" w:cs="Times New Roman"/>
+          <w:color w:val="000000" w:themeColor="text1"/>
+          <w:lang w:val="en-US"/>
+        </w:rPr>
+        <w:t xml:space="preserve"> of being</w:t>
       </w:r>
       <w:commentRangeStart w:id="6"/>
       <w:r>
@@ -3467,12 +4075,12 @@
           <w:color w:val="000000" w:themeColor="text1"/>
           <w:lang w:val="en-US"/>
         </w:rPr>
-        <w:t xml:space="preserve"> multiplier</w:t>
+        <w:t xml:space="preserve"> </w:t>
       </w:r>
       <w:commentRangeEnd w:id="6"/>
       <w:r>
         <w:rPr>
-          <w:rStyle w:val="Odwoaniedokomentarza"/>
+          <w:rStyle w:val="Marquedecommentaire"/>
           <w:rFonts w:ascii="Times New Roman" w:hAnsi="Times New Roman" w:cs="Times New Roman"/>
           <w:color w:val="000000" w:themeColor="text1"/>
           <w:sz w:val="22"/>
@@ -3487,6 +4095,14 @@
           <w:color w:val="000000" w:themeColor="text1"/>
           <w:lang w:val="en-US"/>
         </w:rPr>
+        <w:t>symptomatic</w:t>
+      </w:r>
+      <w:r>
+        <w:rPr>
+          <w:rFonts w:ascii="Times New Roman" w:hAnsi="Times New Roman" w:cs="Times New Roman"/>
+          <w:color w:val="000000" w:themeColor="text1"/>
+          <w:lang w:val="en-US"/>
+        </w:rPr>
         <w:t>,</w:t>
       </w:r>
       <w:r>
@@ -3495,15 +4111,57 @@
           <w:color w:val="000000" w:themeColor="text1"/>
           <w:lang w:val="en-US"/>
         </w:rPr>
-        <w:t xml:space="preserve"> and agent individual </w:t>
-      </w:r>
-      <w:r>
-        <w:rPr>
-          <w:rFonts w:ascii="Times New Roman" w:hAnsi="Times New Roman" w:cs="Times New Roman"/>
-          <w:color w:val="000000" w:themeColor="text1"/>
-          <w:lang w:val="en-US"/>
-        </w:rPr>
-        <w:t>compliance</w:t>
+        <w:t xml:space="preserve"> individuals decide whether they want to </w:t>
+      </w:r>
+      <w:r>
+        <w:rPr>
+          <w:rFonts w:ascii="Times New Roman" w:hAnsi="Times New Roman" w:cs="Times New Roman"/>
+          <w:color w:val="000000" w:themeColor="text1"/>
+          <w:lang w:val="en-US"/>
+        </w:rPr>
+        <w:t>see a doctor. Doctors always report to the government.</w:t>
+      </w:r>
+    </w:p>
+    <w:p>
+      <w:pPr>
+        <w:spacing w:before="60" w:after="80"/>
+        <w:jc w:val="both"/>
+        <w:rPr>
+          <w:rFonts w:ascii="Times New Roman" w:hAnsi="Times New Roman" w:cs="Times New Roman"/>
+          <w:b/>
+          <w:bCs/>
+          <w:color w:val="000000" w:themeColor="text1"/>
+          <w:lang w:val="en-US"/>
+        </w:rPr>
+      </w:pPr>
+      <w:r>
+        <w:rPr>
+          <w:rFonts w:ascii="Times New Roman" w:hAnsi="Times New Roman" w:cs="Times New Roman"/>
+          <w:b/>
+          <w:bCs/>
+          <w:color w:val="000000" w:themeColor="text1"/>
+          <w:lang w:val="en-US"/>
+        </w:rPr>
+        <w:t>7.5 Health policy submodel</w:t>
+      </w:r>
+    </w:p>
+    <w:p>
+      <w:pPr>
+        <w:spacing w:before="60" w:after="80"/>
+        <w:jc w:val="both"/>
+        <w:rPr>
+          <w:rFonts w:ascii="Times New Roman" w:hAnsi="Times New Roman" w:cs="Times New Roman"/>
+          <w:color w:val="000000" w:themeColor="text1"/>
+          <w:lang w:val="en-US"/>
+        </w:rPr>
+      </w:pPr>
+      <w:r>
+        <w:rPr>
+          <w:rFonts w:ascii="Times New Roman" w:hAnsi="Times New Roman" w:cs="Times New Roman"/>
+          <w:color w:val="000000" w:themeColor="text1"/>
+          <w:lang w:val="en-US"/>
+        </w:rPr>
+        <w:t>The health ministry activates</w:t>
       </w:r>
       <w:r>
         <w:rPr>
@@ -3519,88 +4177,39 @@
           <w:color w:val="000000" w:themeColor="text1"/>
           <w:lang w:val="en-US"/>
         </w:rPr>
-        <w:t>εₛ</w:t>
-      </w:r>
-      <w:r>
-        <w:rPr>
-          <w:rFonts w:ascii="Times New Roman" w:hAnsi="Times New Roman" w:cs="Times New Roman"/>
-          <w:color w:val="000000" w:themeColor="text1"/>
-          <w:lang w:val="en-US"/>
-        </w:rPr>
-        <w:t>.</w:t>
-      </w:r>
-    </w:p>
-    <w:p>
-      <w:pPr>
-        <w:spacing w:before="60" w:after="80"/>
-        <w:jc w:val="both"/>
-        <w:rPr>
-          <w:rFonts w:ascii="Times New Roman" w:hAnsi="Times New Roman" w:cs="Times New Roman"/>
-          <w:b/>
-          <w:bCs/>
-          <w:color w:val="000000" w:themeColor="text1"/>
-          <w:lang w:val="en-US"/>
-        </w:rPr>
-      </w:pPr>
-      <w:r>
-        <w:rPr>
-          <w:rFonts w:ascii="Times New Roman" w:hAnsi="Times New Roman" w:cs="Times New Roman"/>
-          <w:b/>
-          <w:bCs/>
-          <w:color w:val="000000" w:themeColor="text1"/>
-          <w:lang w:val="en-US"/>
-        </w:rPr>
-        <w:t>7.3 Disease progression submodel</w:t>
-      </w:r>
-    </w:p>
-    <w:p>
-      <w:pPr>
-        <w:spacing w:before="60" w:after="80"/>
-        <w:jc w:val="both"/>
-        <w:rPr>
-          <w:rFonts w:ascii="Times New Roman" w:hAnsi="Times New Roman" w:cs="Times New Roman"/>
-          <w:color w:val="000000" w:themeColor="text1"/>
-          <w:lang w:val="en-US"/>
-        </w:rPr>
-      </w:pPr>
-      <w:r>
-        <w:rPr>
-          <w:rFonts w:ascii="Times New Roman" w:hAnsi="Times New Roman" w:cs="Times New Roman"/>
-          <w:color w:val="000000" w:themeColor="text1"/>
-          <w:lang w:val="en-US"/>
-        </w:rPr>
-        <w:t>Transitions of agents between epidemiological states follow stochastic processes driven by agent interactions.</w:t>
-      </w:r>
-      <w:commentRangeStart w:id="7"/>
-      <w:r>
-        <w:rPr>
-          <w:rFonts w:ascii="Times New Roman" w:hAnsi="Times New Roman" w:cs="Times New Roman"/>
-          <w:color w:val="000000" w:themeColor="text1"/>
-          <w:lang w:val="en-US"/>
-        </w:rPr>
-        <w:t xml:space="preserve"> </w:t>
-      </w:r>
-      <w:commentRangeEnd w:id="7"/>
-      <w:r>
-        <w:rPr>
-          <w:rStyle w:val="Odwoaniedokomentarza"/>
-          <w:rFonts w:ascii="Times New Roman" w:hAnsi="Times New Roman" w:cs="Times New Roman"/>
-          <w:color w:val="000000" w:themeColor="text1"/>
-          <w:sz w:val="22"/>
-          <w:szCs w:val="22"/>
-          <w:lang w:val="en-US"/>
-        </w:rPr>
-        <w:commentReference w:id="7"/>
-      </w:r>
-      <w:commentRangeStart w:id="8"/>
-      <w:commentRangeStart w:id="9"/>
-      <w:r>
-        <w:rPr>
-          <w:rFonts w:ascii="Times New Roman" w:hAnsi="Times New Roman" w:cs="Times New Roman"/>
-          <w:color w:val="000000" w:themeColor="text1"/>
-          <w:lang w:val="en-US"/>
-        </w:rPr>
-        <w:t xml:space="preserve">Exposed </w:t>
+        <w:t>health policy plan</w:t>
+      </w:r>
+      <w:r>
+        <w:rPr>
+          <w:rFonts w:ascii="Times New Roman" w:hAnsi="Times New Roman" w:cs="Times New Roman"/>
+          <w:color w:val="000000" w:themeColor="text1"/>
+          <w:lang w:val="en-US"/>
+        </w:rPr>
+        <w:t>s</w:t>
+      </w:r>
+      <w:r>
+        <w:rPr>
+          <w:rFonts w:ascii="Times New Roman" w:hAnsi="Times New Roman" w:cs="Times New Roman"/>
+          <w:color w:val="000000" w:themeColor="text1"/>
+          <w:lang w:val="en-US"/>
+        </w:rPr>
+        <w:t xml:space="preserve"> after reaching the threshold of </w:t>
+      </w:r>
+      <w:r>
+        <w:rPr>
+          <w:rFonts w:ascii="Times New Roman" w:hAnsi="Times New Roman" w:cs="Times New Roman"/>
+          <w:color w:val="000000" w:themeColor="text1"/>
+          <w:lang w:val="en-US"/>
+        </w:rPr>
+        <w:t>θ</w:t>
+      </w:r>
+      <w:r>
+        <w:rPr>
+          <w:rFonts w:ascii="Times New Roman" w:hAnsi="Times New Roman" w:cs="Times New Roman"/>
+          <w:color w:val="000000" w:themeColor="text1"/>
+          <w:lang w:val="en-US"/>
+        </w:rPr>
+        <w:t xml:space="preserve"> infected </w:t>
       </w:r>
       <w:r>
         <w:rPr>
@@ -3616,232 +4225,23 @@
           <w:color w:val="000000" w:themeColor="text1"/>
           <w:lang w:val="en-US"/>
         </w:rPr>
-        <w:t xml:space="preserve"> can transmit to infected (asymptomatic or symptomatic) ones and later transmit into </w:t>
-      </w:r>
-      <w:r>
-        <w:rPr>
-          <w:rFonts w:ascii="Times New Roman" w:hAnsi="Times New Roman" w:cs="Times New Roman"/>
-          <w:color w:val="000000" w:themeColor="text1"/>
-          <w:lang w:val="en-US"/>
-        </w:rPr>
-        <w:t>recovered</w:t>
-      </w:r>
-      <w:commentRangeEnd w:id="8"/>
-      <w:r>
-        <w:rPr>
-          <w:rStyle w:val="Odwoaniedokomentarza"/>
-          <w:rFonts w:ascii="Times New Roman" w:hAnsi="Times New Roman" w:cs="Times New Roman"/>
-          <w:color w:val="000000" w:themeColor="text1"/>
-          <w:sz w:val="22"/>
-          <w:szCs w:val="22"/>
-          <w:lang w:val="en-US"/>
-        </w:rPr>
-        <w:commentReference w:id="8"/>
-      </w:r>
-      <w:commentRangeEnd w:id="9"/>
-      <w:r>
-        <w:rPr>
-          <w:rStyle w:val="Odwoaniedokomentarza"/>
-          <w:rFonts w:ascii="Times New Roman" w:hAnsi="Times New Roman" w:cs="Times New Roman"/>
-          <w:color w:val="000000" w:themeColor="text1"/>
-          <w:sz w:val="22"/>
-          <w:szCs w:val="22"/>
-          <w:lang w:val="en-US"/>
-        </w:rPr>
-        <w:commentReference w:id="9"/>
-      </w:r>
-      <w:r>
-        <w:rPr>
-          <w:rFonts w:ascii="Times New Roman" w:hAnsi="Times New Roman" w:cs="Times New Roman"/>
-          <w:color w:val="000000" w:themeColor="text1"/>
-          <w:lang w:val="en-US"/>
-        </w:rPr>
-        <w:t xml:space="preserve"> or dead.</w:t>
-      </w:r>
-    </w:p>
-    <w:p>
-      <w:pPr>
-        <w:spacing w:before="60" w:after="80"/>
-        <w:jc w:val="both"/>
-        <w:rPr>
-          <w:rFonts w:ascii="Times New Roman" w:hAnsi="Times New Roman" w:cs="Times New Roman"/>
-          <w:b/>
-          <w:bCs/>
-          <w:color w:val="000000" w:themeColor="text1"/>
-          <w:lang w:val="en-US"/>
-        </w:rPr>
-      </w:pPr>
-      <w:r>
-        <w:rPr>
-          <w:rFonts w:ascii="Times New Roman" w:hAnsi="Times New Roman" w:cs="Times New Roman"/>
-          <w:b/>
-          <w:bCs/>
-          <w:color w:val="000000" w:themeColor="text1"/>
-          <w:lang w:val="en-US"/>
-        </w:rPr>
-        <w:t>7.4 Medical consultation and reporting submodel</w:t>
-      </w:r>
-    </w:p>
-    <w:p>
-      <w:pPr>
-        <w:spacing w:before="60" w:after="80"/>
-        <w:jc w:val="both"/>
-        <w:rPr>
-          <w:rFonts w:ascii="Times New Roman" w:hAnsi="Times New Roman" w:cs="Times New Roman"/>
-          <w:color w:val="000000" w:themeColor="text1"/>
-          <w:lang w:val="en-US"/>
-        </w:rPr>
-      </w:pPr>
-      <w:r>
-        <w:rPr>
-          <w:rFonts w:ascii="Times New Roman" w:hAnsi="Times New Roman" w:cs="Times New Roman"/>
-          <w:color w:val="000000" w:themeColor="text1"/>
-          <w:lang w:val="en-US"/>
-        </w:rPr>
-        <w:t>After every</w:t>
-      </w:r>
-      <w:r>
-        <w:rPr>
-          <w:rFonts w:ascii="Times New Roman" w:hAnsi="Times New Roman" w:cs="Times New Roman"/>
-          <w:color w:val="000000" w:themeColor="text1"/>
-          <w:lang w:val="en-US"/>
-        </w:rPr>
-        <w:t xml:space="preserve"> day of being</w:t>
-      </w:r>
-      <w:commentRangeStart w:id="10"/>
-      <w:r>
-        <w:rPr>
-          <w:rFonts w:ascii="Times New Roman" w:hAnsi="Times New Roman" w:cs="Times New Roman"/>
-          <w:color w:val="000000" w:themeColor="text1"/>
-          <w:lang w:val="en-US"/>
-        </w:rPr>
-        <w:t xml:space="preserve"> </w:t>
-      </w:r>
-      <w:commentRangeEnd w:id="10"/>
-      <w:r>
-        <w:rPr>
-          <w:rStyle w:val="Odwoaniedokomentarza"/>
-          <w:rFonts w:ascii="Times New Roman" w:hAnsi="Times New Roman" w:cs="Times New Roman"/>
-          <w:color w:val="000000" w:themeColor="text1"/>
-          <w:sz w:val="22"/>
-          <w:szCs w:val="22"/>
-          <w:lang w:val="en-US"/>
-        </w:rPr>
-        <w:commentReference w:id="10"/>
-      </w:r>
-      <w:r>
-        <w:rPr>
-          <w:rFonts w:ascii="Times New Roman" w:hAnsi="Times New Roman" w:cs="Times New Roman"/>
-          <w:color w:val="000000" w:themeColor="text1"/>
-          <w:lang w:val="en-US"/>
-        </w:rPr>
-        <w:t>symptomatic</w:t>
-      </w:r>
-      <w:r>
-        <w:rPr>
-          <w:rFonts w:ascii="Times New Roman" w:hAnsi="Times New Roman" w:cs="Times New Roman"/>
-          <w:color w:val="000000" w:themeColor="text1"/>
-          <w:lang w:val="en-US"/>
-        </w:rPr>
-        <w:t>,</w:t>
-      </w:r>
-      <w:r>
-        <w:rPr>
-          <w:rFonts w:ascii="Times New Roman" w:hAnsi="Times New Roman" w:cs="Times New Roman"/>
-          <w:color w:val="000000" w:themeColor="text1"/>
-          <w:lang w:val="en-US"/>
-        </w:rPr>
-        <w:t xml:space="preserve"> individuals decide whether they want to use a medical consultation or not.</w:t>
-      </w:r>
-    </w:p>
-    <w:p>
-      <w:pPr>
-        <w:spacing w:before="60" w:after="80"/>
-        <w:jc w:val="both"/>
-        <w:rPr>
-          <w:rFonts w:ascii="Times New Roman" w:hAnsi="Times New Roman" w:cs="Times New Roman"/>
-          <w:b/>
-          <w:bCs/>
-          <w:color w:val="000000" w:themeColor="text1"/>
-          <w:lang w:val="en-US"/>
-        </w:rPr>
-      </w:pPr>
-      <w:r>
-        <w:rPr>
-          <w:rFonts w:ascii="Times New Roman" w:hAnsi="Times New Roman" w:cs="Times New Roman"/>
-          <w:b/>
-          <w:bCs/>
-          <w:color w:val="000000" w:themeColor="text1"/>
-          <w:lang w:val="en-US"/>
-        </w:rPr>
-        <w:t>7.5 Health policy submodel</w:t>
-      </w:r>
-    </w:p>
-    <w:p>
-      <w:pPr>
-        <w:spacing w:before="60" w:after="80"/>
-        <w:jc w:val="both"/>
-        <w:rPr>
-          <w:rFonts w:ascii="Times New Roman" w:hAnsi="Times New Roman" w:cs="Times New Roman"/>
-          <w:color w:val="000000" w:themeColor="text1"/>
-          <w:lang w:val="en-US"/>
-        </w:rPr>
-      </w:pPr>
-      <w:r>
-        <w:rPr>
-          <w:rFonts w:ascii="Times New Roman" w:hAnsi="Times New Roman" w:cs="Times New Roman"/>
-          <w:color w:val="000000" w:themeColor="text1"/>
-          <w:lang w:val="en-US"/>
-        </w:rPr>
-        <w:t>The health ministry activates</w:t>
-      </w:r>
-      <w:r>
-        <w:rPr>
-          <w:rFonts w:ascii="Times New Roman" w:hAnsi="Times New Roman" w:cs="Times New Roman"/>
-          <w:color w:val="000000" w:themeColor="text1"/>
-          <w:lang w:val="en-US"/>
-        </w:rPr>
-        <w:t xml:space="preserve"> the</w:t>
-      </w:r>
-      <w:r>
-        <w:rPr>
-          <w:rFonts w:ascii="Times New Roman" w:hAnsi="Times New Roman" w:cs="Times New Roman"/>
-          <w:color w:val="000000" w:themeColor="text1"/>
-          <w:lang w:val="en-US"/>
-        </w:rPr>
-        <w:t xml:space="preserve"> health policy plan after reaching the threshold of </w:t>
-      </w:r>
-      <w:r>
-        <w:rPr>
-          <w:rFonts w:ascii="Times New Roman" w:hAnsi="Times New Roman" w:cs="Times New Roman"/>
-          <w:color w:val="000000" w:themeColor="text1"/>
-          <w:lang w:val="en-US"/>
-        </w:rPr>
-        <w:t>θ</w:t>
-      </w:r>
-      <w:r>
-        <w:rPr>
-          <w:rFonts w:ascii="Times New Roman" w:hAnsi="Times New Roman" w:cs="Times New Roman"/>
-          <w:color w:val="000000" w:themeColor="text1"/>
-          <w:lang w:val="en-US"/>
-        </w:rPr>
-        <w:t xml:space="preserve"> infected </w:t>
-      </w:r>
-      <w:r>
-        <w:rPr>
-          <w:rFonts w:ascii="Times New Roman" w:hAnsi="Times New Roman" w:cs="Times New Roman"/>
-          <w:color w:val="000000" w:themeColor="text1"/>
-          <w:lang w:val="en-US"/>
-        </w:rPr>
-        <w:t>individuals</w:t>
-      </w:r>
-      <w:r>
-        <w:rPr>
-          <w:rFonts w:ascii="Times New Roman" w:hAnsi="Times New Roman" w:cs="Times New Roman"/>
-          <w:color w:val="000000" w:themeColor="text1"/>
-          <w:lang w:val="en-US"/>
-        </w:rPr>
-        <w:t xml:space="preserve">. It reduces the transmission of the virus </w:t>
+        <w:t xml:space="preserve">. </w:t>
+      </w:r>
+      <w:r>
+        <w:rPr>
+          <w:rFonts w:ascii="Times New Roman" w:hAnsi="Times New Roman" w:cs="Times New Roman"/>
+          <w:color w:val="000000" w:themeColor="text1"/>
+          <w:lang w:val="en-US"/>
+        </w:rPr>
+        <w:t>They</w:t>
+      </w:r>
+      <w:r>
+        <w:rPr>
+          <w:rFonts w:ascii="Times New Roman" w:hAnsi="Times New Roman" w:cs="Times New Roman"/>
+          <w:color w:val="000000" w:themeColor="text1"/>
+          <w:lang w:val="en-US"/>
+        </w:rPr>
+        <w:t xml:space="preserve"> reduce the transmission of the virus </w:t>
       </w:r>
       <w:r>
         <w:rPr>
@@ -3875,11 +4275,11 @@
 
 <file path=word/comments.xml><?xml version="1.0" encoding="utf-8"?>
 <w:comments xmlns:wpc="http://schemas.microsoft.com/office/word/2010/wordprocessingCanvas" xmlns:cx="http://schemas.microsoft.com/office/drawing/2014/chartex" xmlns:cx1="http://schemas.microsoft.com/office/drawing/2015/9/8/chartex" xmlns:cx2="http://schemas.microsoft.com/office/drawing/2015/10/21/chartex" xmlns:cx3="http://schemas.microsoft.com/office/drawing/2016/5/9/chartex" xmlns:cx4="http://schemas.microsoft.com/office/drawing/2016/5/10/chartex" xmlns:cx5="http://schemas.microsoft.com/office/drawing/2016/5/11/chartex" xmlns:cx6="http://schemas.microsoft.com/office/drawing/2016/5/12/chartex" xmlns:cx7="http://schemas.microsoft.com/office/drawing/2016/5/13/chartex" xmlns:cx8="http://schemas.microsoft.com/office/drawing/2016/5/14/chartex" xmlns:mc="http://schemas.openxmlformats.org/markup-compatibility/2006" xmlns:aink="http://schemas.microsoft.com/office/drawing/2016/ink" xmlns:am3d="http://schemas.microsoft.com/office/drawing/2017/model3d" xmlns:o="urn:schemas-microsoft-com:office:office" xmlns:oel="http://schemas.microsoft.com/office/2019/extlst" xmlns:r="http://schemas.openxmlformats.org/officeDocument/2006/relationships" xmlns:m="http://schemas.openxmlformats.org/officeDocument/2006/math" xmlns:v="urn:schemas-microsoft-com:vml" xmlns:wp14="http://schemas.microsoft.com/office/word/2010/wordprocessingDrawing" xmlns:wp="http://schemas.openxmlformats.org/drawingml/2006/wordprocessingDrawing" xmlns:w10="urn:schemas-microsoft-com:office:word" xmlns:w="http://schemas.openxmlformats.org/wordprocessingml/2006/main" xmlns:w14="http://schemas.microsoft.com/office/word/2010/wordml" xmlns:w15="http://schemas.microsoft.com/office/word/2012/wordml" xmlns:w16cex="http://schemas.microsoft.com/office/word/2018/wordml/cex" xmlns:w16cid="http://schemas.microsoft.com/office/word/2016/wordml/cid" xmlns:w16="http://schemas.microsoft.com/office/word/2018/wordml" xmlns:w16du="http://schemas.microsoft.com/office/word/2023/wordml/word16du" xmlns:w16sdtdh="http://schemas.microsoft.com/office/word/2020/wordml/sdtdatahash" xmlns:w16sdtfl="http://schemas.microsoft.com/office/word/2024/wordml/sdtformatlock" xmlns:w16se="http://schemas.microsoft.com/office/word/2015/wordml/symex" xmlns:wpg="http://schemas.microsoft.com/office/word/2010/wordprocessingGroup" xmlns:wpi="http://schemas.microsoft.com/office/word/2010/wordprocessingInk" xmlns:wne="http://schemas.microsoft.com/office/word/2006/wordml" xmlns:wps="http://schemas.microsoft.com/office/word/2010/wordprocessingShape" mc:Ignorable="w14 w15 w16se w16cid w16 w16cex w16sdtdh w16sdtfl w16du wp14">
-  <w:comment w:id="0" w:author="Alexis Grangier" w:date="2026-04-13T19:44:00Z" w:initials="AG">
-    <w:p>
-      <w:r>
-        <w:rPr>
-          <w:rStyle w:val="Odwoaniedokomentarza"/>
+  <w:comment w:id="0" w:author="Alexis Grangier" w:date="2026-04-13T19:47:00Z" w:initials="AG">
+    <w:p>
+      <w:r>
+        <w:rPr>
+          <w:rStyle w:val="Marquedecommentaire"/>
         </w:rPr>
         <w:annotationRef/>
       </w:r>
@@ -3888,31 +4288,15 @@
           <w:sz w:val="20"/>
           <w:szCs w:val="20"/>
         </w:rPr>
-        <w:t>I was thinking those who live in the poorer, more dense region may be less exposed to / less prone to believe in government interventions.</w:t>
+        <w:t>their residence and work place</w:t>
       </w:r>
     </w:p>
   </w:comment>
-  <w:comment w:id="1" w:author="Ania Jurek" w:date="2026-04-14T14:34:00Z" w:initials="AJ">
-    <w:p>
-      <w:pPr>
-        <w:pStyle w:val="Tekstkomentarza"/>
-      </w:pPr>
-      <w:r>
-        <w:rPr>
-          <w:rStyle w:val="Odwoaniedokomentarza"/>
-        </w:rPr>
-        <w:annotationRef/>
-      </w:r>
-      <w:r>
-        <w:t>Check pls if it sounds good now</w:t>
-      </w:r>
-    </w:p>
-  </w:comment>
-  <w:comment w:id="2" w:author="Alexis Grangier" w:date="2026-04-13T19:47:00Z" w:initials="AG">
-    <w:p>
-      <w:r>
-        <w:rPr>
-          <w:rStyle w:val="Odwoaniedokomentarza"/>
+  <w:comment w:id="1" w:author="Alexis Grangier" w:date="2026-04-13T19:49:00Z" w:initials="AG">
+    <w:p>
+      <w:r>
+        <w:rPr>
+          <w:rStyle w:val="Marquedecommentaire"/>
         </w:rPr>
         <w:annotationRef/>
       </w:r>
@@ -3921,15 +4305,15 @@
           <w:sz w:val="20"/>
           <w:szCs w:val="20"/>
         </w:rPr>
-        <w:t>their residence and work place</w:t>
+        <w:t>likelihood of</w:t>
       </w:r>
     </w:p>
   </w:comment>
-  <w:comment w:id="3" w:author="Alexis Grangier" w:date="2026-04-13T19:49:00Z" w:initials="AG">
-    <w:p>
-      <w:r>
-        <w:rPr>
-          <w:rStyle w:val="Odwoaniedokomentarza"/>
+  <w:comment w:id="2" w:author="Alexis Grangier" w:date="2026-04-13T19:52:00Z" w:initials="AG">
+    <w:p>
+      <w:r>
+        <w:rPr>
+          <w:rStyle w:val="Marquedecommentaire"/>
         </w:rPr>
         <w:annotationRef/>
       </w:r>
@@ -3938,15 +4322,15 @@
           <w:sz w:val="20"/>
           <w:szCs w:val="20"/>
         </w:rPr>
-        <w:t>likelihood of</w:t>
+        <w:t>Of each agent and their neighbor? Generally how do we encode the transmission during travel and travel itself?</w:t>
       </w:r>
     </w:p>
   </w:comment>
-  <w:comment w:id="4" w:author="Alexis Grangier" w:date="2026-04-13T19:49:00Z" w:initials="AG">
-    <w:p>
-      <w:r>
-        <w:rPr>
-          <w:rStyle w:val="Odwoaniedokomentarza"/>
+  <w:comment w:id="3" w:author="Alexis Grangier" w:date="2026-04-13T19:53:00Z" w:initials="AG">
+    <w:p>
+      <w:r>
+        <w:rPr>
+          <w:rStyle w:val="Marquedecommentaire"/>
         </w:rPr>
         <w:annotationRef/>
       </w:r>
@@ -3955,31 +4339,15 @@
           <w:sz w:val="20"/>
           <w:szCs w:val="20"/>
         </w:rPr>
-        <w:t>So is it an emergent disease?</w:t>
+        <w:t>also agent interactions I think?</w:t>
       </w:r>
     </w:p>
   </w:comment>
-  <w:comment w:id="5" w:author="Ania Jurek" w:date="2026-04-14T14:55:00Z" w:initials="AJ">
-    <w:p>
-      <w:pPr>
-        <w:pStyle w:val="Tekstkomentarza"/>
-      </w:pPr>
-      <w:r>
-        <w:rPr>
-          <w:rStyle w:val="Odwoaniedokomentarza"/>
-        </w:rPr>
-        <w:annotationRef/>
-      </w:r>
-      <w:r>
-        <w:t>I’m not sure about what should be here</w:t>
-      </w:r>
-    </w:p>
-  </w:comment>
-  <w:comment w:id="6" w:author="Alexis Grangier" w:date="2026-04-13T19:52:00Z" w:initials="AG">
-    <w:p>
-      <w:r>
-        <w:rPr>
-          <w:rStyle w:val="Odwoaniedokomentarza"/>
+  <w:comment w:id="4" w:author="Alexis Grangier" w:date="2026-04-13T19:53:00Z" w:initials="AG">
+    <w:p>
+      <w:r>
+        <w:rPr>
+          <w:rStyle w:val="Marquedecommentaire"/>
         </w:rPr>
         <w:annotationRef/>
       </w:r>
@@ -3988,65 +4356,31 @@
           <w:sz w:val="20"/>
           <w:szCs w:val="20"/>
         </w:rPr>
-        <w:t>Of each agent and their neighbor? Generally how do we encode the transmission during travel and travel itself?</w:t>
+        <w:t>unsure what is meant</w:t>
       </w:r>
     </w:p>
   </w:comment>
-  <w:comment w:id="7" w:author="Alexis Grangier" w:date="2026-04-13T19:53:00Z" w:initials="AG">
-    <w:p>
-      <w:r>
-        <w:rPr>
-          <w:rStyle w:val="Odwoaniedokomentarza"/>
+  <w:comment w:id="5" w:author="Ania Jurek" w:date="2026-04-14T14:57:00Z" w:initials="AJ">
+    <w:p>
+      <w:pPr>
+        <w:pStyle w:val="Commentaire"/>
+      </w:pPr>
+      <w:r>
+        <w:rPr>
+          <w:rStyle w:val="Marquedecommentaire"/>
         </w:rPr>
         <w:annotationRef/>
       </w:r>
       <w:r>
-        <w:rPr>
-          <w:sz w:val="20"/>
-          <w:szCs w:val="20"/>
-        </w:rPr>
-        <w:t>also agent interactions I think?</w:t>
+        <w:t>I meant the change of state</w:t>
       </w:r>
     </w:p>
   </w:comment>
-  <w:comment w:id="8" w:author="Alexis Grangier" w:date="2026-04-13T19:53:00Z" w:initials="AG">
-    <w:p>
-      <w:r>
-        <w:rPr>
-          <w:rStyle w:val="Odwoaniedokomentarza"/>
-        </w:rPr>
-        <w:annotationRef/>
-      </w:r>
-      <w:r>
-        <w:rPr>
-          <w:sz w:val="20"/>
-          <w:szCs w:val="20"/>
-        </w:rPr>
-        <w:t>unsure what is meant</w:t>
-      </w:r>
-    </w:p>
-  </w:comment>
-  <w:comment w:id="9" w:author="Ania Jurek" w:date="2026-04-14T14:57:00Z" w:initials="AJ">
-    <w:p>
-      <w:pPr>
-        <w:pStyle w:val="Tekstkomentarza"/>
-      </w:pPr>
-      <w:r>
-        <w:rPr>
-          <w:rStyle w:val="Odwoaniedokomentarza"/>
-        </w:rPr>
-        <w:annotationRef/>
-      </w:r>
-      <w:r>
-        <w:t>I meant the change of state</w:t>
-      </w:r>
-    </w:p>
-  </w:comment>
-  <w:comment w:id="10" w:author="Alexis Grangier" w:date="2026-04-13T19:54:00Z" w:initials="AG">
-    <w:p>
-      <w:r>
-        <w:rPr>
-          <w:rStyle w:val="Odwoaniedokomentarza"/>
+  <w:comment w:id="6" w:author="Alexis Grangier" w:date="2026-04-13T19:54:00Z" w:initials="AG">
+    <w:p>
+      <w:r>
+        <w:rPr>
+          <w:rStyle w:val="Marquedecommentaire"/>
         </w:rPr>
         <w:annotationRef/>
       </w:r>
@@ -4064,12 +4398,8 @@
 
 <file path=word/commentsExtended.xml><?xml version="1.0" encoding="utf-8"?>
 <w15:commentsEx xmlns:wpc="http://schemas.microsoft.com/office/word/2010/wordprocessingCanvas" xmlns:cx="http://schemas.microsoft.com/office/drawing/2014/chartex" xmlns:cx1="http://schemas.microsoft.com/office/drawing/2015/9/8/chartex" xmlns:cx2="http://schemas.microsoft.com/office/drawing/2015/10/21/chartex" xmlns:cx3="http://schemas.microsoft.com/office/drawing/2016/5/9/chartex" xmlns:cx4="http://schemas.microsoft.com/office/drawing/2016/5/10/chartex" xmlns:cx5="http://schemas.microsoft.com/office/drawing/2016/5/11/chartex" xmlns:cx6="http://schemas.microsoft.com/office/drawing/2016/5/12/chartex" xmlns:cx7="http://schemas.microsoft.com/office/drawing/2016/5/13/chartex" xmlns:cx8="http://schemas.microsoft.com/office/drawing/2016/5/14/chartex" xmlns:mc="http://schemas.openxmlformats.org/markup-compatibility/2006" xmlns:aink="http://schemas.microsoft.com/office/drawing/2016/ink" xmlns:am3d="http://schemas.microsoft.com/office/drawing/2017/model3d" xmlns:o="urn:schemas-microsoft-com:office:office" xmlns:oel="http://schemas.microsoft.com/office/2019/extlst" xmlns:r="http://schemas.openxmlformats.org/officeDocument/2006/relationships" xmlns:m="http://schemas.openxmlformats.org/officeDocument/2006/math" xmlns:v="urn:schemas-microsoft-com:vml" xmlns:wp14="http://schemas.microsoft.com/office/word/2010/wordprocessingDrawing" xmlns:wp="http://schemas.openxmlformats.org/drawingml/2006/wordprocessingDrawing" xmlns:w10="urn:schemas-microsoft-com:office:word" xmlns:w="http://schemas.openxmlformats.org/wordprocessingml/2006/main" xmlns:w14="http://schemas.microsoft.com/office/word/2010/wordml" xmlns:w15="http://schemas.microsoft.com/office/word/2012/wordml" xmlns:w16cex="http://schemas.microsoft.com/office/word/2018/wordml/cex" xmlns:w16cid="http://schemas.microsoft.com/office/word/2016/wordml/cid" xmlns:w16="http://schemas.microsoft.com/office/word/2018/wordml" xmlns:w16du="http://schemas.microsoft.com/office/word/2023/wordml/word16du" xmlns:w16sdtdh="http://schemas.microsoft.com/office/word/2020/wordml/sdtdatahash" xmlns:w16sdtfl="http://schemas.microsoft.com/office/word/2024/wordml/sdtformatlock" xmlns:w16se="http://schemas.microsoft.com/office/word/2015/wordml/symex" xmlns:wpg="http://schemas.microsoft.com/office/word/2010/wordprocessingGroup" xmlns:wpi="http://schemas.microsoft.com/office/word/2010/wordprocessingInk" xmlns:wne="http://schemas.microsoft.com/office/word/2006/wordml" xmlns:wps="http://schemas.microsoft.com/office/word/2010/wordprocessingShape" mc:Ignorable="w14 w15 w16se w16cid w16 w16cex w16sdtdh w16sdtfl w16du wp14">
-  <w15:commentEx w15:paraId="3B5664FE" w15:done="0"/>
-  <w15:commentEx w15:paraId="3C9A1FAF" w15:paraIdParent="3B5664FE" w15:done="0"/>
   <w15:commentEx w15:paraId="26483AF7" w15:done="0"/>
   <w15:commentEx w15:paraId="6323A65D" w15:done="0"/>
-  <w15:commentEx w15:paraId="2CE6AE86" w15:done="0"/>
-  <w15:commentEx w15:paraId="07D64811" w15:paraIdParent="2CE6AE86" w15:done="0"/>
   <w15:commentEx w15:paraId="75115699" w15:done="0"/>
   <w15:commentEx w15:paraId="19A09BFF" w15:done="0"/>
   <w15:commentEx w15:paraId="215A506A" w15:done="0"/>
@@ -4080,8 +4410,6 @@
 
 <file path=word/commentsExtensible.xml><?xml version="1.0" encoding="utf-8"?>
 <w16cex:commentsExtensible xmlns:wpc="http://schemas.microsoft.com/office/word/2010/wordprocessingCanvas" xmlns:cx="http://schemas.microsoft.com/office/drawing/2014/chartex" xmlns:cx1="http://schemas.microsoft.com/office/drawing/2015/9/8/chartex" xmlns:cx2="http://schemas.microsoft.com/office/drawing/2015/10/21/chartex" xmlns:cx3="http://schemas.microsoft.com/office/drawing/2016/5/9/chartex" xmlns:cx4="http://schemas.microsoft.com/office/drawing/2016/5/10/chartex" xmlns:cx5="http://schemas.microsoft.com/office/drawing/2016/5/11/chartex" xmlns:cx6="http://schemas.microsoft.com/office/drawing/2016/5/12/chartex" xmlns:cx7="http://schemas.microsoft.com/office/drawing/2016/5/13/chartex" xmlns:cx8="http://schemas.microsoft.com/office/drawing/2016/5/14/chartex" xmlns:cr="http://schemas.microsoft.com/office/comments/2020/reactions" xmlns:mc="http://schemas.openxmlformats.org/markup-compatibility/2006" xmlns:aink="http://schemas.microsoft.com/office/drawing/2016/ink" xmlns:am3d="http://schemas.microsoft.com/office/drawing/2017/model3d" xmlns:o="urn:schemas-microsoft-com:office:office" xmlns:oel="http://schemas.microsoft.com/office/2019/extlst" xmlns:r="http://schemas.openxmlformats.org/officeDocument/2006/relationships" xmlns:m="http://schemas.openxmlformats.org/officeDocument/2006/math" xmlns:v="urn:schemas-microsoft-com:vml" xmlns:wp14="http://schemas.microsoft.com/office/word/2010/wordprocessingDrawing" xmlns:wp="http://schemas.openxmlformats.org/drawingml/2006/wordprocessingDrawing" xmlns:w10="urn:schemas-microsoft-com:office:word" xmlns:w="http://schemas.openxmlformats.org/wordprocessingml/2006/main" xmlns:w14="http://schemas.microsoft.com/office/word/2010/wordml" xmlns:w15="http://schemas.microsoft.com/office/word/2012/wordml" xmlns:w16cex="http://schemas.microsoft.com/office/word/2018/wordml/cex" xmlns:w16cid="http://schemas.microsoft.com/office/word/2016/wordml/cid" xmlns:w16="http://schemas.microsoft.com/office/word/2018/wordml" xmlns:w16du="http://schemas.microsoft.com/office/word/2023/wordml/word16du" xmlns:w16sdtdh="http://schemas.microsoft.com/office/word/2020/wordml/sdtdatahash" xmlns:w16sdtfl="http://schemas.microsoft.com/office/word/2024/wordml/sdtformatlock" xmlns:w16se="http://schemas.microsoft.com/office/word/2015/wordml/symex" xmlns:wpg="http://schemas.microsoft.com/office/word/2010/wordprocessingGroup" xmlns:wpi="http://schemas.microsoft.com/office/word/2010/wordprocessingInk" xmlns:wne="http://schemas.microsoft.com/office/word/2006/wordml" xmlns:wps="http://schemas.microsoft.com/office/word/2010/wordprocessingShape" mc:Ignorable="w14 w15 w16se w16cid w16 w16cex w16sdtdh w16sdtfl cr w16du wp14">
-  <w16cex:commentExtensible w16cex:durableId="656995A6" w16cex:dateUtc="2026-04-13T17:44:00Z"/>
-  <w16cex:commentExtensible w16cex:durableId="3CD9CD6D" w16cex:dateUtc="2026-04-14T12:34:00Z"/>
   <w16cex:commentExtensible w16cex:durableId="07D2EA1B" w16cex:dateUtc="2026-04-13T17:47:00Z">
     <w16cex:extLst>
       <w16:ext w16:uri="{CE6994B0-6A32-4C9F-8C6B-6E91EDA988CE}">
@@ -4108,8 +4436,6 @@
       </w16:ext>
     </w16cex:extLst>
   </w16cex:commentExtensible>
-  <w16cex:commentExtensible w16cex:durableId="363AF066" w16cex:dateUtc="2026-04-13T17:49:00Z"/>
-  <w16cex:commentExtensible w16cex:durableId="1EA986E4" w16cex:dateUtc="2026-04-14T12:55:00Z"/>
   <w16cex:commentExtensible w16cex:durableId="6BAE187A" w16cex:dateUtc="2026-04-13T17:52:00Z">
     <w16cex:extLst>
       <w16:ext w16:uri="{CE6994B0-6A32-4C9F-8C6B-6E91EDA988CE}">
@@ -4156,12 +4482,8 @@
 
 <file path=word/commentsIds.xml><?xml version="1.0" encoding="utf-8"?>
 <w16cid:commentsIds xmlns:wpc="http://schemas.microsoft.com/office/word/2010/wordprocessingCanvas" xmlns:cx="http://schemas.microsoft.com/office/drawing/2014/chartex" xmlns:cx1="http://schemas.microsoft.com/office/drawing/2015/9/8/chartex" xmlns:cx2="http://schemas.microsoft.com/office/drawing/2015/10/21/chartex" xmlns:cx3="http://schemas.microsoft.com/office/drawing/2016/5/9/chartex" xmlns:cx4="http://schemas.microsoft.com/office/drawing/2016/5/10/chartex" xmlns:cx5="http://schemas.microsoft.com/office/drawing/2016/5/11/chartex" xmlns:cx6="http://schemas.microsoft.com/office/drawing/2016/5/12/chartex" xmlns:cx7="http://schemas.microsoft.com/office/drawing/2016/5/13/chartex" xmlns:cx8="http://schemas.microsoft.com/office/drawing/2016/5/14/chartex" xmlns:mc="http://schemas.openxmlformats.org/markup-compatibility/2006" xmlns:aink="http://schemas.microsoft.com/office/drawing/2016/ink" xmlns:am3d="http://schemas.microsoft.com/office/drawing/2017/model3d" xmlns:o="urn:schemas-microsoft-com:office:office" xmlns:oel="http://schemas.microsoft.com/office/2019/extlst" xmlns:r="http://schemas.openxmlformats.org/officeDocument/2006/relationships" xmlns:m="http://schemas.openxmlformats.org/officeDocument/2006/math" xmlns:v="urn:schemas-microsoft-com:vml" xmlns:wp14="http://schemas.microsoft.com/office/word/2010/wordprocessingDrawing" xmlns:wp="http://schemas.openxmlformats.org/drawingml/2006/wordprocessingDrawing" xmlns:w10="urn:schemas-microsoft-com:office:word" xmlns:w="http://schemas.openxmlformats.org/wordprocessingml/2006/main" xmlns:w14="http://schemas.microsoft.com/office/word/2010/wordml" xmlns:w15="http://schemas.microsoft.com/office/word/2012/wordml" xmlns:w16cex="http://schemas.microsoft.com/office/word/2018/wordml/cex" xmlns:w16cid="http://schemas.microsoft.com/office/word/2016/wordml/cid" xmlns:w16="http://schemas.microsoft.com/office/word/2018/wordml" xmlns:w16du="http://schemas.microsoft.com/office/word/2023/wordml/word16du" xmlns:w16sdtdh="http://schemas.microsoft.com/office/word/2020/wordml/sdtdatahash" xmlns:w16sdtfl="http://schemas.microsoft.com/office/word/2024/wordml/sdtformatlock" xmlns:w16se="http://schemas.microsoft.com/office/word/2015/wordml/symex" xmlns:wpg="http://schemas.microsoft.com/office/word/2010/wordprocessingGroup" xmlns:wpi="http://schemas.microsoft.com/office/word/2010/wordprocessingInk" xmlns:wne="http://schemas.microsoft.com/office/word/2006/wordml" xmlns:wps="http://schemas.microsoft.com/office/word/2010/wordprocessingShape" mc:Ignorable="w14 w15 w16se w16cid w16 w16cex w16sdtdh w16sdtfl w16du wp14">
-  <w16cid:commentId w16cid:paraId="3B5664FE" w16cid:durableId="656995A6"/>
-  <w16cid:commentId w16cid:paraId="3C9A1FAF" w16cid:durableId="3CD9CD6D"/>
   <w16cid:commentId w16cid:paraId="26483AF7" w16cid:durableId="07D2EA1B"/>
   <w16cid:commentId w16cid:paraId="6323A65D" w16cid:durableId="3CB2CB0D"/>
-  <w16cid:commentId w16cid:paraId="2CE6AE86" w16cid:durableId="363AF066"/>
-  <w16cid:commentId w16cid:paraId="07D64811" w16cid:durableId="1EA986E4"/>
   <w16cid:commentId w16cid:paraId="75115699" w16cid:durableId="6BAE187A"/>
   <w16cid:commentId w16cid:paraId="19A09BFF" w16cid:durableId="55AF669D"/>
   <w16cid:commentId w16cid:paraId="215A506A" w16cid:durableId="0F24696A"/>
@@ -4271,7 +4593,7 @@
 <w:hdr xmlns:wpc="http://schemas.microsoft.com/office/word/2010/wordprocessingCanvas" xmlns:cx="http://schemas.microsoft.com/office/drawing/2014/chartex" xmlns:cx1="http://schemas.microsoft.com/office/drawing/2015/9/8/chartex" xmlns:cx2="http://schemas.microsoft.com/office/drawing/2015/10/21/chartex" xmlns:cx3="http://schemas.microsoft.com/office/drawing/2016/5/9/chartex" xmlns:cx4="http://schemas.microsoft.com/office/drawing/2016/5/10/chartex" xmlns:cx5="http://schemas.microsoft.com/office/drawing/2016/5/11/chartex" xmlns:cx6="http://schemas.microsoft.com/office/drawing/2016/5/12/chartex" xmlns:cx7="http://schemas.microsoft.com/office/drawing/2016/5/13/chartex" xmlns:cx8="http://schemas.microsoft.com/office/drawing/2016/5/14/chartex" xmlns:mc="http://schemas.openxmlformats.org/markup-compatibility/2006" xmlns:aink="http://schemas.microsoft.com/office/drawing/2016/ink" xmlns:am3d="http://schemas.microsoft.com/office/drawing/2017/model3d" xmlns:o="urn:schemas-microsoft-com:office:office" xmlns:oel="http://schemas.microsoft.com/office/2019/extlst" xmlns:r="http://schemas.openxmlformats.org/officeDocument/2006/relationships" xmlns:m="http://schemas.openxmlformats.org/officeDocument/2006/math" xmlns:v="urn:schemas-microsoft-com:vml" xmlns:wp14="http://schemas.microsoft.com/office/word/2010/wordprocessingDrawing" xmlns:wp="http://schemas.openxmlformats.org/drawingml/2006/wordprocessingDrawing" xmlns:w10="urn:schemas-microsoft-com:office:word" xmlns:w="http://schemas.openxmlformats.org/wordprocessingml/2006/main" xmlns:w14="http://schemas.microsoft.com/office/word/2010/wordml" xmlns:w15="http://schemas.microsoft.com/office/word/2012/wordml" xmlns:w16cex="http://schemas.microsoft.com/office/word/2018/wordml/cex" xmlns:w16cid="http://schemas.microsoft.com/office/word/2016/wordml/cid" xmlns:w16="http://schemas.microsoft.com/office/word/2018/wordml" xmlns:w16du="http://schemas.microsoft.com/office/word/2023/wordml/word16du" xmlns:w16sdtdh="http://schemas.microsoft.com/office/word/2020/wordml/sdtdatahash" xmlns:w16sdtfl="http://schemas.microsoft.com/office/word/2024/wordml/sdtformatlock" xmlns:w16se="http://schemas.microsoft.com/office/word/2015/wordml/symex" xmlns:wpg="http://schemas.microsoft.com/office/word/2010/wordprocessingGroup" xmlns:wpi="http://schemas.microsoft.com/office/word/2010/wordprocessingInk" xmlns:wne="http://schemas.microsoft.com/office/word/2006/wordml" xmlns:wps="http://schemas.microsoft.com/office/word/2010/wordprocessingShape" mc:Ignorable="w14 w15 w16se w16cid w16 w16cex w16sdtdh w16sdtfl w16du wp14">
   <w:p>
     <w:pPr>
-      <w:pStyle w:val="Nagwek"/>
+      <w:pStyle w:val="En-tte"/>
       <w:rPr>
         <w:rFonts w:ascii="Times New Roman" w:hAnsi="Times New Roman" w:cs="Times New Roman"/>
       </w:rPr>
@@ -4291,7 +4613,7 @@
   </w:p>
   <w:p>
     <w:pPr>
-      <w:pStyle w:val="Nagwek"/>
+      <w:pStyle w:val="En-tte"/>
       <w:rPr>
         <w:rFonts w:ascii="Times New Roman" w:hAnsi="Times New Roman" w:cs="Times New Roman"/>
       </w:rPr>
@@ -5181,11 +5503,11 @@
     <w:lsdException w:name="Unresolved Mention" w:semiHidden="1" w:unhideWhenUsed="1"/>
     <w:lsdException w:name="Smart Link" w:semiHidden="1" w:unhideWhenUsed="1"/>
   </w:latentStyles>
-  <w:style w:type="paragraph" w:default="1" w:styleId="Normalny">
+  <w:style w:type="paragraph" w:default="1" w:styleId="Normal">
     <w:name w:val="Normal"/>
     <w:qFormat/>
   </w:style>
-  <w:style w:type="paragraph" w:styleId="Nagwek1">
+  <w:style w:type="paragraph" w:styleId="Titre1">
     <w:name w:val="heading 1"/>
     <w:uiPriority w:val="9"/>
     <w:qFormat/>
@@ -5200,7 +5522,7 @@
       <w:szCs w:val="32"/>
     </w:rPr>
   </w:style>
-  <w:style w:type="paragraph" w:styleId="Nagwek2">
+  <w:style w:type="paragraph" w:styleId="Titre2">
     <w:name w:val="heading 2"/>
     <w:uiPriority w:val="9"/>
     <w:unhideWhenUsed/>
@@ -5216,7 +5538,7 @@
       <w:szCs w:val="26"/>
     </w:rPr>
   </w:style>
-  <w:style w:type="paragraph" w:styleId="Nagwek3">
+  <w:style w:type="paragraph" w:styleId="Titre3">
     <w:name w:val="heading 3"/>
     <w:uiPriority w:val="9"/>
     <w:semiHidden/>
@@ -5231,7 +5553,7 @@
       <w:szCs w:val="24"/>
     </w:rPr>
   </w:style>
-  <w:style w:type="paragraph" w:styleId="Nagwek4">
+  <w:style w:type="paragraph" w:styleId="Titre4">
     <w:name w:val="heading 4"/>
     <w:uiPriority w:val="9"/>
     <w:semiHidden/>
@@ -5246,7 +5568,7 @@
       <w:color w:val="2E74B5"/>
     </w:rPr>
   </w:style>
-  <w:style w:type="paragraph" w:styleId="Nagwek5">
+  <w:style w:type="paragraph" w:styleId="Titre5">
     <w:name w:val="heading 5"/>
     <w:uiPriority w:val="9"/>
     <w:semiHidden/>
@@ -5259,7 +5581,7 @@
       <w:color w:val="2E74B5"/>
     </w:rPr>
   </w:style>
-  <w:style w:type="paragraph" w:styleId="Nagwek6">
+  <w:style w:type="paragraph" w:styleId="Titre6">
     <w:name w:val="heading 6"/>
     <w:uiPriority w:val="9"/>
     <w:semiHidden/>
@@ -5272,13 +5594,13 @@
       <w:color w:val="1F4D78"/>
     </w:rPr>
   </w:style>
-  <w:style w:type="character" w:default="1" w:styleId="Domylnaczcionkaakapitu">
+  <w:style w:type="character" w:default="1" w:styleId="Policepardfaut">
     <w:name w:val="Default Paragraph Font"/>
     <w:uiPriority w:val="1"/>
     <w:semiHidden/>
     <w:unhideWhenUsed/>
   </w:style>
-  <w:style w:type="table" w:default="1" w:styleId="Standardowy">
+  <w:style w:type="table" w:default="1" w:styleId="TableauNormal">
     <w:name w:val="Normal Table"/>
     <w:uiPriority w:val="99"/>
     <w:semiHidden/>
@@ -5293,13 +5615,13 @@
       </w:tblCellMar>
     </w:tblPr>
   </w:style>
-  <w:style w:type="numbering" w:default="1" w:styleId="Bezlisty">
+  <w:style w:type="numbering" w:default="1" w:styleId="Aucuneliste">
     <w:name w:val="No List"/>
     <w:uiPriority w:val="99"/>
     <w:semiHidden/>
     <w:unhideWhenUsed/>
   </w:style>
-  <w:style w:type="paragraph" w:styleId="Tytu">
+  <w:style w:type="paragraph" w:styleId="Titre">
     <w:name w:val="Title"/>
     <w:uiPriority w:val="10"/>
     <w:qFormat/>
@@ -5316,11 +5638,11 @@
       <w:bCs/>
     </w:rPr>
   </w:style>
-  <w:style w:type="paragraph" w:styleId="Akapitzlist">
+  <w:style w:type="paragraph" w:styleId="Paragraphedeliste">
     <w:name w:val="List Paragraph"/>
     <w:qFormat/>
   </w:style>
-  <w:style w:type="character" w:styleId="Hipercze">
+  <w:style w:type="character" w:styleId="Lienhypertexte">
     <w:name w:val="Hyperlink"/>
     <w:uiPriority w:val="99"/>
     <w:unhideWhenUsed/>
@@ -5329,7 +5651,7 @@
       <w:u w:val="single"/>
     </w:rPr>
   </w:style>
-  <w:style w:type="character" w:styleId="Odwoanieprzypisudolnego">
+  <w:style w:type="character" w:styleId="Appelnotedebasdep">
     <w:name w:val="footnote reference"/>
     <w:uiPriority w:val="99"/>
     <w:semiHidden/>
@@ -5338,9 +5660,9 @@
       <w:vertAlign w:val="superscript"/>
     </w:rPr>
   </w:style>
-  <w:style w:type="paragraph" w:styleId="Tekstprzypisudolnego">
+  <w:style w:type="paragraph" w:styleId="Notedebasdepage">
     <w:name w:val="footnote text"/>
-    <w:link w:val="TekstprzypisudolnegoZnak"/>
+    <w:link w:val="NotedebasdepageCar"/>
     <w:uiPriority w:val="99"/>
     <w:semiHidden/>
     <w:unhideWhenUsed/>
@@ -5349,9 +5671,9 @@
       <w:szCs w:val="20"/>
     </w:rPr>
   </w:style>
-  <w:style w:type="character" w:customStyle="1" w:styleId="TekstprzypisudolnegoZnak">
-    <w:name w:val="Tekst przypisu dolnego Znak"/>
-    <w:link w:val="Tekstprzypisudolnego"/>
+  <w:style w:type="character" w:customStyle="1" w:styleId="NotedebasdepageCar">
+    <w:name w:val="Note de bas de page Car"/>
+    <w:link w:val="Notedebasdepage"/>
     <w:uiPriority w:val="99"/>
     <w:semiHidden/>
     <w:unhideWhenUsed/>
@@ -5360,7 +5682,7 @@
       <w:szCs w:val="20"/>
     </w:rPr>
   </w:style>
-  <w:style w:type="character" w:styleId="Odwoanieprzypisukocowego">
+  <w:style w:type="character" w:styleId="Appeldenotedefin">
     <w:name w:val="endnote reference"/>
     <w:uiPriority w:val="99"/>
     <w:semiHidden/>
@@ -5369,9 +5691,9 @@
       <w:vertAlign w:val="superscript"/>
     </w:rPr>
   </w:style>
-  <w:style w:type="paragraph" w:styleId="Tekstprzypisukocowego">
+  <w:style w:type="paragraph" w:styleId="Notedefin">
     <w:name w:val="endnote text"/>
-    <w:link w:val="TekstprzypisukocowegoZnak"/>
+    <w:link w:val="NotedefinCar"/>
     <w:uiPriority w:val="99"/>
     <w:semiHidden/>
     <w:unhideWhenUsed/>
@@ -5380,9 +5702,9 @@
       <w:szCs w:val="20"/>
     </w:rPr>
   </w:style>
-  <w:style w:type="character" w:customStyle="1" w:styleId="TekstprzypisukocowegoZnak">
-    <w:name w:val="Tekst przypisu końcowego Znak"/>
-    <w:link w:val="Tekstprzypisukocowego"/>
+  <w:style w:type="character" w:customStyle="1" w:styleId="NotedefinCar">
+    <w:name w:val="Note de fin Car"/>
+    <w:link w:val="Notedefin"/>
     <w:uiPriority w:val="99"/>
     <w:semiHidden/>
     <w:unhideWhenUsed/>
@@ -5391,10 +5713,10 @@
       <w:szCs w:val="20"/>
     </w:rPr>
   </w:style>
-  <w:style w:type="paragraph" w:styleId="Nagwek">
+  <w:style w:type="paragraph" w:styleId="En-tte">
     <w:name w:val="header"/>
-    <w:basedOn w:val="Normalny"/>
-    <w:link w:val="NagwekZnak"/>
+    <w:basedOn w:val="Normal"/>
+    <w:link w:val="En-tteCar"/>
     <w:uiPriority w:val="99"/>
     <w:unhideWhenUsed/>
     <w:rsid w:val="009D4AC7"/>
@@ -5405,17 +5727,17 @@
       </w:tabs>
     </w:pPr>
   </w:style>
-  <w:style w:type="character" w:customStyle="1" w:styleId="NagwekZnak">
-    <w:name w:val="Nagłówek Znak"/>
-    <w:basedOn w:val="Domylnaczcionkaakapitu"/>
-    <w:link w:val="Nagwek"/>
+  <w:style w:type="character" w:customStyle="1" w:styleId="En-tteCar">
+    <w:name w:val="En-tête Car"/>
+    <w:basedOn w:val="Policepardfaut"/>
+    <w:link w:val="En-tte"/>
     <w:uiPriority w:val="99"/>
     <w:rsid w:val="009D4AC7"/>
   </w:style>
-  <w:style w:type="paragraph" w:styleId="Stopka">
+  <w:style w:type="paragraph" w:styleId="Pieddepage">
     <w:name w:val="footer"/>
-    <w:basedOn w:val="Normalny"/>
-    <w:link w:val="StopkaZnak"/>
+    <w:basedOn w:val="Normal"/>
+    <w:link w:val="PieddepageCar"/>
     <w:uiPriority w:val="99"/>
     <w:unhideWhenUsed/>
     <w:rsid w:val="009D4AC7"/>
@@ -5426,16 +5748,16 @@
       </w:tabs>
     </w:pPr>
   </w:style>
-  <w:style w:type="character" w:customStyle="1" w:styleId="StopkaZnak">
-    <w:name w:val="Stopka Znak"/>
-    <w:basedOn w:val="Domylnaczcionkaakapitu"/>
-    <w:link w:val="Stopka"/>
+  <w:style w:type="character" w:customStyle="1" w:styleId="PieddepageCar">
+    <w:name w:val="Pied de page Car"/>
+    <w:basedOn w:val="Policepardfaut"/>
+    <w:link w:val="Pieddepage"/>
     <w:uiPriority w:val="99"/>
     <w:rsid w:val="009D4AC7"/>
   </w:style>
-  <w:style w:type="character" w:styleId="Odwoaniedokomentarza">
+  <w:style w:type="character" w:styleId="Marquedecommentaire">
     <w:name w:val="annotation reference"/>
-    <w:basedOn w:val="Domylnaczcionkaakapitu"/>
+    <w:basedOn w:val="Policepardfaut"/>
     <w:uiPriority w:val="99"/>
     <w:semiHidden/>
     <w:unhideWhenUsed/>
@@ -5445,10 +5767,10 @@
       <w:szCs w:val="16"/>
     </w:rPr>
   </w:style>
-  <w:style w:type="paragraph" w:styleId="Tekstkomentarza">
+  <w:style w:type="paragraph" w:styleId="Commentaire">
     <w:name w:val="annotation text"/>
-    <w:basedOn w:val="Normalny"/>
-    <w:link w:val="TekstkomentarzaZnak"/>
+    <w:basedOn w:val="Normal"/>
+    <w:link w:val="CommentaireCar"/>
     <w:uiPriority w:val="99"/>
     <w:unhideWhenUsed/>
     <w:rsid w:val="00EB7764"/>
@@ -5457,10 +5779,10 @@
       <w:szCs w:val="20"/>
     </w:rPr>
   </w:style>
-  <w:style w:type="character" w:customStyle="1" w:styleId="TekstkomentarzaZnak">
-    <w:name w:val="Tekst komentarza Znak"/>
-    <w:basedOn w:val="Domylnaczcionkaakapitu"/>
-    <w:link w:val="Tekstkomentarza"/>
+  <w:style w:type="character" w:customStyle="1" w:styleId="CommentaireCar">
+    <w:name w:val="Commentaire Car"/>
+    <w:basedOn w:val="Policepardfaut"/>
+    <w:link w:val="Commentaire"/>
     <w:uiPriority w:val="99"/>
     <w:rsid w:val="00EB7764"/>
     <w:rPr>
@@ -5468,11 +5790,11 @@
       <w:szCs w:val="20"/>
     </w:rPr>
   </w:style>
-  <w:style w:type="paragraph" w:styleId="Tematkomentarza">
+  <w:style w:type="paragraph" w:styleId="Objetducommentaire">
     <w:name w:val="annotation subject"/>
-    <w:basedOn w:val="Tekstkomentarza"/>
-    <w:next w:val="Tekstkomentarza"/>
-    <w:link w:val="TematkomentarzaZnak"/>
+    <w:basedOn w:val="Commentaire"/>
+    <w:next w:val="Commentaire"/>
+    <w:link w:val="ObjetducommentaireCar"/>
     <w:uiPriority w:val="99"/>
     <w:semiHidden/>
     <w:unhideWhenUsed/>
@@ -5482,10 +5804,10 @@
       <w:bCs/>
     </w:rPr>
   </w:style>
-  <w:style w:type="character" w:customStyle="1" w:styleId="TematkomentarzaZnak">
-    <w:name w:val="Temat komentarza Znak"/>
-    <w:basedOn w:val="TekstkomentarzaZnak"/>
-    <w:link w:val="Tematkomentarza"/>
+  <w:style w:type="character" w:customStyle="1" w:styleId="ObjetducommentaireCar">
+    <w:name w:val="Objet du commentaire Car"/>
+    <w:basedOn w:val="CommentaireCar"/>
+    <w:link w:val="Objetducommentaire"/>
     <w:uiPriority w:val="99"/>
     <w:semiHidden/>
     <w:rsid w:val="00EB7764"/>
@@ -5496,9 +5818,9 @@
       <w:szCs w:val="20"/>
     </w:rPr>
   </w:style>
-  <w:style w:type="character" w:styleId="Nierozpoznanawzmianka">
+  <w:style w:type="character" w:styleId="Mentionnonrsolue">
     <w:name w:val="Unresolved Mention"/>
-    <w:basedOn w:val="Domylnaczcionkaakapitu"/>
+    <w:basedOn w:val="Policepardfaut"/>
     <w:uiPriority w:val="99"/>
     <w:semiHidden/>
     <w:unhideWhenUsed/>
@@ -5508,16 +5830,16 @@
       <w:shd w:val="clear" w:color="auto" w:fill="E1DFDD"/>
     </w:rPr>
   </w:style>
-  <w:style w:type="paragraph" w:styleId="Poprawka">
+  <w:style w:type="paragraph" w:styleId="Rvision">
     <w:name w:val="Revision"/>
     <w:hidden/>
     <w:uiPriority w:val="99"/>
     <w:semiHidden/>
     <w:rsid w:val="00D33472"/>
   </w:style>
-  <w:style w:type="table" w:styleId="Tabela-Siatka">
+  <w:style w:type="table" w:styleId="Grilledutableau">
     <w:name w:val="Table Grid"/>
-    <w:basedOn w:val="Standardowy"/>
+    <w:basedOn w:val="TableauNormal"/>
     <w:uiPriority w:val="39"/>
     <w:rsid w:val="00D820CB"/>
     <w:tblPr>

</xml_diff>